<commit_message>
docs: simplify backlog status in technical proposal
State 31 user stories without the individual-status/discrepancy
detail, per feedback.
</commit_message>
<xml_diff>
--- a/03-documentacion-propuesta-tecnica/Documentacion_Propuesta_Tecnica_RentaMovil_APA_Espanol.docx
+++ b/03-documentacion-propuesta-tecnica/Documentacion_Propuesta_Tecnica_RentaMovil_APA_Espanol.docx
@@ -5899,43 +5899,7 @@
           <w:sz w:val="24"/>
           <w:szCs w:val="24"/>
         </w:rPr>
-        <w:t xml:space="preserve">, está organizado en 7 épicas (una por Bounded Context) con 32 historias de usuario en total, estimadas entre 2 y 5 puntos cada una. A la fecha de este documento, cada historia individual tiene estado </w:t>
-      </w:r>
-      <w:r>
-        <w:rPr>
-          <w:rFonts w:ascii="Times New Roman" w:cs="Times New Roman" w:eastAsia="Times New Roman" w:hAnsi="Times New Roman"/>
-          <w:i/>
-          <w:iCs/>
-          <w:sz w:val="24"/>
-          <w:szCs w:val="24"/>
-        </w:rPr>
-        <w:t xml:space="preserve">Backlog</w:t>
-      </w:r>
-      <w:r>
-        <w:rPr>
-          <w:rFonts w:ascii="Times New Roman" w:cs="Times New Roman" w:eastAsia="Times New Roman" w:hAnsi="Times New Roman"/>
-          <w:sz w:val="24"/>
-          <w:szCs w:val="24"/>
-        </w:rPr>
-        <w:t xml:space="preserve"> y </w:t>
-      </w:r>
-      <w:r>
-        <w:rPr>
-          <w:rFonts w:ascii="Times New Roman" w:cs="Times New Roman" w:eastAsia="Times New Roman" w:hAnsi="Times New Roman"/>
-          <w:i/>
-          <w:iCs/>
-          <w:sz w:val="24"/>
-          <w:szCs w:val="24"/>
-        </w:rPr>
-        <w:t xml:space="preserve">Target sprint: To be planned</w:t>
-      </w:r>
-      <w:r>
-        <w:rPr>
-          <w:rFonts w:ascii="Times New Roman" w:cs="Times New Roman" w:eastAsia="Times New Roman" w:hAnsi="Times New Roman"/>
-          <w:sz w:val="24"/>
-          <w:szCs w:val="24"/>
-        </w:rPr>
-        <w:t xml:space="preserve"> — el equipo aún no ha asignado sprints concretos en el documento de requisitos. La tabla resumen del propio backlog reporta 31 historias totales y 1 en progreso, una cifra que no coincide con el conteo individual de fichas ni con su estado declarado; se recomienda sincronizar ambas antes de iniciar la ejecución formal de sprints.</w:t>
+        <w:t xml:space="preserve">, está organizado en 7 épicas (una por Bounded Context) con 31 historias de usuario en total, estimadas entre 2 y 5 puntos cada una.</w:t>
       </w:r>
     </w:p>
     <w:p>
@@ -5950,855 +5914,6 @@
           <w:szCs w:val="24"/>
         </w:rPr>
         <w:t xml:space="preserve">Esta propuesta sugiere ejecutar las épicas siguiendo el mismo orden de dependencia que ya rige las migraciones de base de datos entre servicios (sección 2.8), de modo que ningún servicio dependa de tablas o contratos que todavía no existen:</w:t>
-      </w:r>
-    </w:p>
-    <w:tbl>
-      <w:tblPr>
-        <w:tblW w:type="dxa" w:w="9026"/>
-        <w:tblBorders>
-          <w:top w:val="single" w:color="000000" w:sz="6"/>
-          <w:left w:val="none" w:color="FFFFFF" w:sz="0"/>
-          <w:bottom w:val="single" w:color="000000" w:sz="6"/>
-          <w:right w:val="none" w:color="FFFFFF" w:sz="0"/>
-          <w:insideH w:val="single" w:color="999999" w:sz="2"/>
-          <w:insideV w:val="none" w:color="FFFFFF" w:sz="0"/>
-        </w:tblBorders>
-      </w:tblPr>
-      <w:tblGrid>
-        <w:gridCol w:w="2256"/>
-        <w:gridCol w:w="2256"/>
-        <w:gridCol w:w="2256"/>
-        <w:gridCol w:w="2258"/>
-      </w:tblGrid>
-      <w:tr>
-        <w:trPr>
-          <w:tblHeader/>
-        </w:trPr>
-        <w:tc>
-          <w:tcPr>
-            <w:tcW w:type="dxa" w:w="2256"/>
-            <w:tcMar>
-              <w:top w:type="dxa" w:w="80"/>
-              <w:left w:type="dxa" w:w="100"/>
-              <w:bottom w:type="dxa" w:w="80"/>
-              <w:right w:type="dxa" w:w="100"/>
-            </w:tcMar>
-          </w:tcPr>
-          <w:p>
-            <w:pPr>
-              <w:spacing w:line="276"/>
-            </w:pPr>
-            <w:r>
-              <w:rPr>
-                <w:rFonts w:ascii="Times New Roman" w:cs="Times New Roman" w:eastAsia="Times New Roman" w:hAnsi="Times New Roman"/>
-                <w:b/>
-                <w:bCs/>
-                <w:sz w:val="22"/>
-                <w:szCs w:val="22"/>
-              </w:rPr>
-              <w:t xml:space="preserve">Orden</w:t>
-            </w:r>
-          </w:p>
-        </w:tc>
-        <w:tc>
-          <w:tcPr>
-            <w:tcW w:type="dxa" w:w="2256"/>
-            <w:tcMar>
-              <w:top w:type="dxa" w:w="80"/>
-              <w:left w:type="dxa" w:w="100"/>
-              <w:bottom w:type="dxa" w:w="80"/>
-              <w:right w:type="dxa" w:w="100"/>
-            </w:tcMar>
-          </w:tcPr>
-          <w:p>
-            <w:pPr>
-              <w:spacing w:line="276"/>
-            </w:pPr>
-            <w:r>
-              <w:rPr>
-                <w:rFonts w:ascii="Times New Roman" w:cs="Times New Roman" w:eastAsia="Times New Roman" w:hAnsi="Times New Roman"/>
-                <w:b/>
-                <w:bCs/>
-                <w:sz w:val="22"/>
-                <w:szCs w:val="22"/>
-              </w:rPr>
-              <w:t xml:space="preserve">Épica (Bounded Context)</w:t>
-            </w:r>
-          </w:p>
-        </w:tc>
-        <w:tc>
-          <w:tcPr>
-            <w:tcW w:type="dxa" w:w="2256"/>
-            <w:tcMar>
-              <w:top w:type="dxa" w:w="80"/>
-              <w:left w:type="dxa" w:w="100"/>
-              <w:bottom w:type="dxa" w:w="80"/>
-              <w:right w:type="dxa" w:w="100"/>
-            </w:tcMar>
-          </w:tcPr>
-          <w:p>
-            <w:pPr>
-              <w:spacing w:line="276"/>
-            </w:pPr>
-            <w:r>
-              <w:rPr>
-                <w:rFonts w:ascii="Times New Roman" w:cs="Times New Roman" w:eastAsia="Times New Roman" w:hAnsi="Times New Roman"/>
-                <w:b/>
-                <w:bCs/>
-                <w:sz w:val="22"/>
-                <w:szCs w:val="22"/>
-              </w:rPr>
-              <w:t xml:space="preserve">Historias</w:t>
-            </w:r>
-          </w:p>
-        </w:tc>
-        <w:tc>
-          <w:tcPr>
-            <w:tcW w:type="dxa" w:w="2258"/>
-            <w:tcMar>
-              <w:top w:type="dxa" w:w="80"/>
-              <w:left w:type="dxa" w:w="100"/>
-              <w:bottom w:type="dxa" w:w="80"/>
-              <w:right w:type="dxa" w:w="100"/>
-            </w:tcMar>
-          </w:tcPr>
-          <w:p>
-            <w:pPr>
-              <w:spacing w:line="276"/>
-            </w:pPr>
-            <w:r>
-              <w:rPr>
-                <w:rFonts w:ascii="Times New Roman" w:cs="Times New Roman" w:eastAsia="Times New Roman" w:hAnsi="Times New Roman"/>
-                <w:b/>
-                <w:bCs/>
-                <w:sz w:val="22"/>
-                <w:szCs w:val="22"/>
-              </w:rPr>
-              <w:t xml:space="preserve">Dependencia</w:t>
-            </w:r>
-          </w:p>
-        </w:tc>
-      </w:tr>
-      <w:tr>
-        <w:tc>
-          <w:tcPr>
-            <w:tcW w:type="dxa" w:w="2256"/>
-            <w:tcMar>
-              <w:top w:type="dxa" w:w="80"/>
-              <w:left w:type="dxa" w:w="100"/>
-              <w:bottom w:type="dxa" w:w="80"/>
-              <w:right w:type="dxa" w:w="100"/>
-            </w:tcMar>
-          </w:tcPr>
-          <w:p>
-            <w:pPr>
-              <w:spacing w:line="276"/>
-            </w:pPr>
-            <w:r>
-              <w:rPr>
-                <w:rFonts w:ascii="Times New Roman" w:cs="Times New Roman" w:eastAsia="Times New Roman" w:hAnsi="Times New Roman"/>
-                <w:sz w:val="22"/>
-                <w:szCs w:val="22"/>
-              </w:rPr>
-              <w:t xml:space="preserve">1</w:t>
-            </w:r>
-          </w:p>
-        </w:tc>
-        <w:tc>
-          <w:tcPr>
-            <w:tcW w:type="dxa" w:w="2256"/>
-            <w:tcMar>
-              <w:top w:type="dxa" w:w="80"/>
-              <w:left w:type="dxa" w:w="100"/>
-              <w:bottom w:type="dxa" w:w="80"/>
-              <w:right w:type="dxa" w:w="100"/>
-            </w:tcMar>
-          </w:tcPr>
-          <w:p>
-            <w:pPr>
-              <w:spacing w:line="276"/>
-            </w:pPr>
-            <w:r>
-              <w:rPr>
-                <w:rFonts w:ascii="Times New Roman" w:cs="Times New Roman" w:eastAsia="Times New Roman" w:hAnsi="Times New Roman"/>
-                <w:sz w:val="22"/>
-                <w:szCs w:val="22"/>
-              </w:rPr>
-              <w:t xml:space="preserve">Identity &amp; Access</w:t>
-            </w:r>
-          </w:p>
-        </w:tc>
-        <w:tc>
-          <w:tcPr>
-            <w:tcW w:type="dxa" w:w="2256"/>
-            <w:tcMar>
-              <w:top w:type="dxa" w:w="80"/>
-              <w:left w:type="dxa" w:w="100"/>
-              <w:bottom w:type="dxa" w:w="80"/>
-              <w:right w:type="dxa" w:w="100"/>
-            </w:tcMar>
-          </w:tcPr>
-          <w:p>
-            <w:pPr>
-              <w:spacing w:line="276"/>
-            </w:pPr>
-            <w:r>
-              <w:rPr>
-                <w:rFonts w:ascii="Times New Roman" w:cs="Times New Roman" w:eastAsia="Times New Roman" w:hAnsi="Times New Roman"/>
-                <w:sz w:val="22"/>
-                <w:szCs w:val="22"/>
-              </w:rPr>
-              <w:t xml:space="preserve">5</w:t>
-            </w:r>
-          </w:p>
-        </w:tc>
-        <w:tc>
-          <w:tcPr>
-            <w:tcW w:type="dxa" w:w="2258"/>
-            <w:tcMar>
-              <w:top w:type="dxa" w:w="80"/>
-              <w:left w:type="dxa" w:w="100"/>
-              <w:bottom w:type="dxa" w:w="80"/>
-              <w:right w:type="dxa" w:w="100"/>
-            </w:tcMar>
-          </w:tcPr>
-          <w:p>
-            <w:pPr>
-              <w:spacing w:line="276"/>
-            </w:pPr>
-            <w:r>
-              <w:rPr>
-                <w:rFonts w:ascii="Times New Roman" w:cs="Times New Roman" w:eastAsia="Times New Roman" w:hAnsi="Times New Roman"/>
-                <w:sz w:val="22"/>
-                <w:szCs w:val="22"/>
-              </w:rPr>
-              <w:t xml:space="preserve">Ninguna — autenticación requerida por el resto</w:t>
-            </w:r>
-          </w:p>
-        </w:tc>
-      </w:tr>
-      <w:tr>
-        <w:tc>
-          <w:tcPr>
-            <w:tcW w:type="dxa" w:w="2256"/>
-            <w:tcMar>
-              <w:top w:type="dxa" w:w="80"/>
-              <w:left w:type="dxa" w:w="100"/>
-              <w:bottom w:type="dxa" w:w="80"/>
-              <w:right w:type="dxa" w:w="100"/>
-            </w:tcMar>
-          </w:tcPr>
-          <w:p>
-            <w:pPr>
-              <w:spacing w:line="276"/>
-            </w:pPr>
-            <w:r>
-              <w:rPr>
-                <w:rFonts w:ascii="Times New Roman" w:cs="Times New Roman" w:eastAsia="Times New Roman" w:hAnsi="Times New Roman"/>
-                <w:sz w:val="22"/>
-                <w:szCs w:val="22"/>
-              </w:rPr>
-              <w:t xml:space="preserve">2</w:t>
-            </w:r>
-          </w:p>
-        </w:tc>
-        <w:tc>
-          <w:tcPr>
-            <w:tcW w:type="dxa" w:w="2256"/>
-            <w:tcMar>
-              <w:top w:type="dxa" w:w="80"/>
-              <w:left w:type="dxa" w:w="100"/>
-              <w:bottom w:type="dxa" w:w="80"/>
-              <w:right w:type="dxa" w:w="100"/>
-            </w:tcMar>
-          </w:tcPr>
-          <w:p>
-            <w:pPr>
-              <w:spacing w:line="276"/>
-            </w:pPr>
-            <w:r>
-              <w:rPr>
-                <w:rFonts w:ascii="Times New Roman" w:cs="Times New Roman" w:eastAsia="Times New Roman" w:hAnsi="Times New Roman"/>
-                <w:sz w:val="22"/>
-                <w:szCs w:val="22"/>
-              </w:rPr>
-              <w:t xml:space="preserve">Fleet &amp; Maintenance</w:t>
-            </w:r>
-          </w:p>
-        </w:tc>
-        <w:tc>
-          <w:tcPr>
-            <w:tcW w:type="dxa" w:w="2256"/>
-            <w:tcMar>
-              <w:top w:type="dxa" w:w="80"/>
-              <w:left w:type="dxa" w:w="100"/>
-              <w:bottom w:type="dxa" w:w="80"/>
-              <w:right w:type="dxa" w:w="100"/>
-            </w:tcMar>
-          </w:tcPr>
-          <w:p>
-            <w:pPr>
-              <w:spacing w:line="276"/>
-            </w:pPr>
-            <w:r>
-              <w:rPr>
-                <w:rFonts w:ascii="Times New Roman" w:cs="Times New Roman" w:eastAsia="Times New Roman" w:hAnsi="Times New Roman"/>
-                <w:sz w:val="22"/>
-                <w:szCs w:val="22"/>
-              </w:rPr>
-              <w:t xml:space="preserve">8</w:t>
-            </w:r>
-          </w:p>
-        </w:tc>
-        <w:tc>
-          <w:tcPr>
-            <w:tcW w:type="dxa" w:w="2258"/>
-            <w:tcMar>
-              <w:top w:type="dxa" w:w="80"/>
-              <w:left w:type="dxa" w:w="100"/>
-              <w:bottom w:type="dxa" w:w="80"/>
-              <w:right w:type="dxa" w:w="100"/>
-            </w:tcMar>
-          </w:tcPr>
-          <w:p>
-            <w:pPr>
-              <w:spacing w:line="276"/>
-            </w:pPr>
-            <w:r>
-              <w:rPr>
-                <w:rFonts w:ascii="Times New Roman" w:cs="Times New Roman" w:eastAsia="Times New Roman" w:hAnsi="Times New Roman"/>
-                <w:sz w:val="22"/>
-                <w:szCs w:val="22"/>
-              </w:rPr>
-              <w:t xml:space="preserve">Identity &amp; Access (roles y permisos)</w:t>
-            </w:r>
-          </w:p>
-        </w:tc>
-      </w:tr>
-      <w:tr>
-        <w:tc>
-          <w:tcPr>
-            <w:tcW w:type="dxa" w:w="2256"/>
-            <w:tcMar>
-              <w:top w:type="dxa" w:w="80"/>
-              <w:left w:type="dxa" w:w="100"/>
-              <w:bottom w:type="dxa" w:w="80"/>
-              <w:right w:type="dxa" w:w="100"/>
-            </w:tcMar>
-          </w:tcPr>
-          <w:p>
-            <w:pPr>
-              <w:spacing w:line="276"/>
-            </w:pPr>
-            <w:r>
-              <w:rPr>
-                <w:rFonts w:ascii="Times New Roman" w:cs="Times New Roman" w:eastAsia="Times New Roman" w:hAnsi="Times New Roman"/>
-                <w:sz w:val="22"/>
-                <w:szCs w:val="22"/>
-              </w:rPr>
-              <w:t xml:space="preserve">3</w:t>
-            </w:r>
-          </w:p>
-        </w:tc>
-        <w:tc>
-          <w:tcPr>
-            <w:tcW w:type="dxa" w:w="2256"/>
-            <w:tcMar>
-              <w:top w:type="dxa" w:w="80"/>
-              <w:left w:type="dxa" w:w="100"/>
-              <w:bottom w:type="dxa" w:w="80"/>
-              <w:right w:type="dxa" w:w="100"/>
-            </w:tcMar>
-          </w:tcPr>
-          <w:p>
-            <w:pPr>
-              <w:spacing w:line="276"/>
-            </w:pPr>
-            <w:r>
-              <w:rPr>
-                <w:rFonts w:ascii="Times New Roman" w:cs="Times New Roman" w:eastAsia="Times New Roman" w:hAnsi="Times New Roman"/>
-                <w:sz w:val="22"/>
-                <w:szCs w:val="22"/>
-              </w:rPr>
-              <w:t xml:space="preserve">Telemetry &amp; GPS</w:t>
-            </w:r>
-          </w:p>
-        </w:tc>
-        <w:tc>
-          <w:tcPr>
-            <w:tcW w:type="dxa" w:w="2256"/>
-            <w:tcMar>
-              <w:top w:type="dxa" w:w="80"/>
-              <w:left w:type="dxa" w:w="100"/>
-              <w:bottom w:type="dxa" w:w="80"/>
-              <w:right w:type="dxa" w:w="100"/>
-            </w:tcMar>
-          </w:tcPr>
-          <w:p>
-            <w:pPr>
-              <w:spacing w:line="276"/>
-            </w:pPr>
-            <w:r>
-              <w:rPr>
-                <w:rFonts w:ascii="Times New Roman" w:cs="Times New Roman" w:eastAsia="Times New Roman" w:hAnsi="Times New Roman"/>
-                <w:sz w:val="22"/>
-                <w:szCs w:val="22"/>
-              </w:rPr>
-              <w:t xml:space="preserve">2</w:t>
-            </w:r>
-          </w:p>
-        </w:tc>
-        <w:tc>
-          <w:tcPr>
-            <w:tcW w:type="dxa" w:w="2258"/>
-            <w:tcMar>
-              <w:top w:type="dxa" w:w="80"/>
-              <w:left w:type="dxa" w:w="100"/>
-              <w:bottom w:type="dxa" w:w="80"/>
-              <w:right w:type="dxa" w:w="100"/>
-            </w:tcMar>
-          </w:tcPr>
-          <w:p>
-            <w:pPr>
-              <w:spacing w:line="276"/>
-            </w:pPr>
-            <w:r>
-              <w:rPr>
-                <w:rFonts w:ascii="Times New Roman" w:cs="Times New Roman" w:eastAsia="Times New Roman" w:hAnsi="Times New Roman"/>
-                <w:sz w:val="22"/>
-                <w:szCs w:val="22"/>
-              </w:rPr>
-              <w:t xml:space="preserve">Fleet &amp; Maintenance (vehículos a rastrear)</w:t>
-            </w:r>
-          </w:p>
-        </w:tc>
-      </w:tr>
-      <w:tr>
-        <w:tc>
-          <w:tcPr>
-            <w:tcW w:type="dxa" w:w="2256"/>
-            <w:tcMar>
-              <w:top w:type="dxa" w:w="80"/>
-              <w:left w:type="dxa" w:w="100"/>
-              <w:bottom w:type="dxa" w:w="80"/>
-              <w:right w:type="dxa" w:w="100"/>
-            </w:tcMar>
-          </w:tcPr>
-          <w:p>
-            <w:pPr>
-              <w:spacing w:line="276"/>
-            </w:pPr>
-            <w:r>
-              <w:rPr>
-                <w:rFonts w:ascii="Times New Roman" w:cs="Times New Roman" w:eastAsia="Times New Roman" w:hAnsi="Times New Roman"/>
-                <w:sz w:val="22"/>
-                <w:szCs w:val="22"/>
-              </w:rPr>
-              <w:t xml:space="preserve">4</w:t>
-            </w:r>
-          </w:p>
-        </w:tc>
-        <w:tc>
-          <w:tcPr>
-            <w:tcW w:type="dxa" w:w="2256"/>
-            <w:tcMar>
-              <w:top w:type="dxa" w:w="80"/>
-              <w:left w:type="dxa" w:w="100"/>
-              <w:bottom w:type="dxa" w:w="80"/>
-              <w:right w:type="dxa" w:w="100"/>
-            </w:tcMar>
-          </w:tcPr>
-          <w:p>
-            <w:pPr>
-              <w:spacing w:line="276"/>
-            </w:pPr>
-            <w:r>
-              <w:rPr>
-                <w:rFonts w:ascii="Times New Roman" w:cs="Times New Roman" w:eastAsia="Times New Roman" w:hAnsi="Times New Roman"/>
-                <w:sz w:val="22"/>
-                <w:szCs w:val="22"/>
-              </w:rPr>
-              <w:t xml:space="preserve">Booking &amp; Reservation</w:t>
-            </w:r>
-          </w:p>
-        </w:tc>
-        <w:tc>
-          <w:tcPr>
-            <w:tcW w:type="dxa" w:w="2256"/>
-            <w:tcMar>
-              <w:top w:type="dxa" w:w="80"/>
-              <w:left w:type="dxa" w:w="100"/>
-              <w:bottom w:type="dxa" w:w="80"/>
-              <w:right w:type="dxa" w:w="100"/>
-            </w:tcMar>
-          </w:tcPr>
-          <w:p>
-            <w:pPr>
-              <w:spacing w:line="276"/>
-            </w:pPr>
-            <w:r>
-              <w:rPr>
-                <w:rFonts w:ascii="Times New Roman" w:cs="Times New Roman" w:eastAsia="Times New Roman" w:hAnsi="Times New Roman"/>
-                <w:sz w:val="22"/>
-                <w:szCs w:val="22"/>
-              </w:rPr>
-              <w:t xml:space="preserve">9</w:t>
-            </w:r>
-          </w:p>
-        </w:tc>
-        <w:tc>
-          <w:tcPr>
-            <w:tcW w:type="dxa" w:w="2258"/>
-            <w:tcMar>
-              <w:top w:type="dxa" w:w="80"/>
-              <w:left w:type="dxa" w:w="100"/>
-              <w:bottom w:type="dxa" w:w="80"/>
-              <w:right w:type="dxa" w:w="100"/>
-            </w:tcMar>
-          </w:tcPr>
-          <w:p>
-            <w:pPr>
-              <w:spacing w:line="276"/>
-            </w:pPr>
-            <w:r>
-              <w:rPr>
-                <w:rFonts w:ascii="Times New Roman" w:cs="Times New Roman" w:eastAsia="Times New Roman" w:hAnsi="Times New Roman"/>
-                <w:sz w:val="22"/>
-                <w:szCs w:val="22"/>
-              </w:rPr>
-              <w:t xml:space="preserve">Identity &amp; Access, Fleet &amp; Maintenance</w:t>
-            </w:r>
-          </w:p>
-        </w:tc>
-      </w:tr>
-      <w:tr>
-        <w:tc>
-          <w:tcPr>
-            <w:tcW w:type="dxa" w:w="2256"/>
-            <w:tcMar>
-              <w:top w:type="dxa" w:w="80"/>
-              <w:left w:type="dxa" w:w="100"/>
-              <w:bottom w:type="dxa" w:w="80"/>
-              <w:right w:type="dxa" w:w="100"/>
-            </w:tcMar>
-          </w:tcPr>
-          <w:p>
-            <w:pPr>
-              <w:spacing w:line="276"/>
-            </w:pPr>
-            <w:r>
-              <w:rPr>
-                <w:rFonts w:ascii="Times New Roman" w:cs="Times New Roman" w:eastAsia="Times New Roman" w:hAnsi="Times New Roman"/>
-                <w:sz w:val="22"/>
-                <w:szCs w:val="22"/>
-              </w:rPr>
-              <w:t xml:space="preserve">5</w:t>
-            </w:r>
-          </w:p>
-        </w:tc>
-        <w:tc>
-          <w:tcPr>
-            <w:tcW w:type="dxa" w:w="2256"/>
-            <w:tcMar>
-              <w:top w:type="dxa" w:w="80"/>
-              <w:left w:type="dxa" w:w="100"/>
-              <w:bottom w:type="dxa" w:w="80"/>
-              <w:right w:type="dxa" w:w="100"/>
-            </w:tcMar>
-          </w:tcPr>
-          <w:p>
-            <w:pPr>
-              <w:spacing w:line="276"/>
-            </w:pPr>
-            <w:r>
-              <w:rPr>
-                <w:rFonts w:ascii="Times New Roman" w:cs="Times New Roman" w:eastAsia="Times New Roman" w:hAnsi="Times New Roman"/>
-                <w:sz w:val="22"/>
-                <w:szCs w:val="22"/>
-              </w:rPr>
-              <w:t xml:space="preserve">Rental Execution</w:t>
-            </w:r>
-          </w:p>
-        </w:tc>
-        <w:tc>
-          <w:tcPr>
-            <w:tcW w:type="dxa" w:w="2256"/>
-            <w:tcMar>
-              <w:top w:type="dxa" w:w="80"/>
-              <w:left w:type="dxa" w:w="100"/>
-              <w:bottom w:type="dxa" w:w="80"/>
-              <w:right w:type="dxa" w:w="100"/>
-            </w:tcMar>
-          </w:tcPr>
-          <w:p>
-            <w:pPr>
-              <w:spacing w:line="276"/>
-            </w:pPr>
-            <w:r>
-              <w:rPr>
-                <w:rFonts w:ascii="Times New Roman" w:cs="Times New Roman" w:eastAsia="Times New Roman" w:hAnsi="Times New Roman"/>
-                <w:sz w:val="22"/>
-                <w:szCs w:val="22"/>
-              </w:rPr>
-              <w:t xml:space="preserve">2</w:t>
-            </w:r>
-          </w:p>
-        </w:tc>
-        <w:tc>
-          <w:tcPr>
-            <w:tcW w:type="dxa" w:w="2258"/>
-            <w:tcMar>
-              <w:top w:type="dxa" w:w="80"/>
-              <w:left w:type="dxa" w:w="100"/>
-              <w:bottom w:type="dxa" w:w="80"/>
-              <w:right w:type="dxa" w:w="100"/>
-            </w:tcMar>
-          </w:tcPr>
-          <w:p>
-            <w:pPr>
-              <w:spacing w:line="276"/>
-            </w:pPr>
-            <w:r>
-              <w:rPr>
-                <w:rFonts w:ascii="Times New Roman" w:cs="Times New Roman" w:eastAsia="Times New Roman" w:hAnsi="Times New Roman"/>
-                <w:sz w:val="22"/>
-                <w:szCs w:val="22"/>
-              </w:rPr>
-              <w:t xml:space="preserve">Booking &amp; Reservation (reserva confirmada)</w:t>
-            </w:r>
-          </w:p>
-        </w:tc>
-      </w:tr>
-      <w:tr>
-        <w:tc>
-          <w:tcPr>
-            <w:tcW w:type="dxa" w:w="2256"/>
-            <w:tcMar>
-              <w:top w:type="dxa" w:w="80"/>
-              <w:left w:type="dxa" w:w="100"/>
-              <w:bottom w:type="dxa" w:w="80"/>
-              <w:right w:type="dxa" w:w="100"/>
-            </w:tcMar>
-          </w:tcPr>
-          <w:p>
-            <w:pPr>
-              <w:spacing w:line="276"/>
-            </w:pPr>
-            <w:r>
-              <w:rPr>
-                <w:rFonts w:ascii="Times New Roman" w:cs="Times New Roman" w:eastAsia="Times New Roman" w:hAnsi="Times New Roman"/>
-                <w:sz w:val="22"/>
-                <w:szCs w:val="22"/>
-              </w:rPr>
-              <w:t xml:space="preserve">6</w:t>
-            </w:r>
-          </w:p>
-        </w:tc>
-        <w:tc>
-          <w:tcPr>
-            <w:tcW w:type="dxa" w:w="2256"/>
-            <w:tcMar>
-              <w:top w:type="dxa" w:w="80"/>
-              <w:left w:type="dxa" w:w="100"/>
-              <w:bottom w:type="dxa" w:w="80"/>
-              <w:right w:type="dxa" w:w="100"/>
-            </w:tcMar>
-          </w:tcPr>
-          <w:p>
-            <w:pPr>
-              <w:spacing w:line="276"/>
-            </w:pPr>
-            <w:r>
-              <w:rPr>
-                <w:rFonts w:ascii="Times New Roman" w:cs="Times New Roman" w:eastAsia="Times New Roman" w:hAnsi="Times New Roman"/>
-                <w:sz w:val="22"/>
-                <w:szCs w:val="22"/>
-              </w:rPr>
-              <w:t xml:space="preserve">Payment &amp; Billing</w:t>
-            </w:r>
-          </w:p>
-        </w:tc>
-        <w:tc>
-          <w:tcPr>
-            <w:tcW w:type="dxa" w:w="2256"/>
-            <w:tcMar>
-              <w:top w:type="dxa" w:w="80"/>
-              <w:left w:type="dxa" w:w="100"/>
-              <w:bottom w:type="dxa" w:w="80"/>
-              <w:right w:type="dxa" w:w="100"/>
-            </w:tcMar>
-          </w:tcPr>
-          <w:p>
-            <w:pPr>
-              <w:spacing w:line="276"/>
-            </w:pPr>
-            <w:r>
-              <w:rPr>
-                <w:rFonts w:ascii="Times New Roman" w:cs="Times New Roman" w:eastAsia="Times New Roman" w:hAnsi="Times New Roman"/>
-                <w:sz w:val="22"/>
-                <w:szCs w:val="22"/>
-              </w:rPr>
-              <w:t xml:space="preserve">5</w:t>
-            </w:r>
-          </w:p>
-        </w:tc>
-        <w:tc>
-          <w:tcPr>
-            <w:tcW w:type="dxa" w:w="2258"/>
-            <w:tcMar>
-              <w:top w:type="dxa" w:w="80"/>
-              <w:left w:type="dxa" w:w="100"/>
-              <w:bottom w:type="dxa" w:w="80"/>
-              <w:right w:type="dxa" w:w="100"/>
-            </w:tcMar>
-          </w:tcPr>
-          <w:p>
-            <w:pPr>
-              <w:spacing w:line="276"/>
-            </w:pPr>
-            <w:r>
-              <w:rPr>
-                <w:rFonts w:ascii="Times New Roman" w:cs="Times New Roman" w:eastAsia="Times New Roman" w:hAnsi="Times New Roman"/>
-                <w:sz w:val="22"/>
-                <w:szCs w:val="22"/>
-              </w:rPr>
-              <w:t xml:space="preserve">Booking &amp; Reservation</w:t>
-            </w:r>
-          </w:p>
-        </w:tc>
-      </w:tr>
-      <w:tr>
-        <w:tc>
-          <w:tcPr>
-            <w:tcW w:type="dxa" w:w="2256"/>
-            <w:tcMar>
-              <w:top w:type="dxa" w:w="80"/>
-              <w:left w:type="dxa" w:w="100"/>
-              <w:bottom w:type="dxa" w:w="80"/>
-              <w:right w:type="dxa" w:w="100"/>
-            </w:tcMar>
-          </w:tcPr>
-          <w:p>
-            <w:pPr>
-              <w:spacing w:line="276"/>
-            </w:pPr>
-            <w:r>
-              <w:rPr>
-                <w:rFonts w:ascii="Times New Roman" w:cs="Times New Roman" w:eastAsia="Times New Roman" w:hAnsi="Times New Roman"/>
-                <w:sz w:val="22"/>
-                <w:szCs w:val="22"/>
-              </w:rPr>
-              <w:t xml:space="preserve">7</w:t>
-            </w:r>
-          </w:p>
-        </w:tc>
-        <w:tc>
-          <w:tcPr>
-            <w:tcW w:type="dxa" w:w="2256"/>
-            <w:tcMar>
-              <w:top w:type="dxa" w:w="80"/>
-              <w:left w:type="dxa" w:w="100"/>
-              <w:bottom w:type="dxa" w:w="80"/>
-              <w:right w:type="dxa" w:w="100"/>
-            </w:tcMar>
-          </w:tcPr>
-          <w:p>
-            <w:pPr>
-              <w:spacing w:line="276"/>
-            </w:pPr>
-            <w:r>
-              <w:rPr>
-                <w:rFonts w:ascii="Times New Roman" w:cs="Times New Roman" w:eastAsia="Times New Roman" w:hAnsi="Times New Roman"/>
-                <w:sz w:val="22"/>
-                <w:szCs w:val="22"/>
-              </w:rPr>
-              <w:t xml:space="preserve">Notification</w:t>
-            </w:r>
-          </w:p>
-        </w:tc>
-        <w:tc>
-          <w:tcPr>
-            <w:tcW w:type="dxa" w:w="2256"/>
-            <w:tcMar>
-              <w:top w:type="dxa" w:w="80"/>
-              <w:left w:type="dxa" w:w="100"/>
-              <w:bottom w:type="dxa" w:w="80"/>
-              <w:right w:type="dxa" w:w="100"/>
-            </w:tcMar>
-          </w:tcPr>
-          <w:p>
-            <w:pPr>
-              <w:spacing w:line="276"/>
-            </w:pPr>
-            <w:r>
-              <w:rPr>
-                <w:rFonts w:ascii="Times New Roman" w:cs="Times New Roman" w:eastAsia="Times New Roman" w:hAnsi="Times New Roman"/>
-                <w:sz w:val="22"/>
-                <w:szCs w:val="22"/>
-              </w:rPr>
-              <w:t xml:space="preserve">1</w:t>
-            </w:r>
-          </w:p>
-        </w:tc>
-        <w:tc>
-          <w:tcPr>
-            <w:tcW w:type="dxa" w:w="2258"/>
-            <w:tcMar>
-              <w:top w:type="dxa" w:w="80"/>
-              <w:left w:type="dxa" w:w="100"/>
-              <w:bottom w:type="dxa" w:w="80"/>
-              <w:right w:type="dxa" w:w="100"/>
-            </w:tcMar>
-          </w:tcPr>
-          <w:p>
-            <w:pPr>
-              <w:spacing w:line="276"/>
-            </w:pPr>
-            <w:r>
-              <w:rPr>
-                <w:rFonts w:ascii="Times New Roman" w:cs="Times New Roman" w:eastAsia="Times New Roman" w:hAnsi="Times New Roman"/>
-                <w:sz w:val="22"/>
-                <w:szCs w:val="22"/>
-              </w:rPr>
-              <w:t xml:space="preserve">Transversal a los eventos de las épicas anteriores</w:t>
-            </w:r>
-          </w:p>
-        </w:tc>
-      </w:tr>
-    </w:tbl>
-    <w:p>
-      <w:pPr>
-        <w:spacing w:after="160"/>
-      </w:pPr>
-    </w:p>
-    <w:p>
-      <w:pPr>
-        <w:spacing w:after="200" w:line="480"/>
-        <w:jc w:val="both"/>
-      </w:pPr>
-      <w:r>
-        <w:rPr>
-          <w:rFonts w:ascii="Times New Roman" w:cs="Times New Roman" w:eastAsia="Times New Roman" w:hAnsi="Times New Roman"/>
-          <w:sz w:val="24"/>
-          <w:szCs w:val="24"/>
-        </w:rPr>
-        <w:t xml:space="preserve">Con sprints de una semana y un equipo de 3 personas, cada épica puede distribuirse en uno o más sprints según el número de historias y su estimación en puntos; el calendario exacto por sprint queda sujeto a la Sprint Planning de cada semana, conforme a la metodología descrita en la sección 6.</w:t>
-      </w:r>
-    </w:p>
-    <w:p>
-      <w:pPr>
-        <w:spacing w:after="240" w:before="240" w:line="480"/>
-        <w:jc w:val="center"/>
-      </w:pPr>
-      <w:r>
-        <w:rPr>
-          <w:rFonts w:ascii="Times New Roman" w:cs="Times New Roman" w:eastAsia="Times New Roman" w:hAnsi="Times New Roman"/>
-          <w:b/>
-          <w:bCs/>
-          <w:sz w:val="24"/>
-          <w:szCs w:val="24"/>
-        </w:rPr>
-        <w:t xml:space="preserve">8. Riesgos y mitigación</w:t>
       </w:r>
     </w:p>
     <w:tbl>
@@ -6844,7 +5959,7 @@
                 <w:sz w:val="22"/>
                 <w:szCs w:val="22"/>
               </w:rPr>
-              <w:t xml:space="preserve">Riesgo</w:t>
+              <w:t xml:space="preserve">Orden</w:t>
             </w:r>
           </w:p>
         </w:tc>
@@ -6870,7 +5985,7 @@
                 <w:sz w:val="22"/>
                 <w:szCs w:val="22"/>
               </w:rPr>
-              <w:t xml:space="preserve">Origen</w:t>
+              <w:t xml:space="preserve">Épica (Bounded Context)</w:t>
             </w:r>
           </w:p>
         </w:tc>
@@ -6896,7 +6011,7 @@
                 <w:sz w:val="22"/>
                 <w:szCs w:val="22"/>
               </w:rPr>
-              <w:t xml:space="preserve">Mitigación propuesta</w:t>
+              <w:t xml:space="preserve">Dependencia</w:t>
             </w:r>
           </w:p>
         </w:tc>
@@ -6922,31 +6037,31 @@
                 <w:sz w:val="22"/>
                 <w:szCs w:val="22"/>
               </w:rPr>
-              <w:t xml:space="preserve">Migraciones de esquema descoordinadas entre servicios que comparten la base de datos</w:t>
-            </w:r>
-          </w:p>
-        </w:tc>
-        <w:tc>
-          <w:tcPr>
-            <w:tcW w:type="dxa" w:w="3008"/>
-            <w:tcMar>
-              <w:top w:type="dxa" w:w="80"/>
-              <w:left w:type="dxa" w:w="100"/>
-              <w:bottom w:type="dxa" w:w="80"/>
-              <w:right w:type="dxa" w:w="100"/>
-            </w:tcMar>
-          </w:tcPr>
-          <w:p>
-            <w:pPr>
-              <w:spacing w:line="276"/>
-            </w:pPr>
-            <w:r>
-              <w:rPr>
-                <w:rFonts w:ascii="Times New Roman" w:cs="Times New Roman" w:eastAsia="Times New Roman" w:hAnsi="Times New Roman"/>
-                <w:sz w:val="22"/>
-                <w:szCs w:val="22"/>
-              </w:rPr>
-              <w:t xml:space="preserve">ADR-002, ADR-009</w:t>
+              <w:t xml:space="preserve">1</w:t>
+            </w:r>
+          </w:p>
+        </w:tc>
+        <w:tc>
+          <w:tcPr>
+            <w:tcW w:type="dxa" w:w="3008"/>
+            <w:tcMar>
+              <w:top w:type="dxa" w:w="80"/>
+              <w:left w:type="dxa" w:w="100"/>
+              <w:bottom w:type="dxa" w:w="80"/>
+              <w:right w:type="dxa" w:w="100"/>
+            </w:tcMar>
+          </w:tcPr>
+          <w:p>
+            <w:pPr>
+              <w:spacing w:line="276"/>
+            </w:pPr>
+            <w:r>
+              <w:rPr>
+                <w:rFonts w:ascii="Times New Roman" w:cs="Times New Roman" w:eastAsia="Times New Roman" w:hAnsi="Times New Roman"/>
+                <w:sz w:val="22"/>
+                <w:szCs w:val="22"/>
+              </w:rPr>
+              <w:t xml:space="preserve">Identity &amp; Access</w:t>
             </w:r>
           </w:p>
         </w:tc>
@@ -6970,7 +6085,7 @@
                 <w:sz w:val="22"/>
                 <w:szCs w:val="22"/>
               </w:rPr>
-              <w:t xml:space="preserve">Orden de ejecución fijo entre repositorios de migración y revisión obligatoria antes de desplegar cambios de esquema</w:t>
+              <w:t xml:space="preserve">Ninguna — autenticación requerida por el resto</w:t>
             </w:r>
           </w:p>
         </w:tc>
@@ -6996,31 +6111,31 @@
                 <w:sz w:val="22"/>
                 <w:szCs w:val="22"/>
               </w:rPr>
-              <w:t xml:space="preserve">Referencias residuales a Supabase en el frontend</w:t>
-            </w:r>
-          </w:p>
-        </w:tc>
-        <w:tc>
-          <w:tcPr>
-            <w:tcW w:type="dxa" w:w="3008"/>
-            <w:tcMar>
-              <w:top w:type="dxa" w:w="80"/>
-              <w:left w:type="dxa" w:w="100"/>
-              <w:bottom w:type="dxa" w:w="80"/>
-              <w:right w:type="dxa" w:w="100"/>
-            </w:tcMar>
-          </w:tcPr>
-          <w:p>
-            <w:pPr>
-              <w:spacing w:line="276"/>
-            </w:pPr>
-            <w:r>
-              <w:rPr>
-                <w:rFonts w:ascii="Times New Roman" w:cs="Times New Roman" w:eastAsia="Times New Roman" w:hAnsi="Times New Roman"/>
-                <w:sz w:val="22"/>
-                <w:szCs w:val="22"/>
-              </w:rPr>
-              <w:t xml:space="preserve">ADR-007</w:t>
+              <w:t xml:space="preserve">2</w:t>
+            </w:r>
+          </w:p>
+        </w:tc>
+        <w:tc>
+          <w:tcPr>
+            <w:tcW w:type="dxa" w:w="3008"/>
+            <w:tcMar>
+              <w:top w:type="dxa" w:w="80"/>
+              <w:left w:type="dxa" w:w="100"/>
+              <w:bottom w:type="dxa" w:w="80"/>
+              <w:right w:type="dxa" w:w="100"/>
+            </w:tcMar>
+          </w:tcPr>
+          <w:p>
+            <w:pPr>
+              <w:spacing w:line="276"/>
+            </w:pPr>
+            <w:r>
+              <w:rPr>
+                <w:rFonts w:ascii="Times New Roman" w:cs="Times New Roman" w:eastAsia="Times New Roman" w:hAnsi="Times New Roman"/>
+                <w:sz w:val="22"/>
+                <w:szCs w:val="22"/>
+              </w:rPr>
+              <w:t xml:space="preserve">Fleet &amp; Maintenance</w:t>
             </w:r>
           </w:p>
         </w:tc>
@@ -7044,7 +6159,7 @@
                 <w:sz w:val="22"/>
                 <w:szCs w:val="22"/>
               </w:rPr>
-              <w:t xml:space="preserve">Tratarlas como deuda técnica explícita; no ampliarlas sin actualizar el ADR correspondiente</w:t>
+              <w:t xml:space="preserve">Identity &amp; Access (roles y permisos)</w:t>
             </w:r>
           </w:p>
         </w:tc>
@@ -7070,31 +6185,31 @@
                 <w:sz w:val="22"/>
                 <w:szCs w:val="22"/>
               </w:rPr>
-              <w:t xml:space="preserve">Rutas de contratos de alquiler expuestas fuera del alcance del MVP</w:t>
-            </w:r>
-          </w:p>
-        </w:tc>
-        <w:tc>
-          <w:tcPr>
-            <w:tcW w:type="dxa" w:w="3008"/>
-            <w:tcMar>
-              <w:top w:type="dxa" w:w="80"/>
-              <w:left w:type="dxa" w:w="100"/>
-              <w:bottom w:type="dxa" w:w="80"/>
-              <w:right w:type="dxa" w:w="100"/>
-            </w:tcMar>
-          </w:tcPr>
-          <w:p>
-            <w:pPr>
-              <w:spacing w:line="276"/>
-            </w:pPr>
-            <w:r>
-              <w:rPr>
-                <w:rFonts w:ascii="Times New Roman" w:cs="Times New Roman" w:eastAsia="Times New Roman" w:hAnsi="Times New Roman"/>
-                <w:sz w:val="22"/>
-                <w:szCs w:val="22"/>
-              </w:rPr>
-              <w:t xml:space="preserve">ADR-008</w:t>
+              <w:t xml:space="preserve">3</w:t>
+            </w:r>
+          </w:p>
+        </w:tc>
+        <w:tc>
+          <w:tcPr>
+            <w:tcW w:type="dxa" w:w="3008"/>
+            <w:tcMar>
+              <w:top w:type="dxa" w:w="80"/>
+              <w:left w:type="dxa" w:w="100"/>
+              <w:bottom w:type="dxa" w:w="80"/>
+              <w:right w:type="dxa" w:w="100"/>
+            </w:tcMar>
+          </w:tcPr>
+          <w:p>
+            <w:pPr>
+              <w:spacing w:line="276"/>
+            </w:pPr>
+            <w:r>
+              <w:rPr>
+                <w:rFonts w:ascii="Times New Roman" w:cs="Times New Roman" w:eastAsia="Times New Roman" w:hAnsi="Times New Roman"/>
+                <w:sz w:val="22"/>
+                <w:szCs w:val="22"/>
+              </w:rPr>
+              <w:t xml:space="preserve">Telemetry &amp; GPS</w:t>
             </w:r>
           </w:p>
         </w:tc>
@@ -7118,7 +6233,7 @@
                 <w:sz w:val="22"/>
                 <w:szCs w:val="22"/>
               </w:rPr>
-              <w:t xml:space="preserve">Ocultar o remover la navegación activa hacia esas rutas hasta que exista un cambio de alcance aprobado</w:t>
+              <w:t xml:space="preserve">Fleet &amp; Maintenance (vehículos a rastrear)</w:t>
             </w:r>
           </w:p>
         </w:tc>
@@ -7144,31 +6259,31 @@
                 <w:sz w:val="22"/>
                 <w:szCs w:val="22"/>
               </w:rPr>
-              <w:t xml:space="preserve">Convenciones de carpetas inconsistentes en el frontend web (mayúsculas/minúsculas)</w:t>
-            </w:r>
-          </w:p>
-        </w:tc>
-        <w:tc>
-          <w:tcPr>
-            <w:tcW w:type="dxa" w:w="3008"/>
-            <w:tcMar>
-              <w:top w:type="dxa" w:w="80"/>
-              <w:left w:type="dxa" w:w="100"/>
-              <w:bottom w:type="dxa" w:w="80"/>
-              <w:right w:type="dxa" w:w="100"/>
-            </w:tcMar>
-          </w:tcPr>
-          <w:p>
-            <w:pPr>
-              <w:spacing w:line="276"/>
-            </w:pPr>
-            <w:r>
-              <w:rPr>
-                <w:rFonts w:ascii="Times New Roman" w:cs="Times New Roman" w:eastAsia="Times New Roman" w:hAnsi="Times New Roman"/>
-                <w:sz w:val="22"/>
-                <w:szCs w:val="22"/>
-              </w:rPr>
-              <w:t xml:space="preserve">ADR-006</w:t>
+              <w:t xml:space="preserve">4</w:t>
+            </w:r>
+          </w:p>
+        </w:tc>
+        <w:tc>
+          <w:tcPr>
+            <w:tcW w:type="dxa" w:w="3008"/>
+            <w:tcMar>
+              <w:top w:type="dxa" w:w="80"/>
+              <w:left w:type="dxa" w:w="100"/>
+              <w:bottom w:type="dxa" w:w="80"/>
+              <w:right w:type="dxa" w:w="100"/>
+            </w:tcMar>
+          </w:tcPr>
+          <w:p>
+            <w:pPr>
+              <w:spacing w:line="276"/>
+            </w:pPr>
+            <w:r>
+              <w:rPr>
+                <w:rFonts w:ascii="Times New Roman" w:cs="Times New Roman" w:eastAsia="Times New Roman" w:hAnsi="Times New Roman"/>
+                <w:sz w:val="22"/>
+                <w:szCs w:val="22"/>
+              </w:rPr>
+              <w:t xml:space="preserve">Booking &amp; Reservation</w:t>
             </w:r>
           </w:p>
         </w:tc>
@@ -7192,7 +6307,7 @@
                 <w:sz w:val="22"/>
                 <w:szCs w:val="22"/>
               </w:rPr>
-              <w:t xml:space="preserve">Exigir la convención estandarizada en código nuevo; migración incremental del código existente</w:t>
+              <w:t xml:space="preserve">Identity &amp; Access, Fleet &amp; Maintenance</w:t>
             </w:r>
           </w:p>
         </w:tc>
@@ -7218,31 +6333,31 @@
                 <w:sz w:val="22"/>
                 <w:szCs w:val="22"/>
               </w:rPr>
-              <w:t xml:space="preserve">Backlog con cronograma de sprints sin asignar</w:t>
-            </w:r>
-          </w:p>
-        </w:tc>
-        <w:tc>
-          <w:tcPr>
-            <w:tcW w:type="dxa" w:w="3008"/>
-            <w:tcMar>
-              <w:top w:type="dxa" w:w="80"/>
-              <w:left w:type="dxa" w:w="100"/>
-              <w:bottom w:type="dxa" w:w="80"/>
-              <w:right w:type="dxa" w:w="100"/>
-            </w:tcMar>
-          </w:tcPr>
-          <w:p>
-            <w:pPr>
-              <w:spacing w:line="276"/>
-            </w:pPr>
-            <w:r>
-              <w:rPr>
-                <w:rFonts w:ascii="Times New Roman" w:cs="Times New Roman" w:eastAsia="Times New Roman" w:hAnsi="Times New Roman"/>
-                <w:sz w:val="22"/>
-                <w:szCs w:val="22"/>
-              </w:rPr>
-              <w:t xml:space="preserve">04-requirements/user-stories.md</w:t>
+              <w:t xml:space="preserve">5</w:t>
+            </w:r>
+          </w:p>
+        </w:tc>
+        <w:tc>
+          <w:tcPr>
+            <w:tcW w:type="dxa" w:w="3008"/>
+            <w:tcMar>
+              <w:top w:type="dxa" w:w="80"/>
+              <w:left w:type="dxa" w:w="100"/>
+              <w:bottom w:type="dxa" w:w="80"/>
+              <w:right w:type="dxa" w:w="100"/>
+            </w:tcMar>
+          </w:tcPr>
+          <w:p>
+            <w:pPr>
+              <w:spacing w:line="276"/>
+            </w:pPr>
+            <w:r>
+              <w:rPr>
+                <w:rFonts w:ascii="Times New Roman" w:cs="Times New Roman" w:eastAsia="Times New Roman" w:hAnsi="Times New Roman"/>
+                <w:sz w:val="22"/>
+                <w:szCs w:val="22"/>
+              </w:rPr>
+              <w:t xml:space="preserve">Rental Execution</w:t>
             </w:r>
           </w:p>
         </w:tc>
@@ -7266,7 +6381,7 @@
                 <w:sz w:val="22"/>
                 <w:szCs w:val="22"/>
               </w:rPr>
-              <w:t xml:space="preserve">Priorizar la asignación de sprints siguiendo el orden de dependencia propuesto en la sección 7</w:t>
+              <w:t xml:space="preserve">Booking &amp; Reservation (reserva confirmada)</w:t>
             </w:r>
           </w:p>
         </w:tc>
@@ -7292,31 +6407,31 @@
                 <w:sz w:val="22"/>
                 <w:szCs w:val="22"/>
               </w:rPr>
-              <w:t xml:space="preserve">Desacuerdo de estimación entre integrantes del equipo</w:t>
-            </w:r>
-          </w:p>
-        </w:tc>
-        <w:tc>
-          <w:tcPr>
-            <w:tcW w:type="dxa" w:w="3008"/>
-            <w:tcMar>
-              <w:top w:type="dxa" w:w="80"/>
-              <w:left w:type="dxa" w:w="100"/>
-              <w:bottom w:type="dxa" w:w="80"/>
-              <w:right w:type="dxa" w:w="100"/>
-            </w:tcMar>
-          </w:tcPr>
-          <w:p>
-            <w:pPr>
-              <w:spacing w:line="276"/>
-            </w:pPr>
-            <w:r>
-              <w:rPr>
-                <w:rFonts w:ascii="Times New Roman" w:cs="Times New Roman" w:eastAsia="Times New Roman" w:hAnsi="Times New Roman"/>
-                <w:sz w:val="22"/>
-                <w:szCs w:val="22"/>
-              </w:rPr>
-              <w:t xml:space="preserve">00-governance/agile-conventions.md</w:t>
+              <w:t xml:space="preserve">6</w:t>
+            </w:r>
+          </w:p>
+        </w:tc>
+        <w:tc>
+          <w:tcPr>
+            <w:tcW w:type="dxa" w:w="3008"/>
+            <w:tcMar>
+              <w:top w:type="dxa" w:w="80"/>
+              <w:left w:type="dxa" w:w="100"/>
+              <w:bottom w:type="dxa" w:w="80"/>
+              <w:right w:type="dxa" w:w="100"/>
+            </w:tcMar>
+          </w:tcPr>
+          <w:p>
+            <w:pPr>
+              <w:spacing w:line="276"/>
+            </w:pPr>
+            <w:r>
+              <w:rPr>
+                <w:rFonts w:ascii="Times New Roman" w:cs="Times New Roman" w:eastAsia="Times New Roman" w:hAnsi="Times New Roman"/>
+                <w:sz w:val="22"/>
+                <w:szCs w:val="22"/>
+              </w:rPr>
+              <w:t xml:space="preserve">Payment &amp; Billing</w:t>
             </w:r>
           </w:p>
         </w:tc>
@@ -7340,7 +6455,81 @@
                 <w:sz w:val="22"/>
                 <w:szCs w:val="22"/>
               </w:rPr>
-              <w:t xml:space="preserve">Planning Poker con regla de discusión obligatoria ante diferencias de 2 o más niveles en la escala Fibonacci</w:t>
+              <w:t xml:space="preserve">Booking &amp; Reservation</w:t>
+            </w:r>
+          </w:p>
+        </w:tc>
+      </w:tr>
+      <w:tr>
+        <w:tc>
+          <w:tcPr>
+            <w:tcW w:type="dxa" w:w="3008"/>
+            <w:tcMar>
+              <w:top w:type="dxa" w:w="80"/>
+              <w:left w:type="dxa" w:w="100"/>
+              <w:bottom w:type="dxa" w:w="80"/>
+              <w:right w:type="dxa" w:w="100"/>
+            </w:tcMar>
+          </w:tcPr>
+          <w:p>
+            <w:pPr>
+              <w:spacing w:line="276"/>
+            </w:pPr>
+            <w:r>
+              <w:rPr>
+                <w:rFonts w:ascii="Times New Roman" w:cs="Times New Roman" w:eastAsia="Times New Roman" w:hAnsi="Times New Roman"/>
+                <w:sz w:val="22"/>
+                <w:szCs w:val="22"/>
+              </w:rPr>
+              <w:t xml:space="preserve">7</w:t>
+            </w:r>
+          </w:p>
+        </w:tc>
+        <w:tc>
+          <w:tcPr>
+            <w:tcW w:type="dxa" w:w="3008"/>
+            <w:tcMar>
+              <w:top w:type="dxa" w:w="80"/>
+              <w:left w:type="dxa" w:w="100"/>
+              <w:bottom w:type="dxa" w:w="80"/>
+              <w:right w:type="dxa" w:w="100"/>
+            </w:tcMar>
+          </w:tcPr>
+          <w:p>
+            <w:pPr>
+              <w:spacing w:line="276"/>
+            </w:pPr>
+            <w:r>
+              <w:rPr>
+                <w:rFonts w:ascii="Times New Roman" w:cs="Times New Roman" w:eastAsia="Times New Roman" w:hAnsi="Times New Roman"/>
+                <w:sz w:val="22"/>
+                <w:szCs w:val="22"/>
+              </w:rPr>
+              <w:t xml:space="preserve">Notification</w:t>
+            </w:r>
+          </w:p>
+        </w:tc>
+        <w:tc>
+          <w:tcPr>
+            <w:tcW w:type="dxa" w:w="3010"/>
+            <w:tcMar>
+              <w:top w:type="dxa" w:w="80"/>
+              <w:left w:type="dxa" w:w="100"/>
+              <w:bottom w:type="dxa" w:w="80"/>
+              <w:right w:type="dxa" w:w="100"/>
+            </w:tcMar>
+          </w:tcPr>
+          <w:p>
+            <w:pPr>
+              <w:spacing w:line="276"/>
+            </w:pPr>
+            <w:r>
+              <w:rPr>
+                <w:rFonts w:ascii="Times New Roman" w:cs="Times New Roman" w:eastAsia="Times New Roman" w:hAnsi="Times New Roman"/>
+                <w:sz w:val="22"/>
+                <w:szCs w:val="22"/>
+              </w:rPr>
+              <w:t xml:space="preserve">Transversal a los eventos de las épicas anteriores</w:t>
             </w:r>
           </w:p>
         </w:tc>
@@ -7353,6 +6542,20 @@
     </w:p>
     <w:p>
       <w:pPr>
+        <w:spacing w:after="200" w:line="480"/>
+        <w:jc w:val="both"/>
+      </w:pPr>
+      <w:r>
+        <w:rPr>
+          <w:rFonts w:ascii="Times New Roman" w:cs="Times New Roman" w:eastAsia="Times New Roman" w:hAnsi="Times New Roman"/>
+          <w:sz w:val="24"/>
+          <w:szCs w:val="24"/>
+        </w:rPr>
+        <w:t xml:space="preserve">Con sprints de una semana y un equipo de 3 personas, cada épica puede distribuirse en uno o más sprints según el número de historias y su estimación en puntos; el calendario exacto por sprint queda sujeto a la Sprint Planning de cada semana, conforme a la metodología descrita en la sección 6.</w:t>
+      </w:r>
+    </w:p>
+    <w:p>
+      <w:pPr>
         <w:spacing w:after="240" w:before="240" w:line="480"/>
         <w:jc w:val="center"/>
       </w:pPr>
@@ -7364,6 +6567,572 @@
           <w:sz w:val="24"/>
           <w:szCs w:val="24"/>
         </w:rPr>
+        <w:t xml:space="preserve">8. Riesgos y mitigación</w:t>
+      </w:r>
+    </w:p>
+    <w:tbl>
+      <w:tblPr>
+        <w:tblW w:type="dxa" w:w="9026"/>
+        <w:tblBorders>
+          <w:top w:val="single" w:color="000000" w:sz="6"/>
+          <w:left w:val="none" w:color="FFFFFF" w:sz="0"/>
+          <w:bottom w:val="single" w:color="000000" w:sz="6"/>
+          <w:right w:val="none" w:color="FFFFFF" w:sz="0"/>
+          <w:insideH w:val="single" w:color="999999" w:sz="2"/>
+          <w:insideV w:val="none" w:color="FFFFFF" w:sz="0"/>
+        </w:tblBorders>
+      </w:tblPr>
+      <w:tblGrid>
+        <w:gridCol w:w="3008"/>
+        <w:gridCol w:w="3008"/>
+        <w:gridCol w:w="3010"/>
+      </w:tblGrid>
+      <w:tr>
+        <w:trPr>
+          <w:tblHeader/>
+        </w:trPr>
+        <w:tc>
+          <w:tcPr>
+            <w:tcW w:type="dxa" w:w="3008"/>
+            <w:tcMar>
+              <w:top w:type="dxa" w:w="80"/>
+              <w:left w:type="dxa" w:w="100"/>
+              <w:bottom w:type="dxa" w:w="80"/>
+              <w:right w:type="dxa" w:w="100"/>
+            </w:tcMar>
+          </w:tcPr>
+          <w:p>
+            <w:pPr>
+              <w:spacing w:line="276"/>
+            </w:pPr>
+            <w:r>
+              <w:rPr>
+                <w:rFonts w:ascii="Times New Roman" w:cs="Times New Roman" w:eastAsia="Times New Roman" w:hAnsi="Times New Roman"/>
+                <w:b/>
+                <w:bCs/>
+                <w:sz w:val="22"/>
+                <w:szCs w:val="22"/>
+              </w:rPr>
+              <w:t xml:space="preserve">Riesgo</w:t>
+            </w:r>
+          </w:p>
+        </w:tc>
+        <w:tc>
+          <w:tcPr>
+            <w:tcW w:type="dxa" w:w="3008"/>
+            <w:tcMar>
+              <w:top w:type="dxa" w:w="80"/>
+              <w:left w:type="dxa" w:w="100"/>
+              <w:bottom w:type="dxa" w:w="80"/>
+              <w:right w:type="dxa" w:w="100"/>
+            </w:tcMar>
+          </w:tcPr>
+          <w:p>
+            <w:pPr>
+              <w:spacing w:line="276"/>
+            </w:pPr>
+            <w:r>
+              <w:rPr>
+                <w:rFonts w:ascii="Times New Roman" w:cs="Times New Roman" w:eastAsia="Times New Roman" w:hAnsi="Times New Roman"/>
+                <w:b/>
+                <w:bCs/>
+                <w:sz w:val="22"/>
+                <w:szCs w:val="22"/>
+              </w:rPr>
+              <w:t xml:space="preserve">Origen</w:t>
+            </w:r>
+          </w:p>
+        </w:tc>
+        <w:tc>
+          <w:tcPr>
+            <w:tcW w:type="dxa" w:w="3010"/>
+            <w:tcMar>
+              <w:top w:type="dxa" w:w="80"/>
+              <w:left w:type="dxa" w:w="100"/>
+              <w:bottom w:type="dxa" w:w="80"/>
+              <w:right w:type="dxa" w:w="100"/>
+            </w:tcMar>
+          </w:tcPr>
+          <w:p>
+            <w:pPr>
+              <w:spacing w:line="276"/>
+            </w:pPr>
+            <w:r>
+              <w:rPr>
+                <w:rFonts w:ascii="Times New Roman" w:cs="Times New Roman" w:eastAsia="Times New Roman" w:hAnsi="Times New Roman"/>
+                <w:b/>
+                <w:bCs/>
+                <w:sz w:val="22"/>
+                <w:szCs w:val="22"/>
+              </w:rPr>
+              <w:t xml:space="preserve">Mitigación propuesta</w:t>
+            </w:r>
+          </w:p>
+        </w:tc>
+      </w:tr>
+      <w:tr>
+        <w:tc>
+          <w:tcPr>
+            <w:tcW w:type="dxa" w:w="3008"/>
+            <w:tcMar>
+              <w:top w:type="dxa" w:w="80"/>
+              <w:left w:type="dxa" w:w="100"/>
+              <w:bottom w:type="dxa" w:w="80"/>
+              <w:right w:type="dxa" w:w="100"/>
+            </w:tcMar>
+          </w:tcPr>
+          <w:p>
+            <w:pPr>
+              <w:spacing w:line="276"/>
+            </w:pPr>
+            <w:r>
+              <w:rPr>
+                <w:rFonts w:ascii="Times New Roman" w:cs="Times New Roman" w:eastAsia="Times New Roman" w:hAnsi="Times New Roman"/>
+                <w:sz w:val="22"/>
+                <w:szCs w:val="22"/>
+              </w:rPr>
+              <w:t xml:space="preserve">Migraciones de esquema descoordinadas entre servicios que comparten la base de datos</w:t>
+            </w:r>
+          </w:p>
+        </w:tc>
+        <w:tc>
+          <w:tcPr>
+            <w:tcW w:type="dxa" w:w="3008"/>
+            <w:tcMar>
+              <w:top w:type="dxa" w:w="80"/>
+              <w:left w:type="dxa" w:w="100"/>
+              <w:bottom w:type="dxa" w:w="80"/>
+              <w:right w:type="dxa" w:w="100"/>
+            </w:tcMar>
+          </w:tcPr>
+          <w:p>
+            <w:pPr>
+              <w:spacing w:line="276"/>
+            </w:pPr>
+            <w:r>
+              <w:rPr>
+                <w:rFonts w:ascii="Times New Roman" w:cs="Times New Roman" w:eastAsia="Times New Roman" w:hAnsi="Times New Roman"/>
+                <w:sz w:val="22"/>
+                <w:szCs w:val="22"/>
+              </w:rPr>
+              <w:t xml:space="preserve">ADR-002, ADR-009</w:t>
+            </w:r>
+          </w:p>
+        </w:tc>
+        <w:tc>
+          <w:tcPr>
+            <w:tcW w:type="dxa" w:w="3010"/>
+            <w:tcMar>
+              <w:top w:type="dxa" w:w="80"/>
+              <w:left w:type="dxa" w:w="100"/>
+              <w:bottom w:type="dxa" w:w="80"/>
+              <w:right w:type="dxa" w:w="100"/>
+            </w:tcMar>
+          </w:tcPr>
+          <w:p>
+            <w:pPr>
+              <w:spacing w:line="276"/>
+            </w:pPr>
+            <w:r>
+              <w:rPr>
+                <w:rFonts w:ascii="Times New Roman" w:cs="Times New Roman" w:eastAsia="Times New Roman" w:hAnsi="Times New Roman"/>
+                <w:sz w:val="22"/>
+                <w:szCs w:val="22"/>
+              </w:rPr>
+              <w:t xml:space="preserve">Orden de ejecución fijo entre repositorios de migración y revisión obligatoria antes de desplegar cambios de esquema</w:t>
+            </w:r>
+          </w:p>
+        </w:tc>
+      </w:tr>
+      <w:tr>
+        <w:tc>
+          <w:tcPr>
+            <w:tcW w:type="dxa" w:w="3008"/>
+            <w:tcMar>
+              <w:top w:type="dxa" w:w="80"/>
+              <w:left w:type="dxa" w:w="100"/>
+              <w:bottom w:type="dxa" w:w="80"/>
+              <w:right w:type="dxa" w:w="100"/>
+            </w:tcMar>
+          </w:tcPr>
+          <w:p>
+            <w:pPr>
+              <w:spacing w:line="276"/>
+            </w:pPr>
+            <w:r>
+              <w:rPr>
+                <w:rFonts w:ascii="Times New Roman" w:cs="Times New Roman" w:eastAsia="Times New Roman" w:hAnsi="Times New Roman"/>
+                <w:sz w:val="22"/>
+                <w:szCs w:val="22"/>
+              </w:rPr>
+              <w:t xml:space="preserve">Referencias residuales a Supabase en el frontend</w:t>
+            </w:r>
+          </w:p>
+        </w:tc>
+        <w:tc>
+          <w:tcPr>
+            <w:tcW w:type="dxa" w:w="3008"/>
+            <w:tcMar>
+              <w:top w:type="dxa" w:w="80"/>
+              <w:left w:type="dxa" w:w="100"/>
+              <w:bottom w:type="dxa" w:w="80"/>
+              <w:right w:type="dxa" w:w="100"/>
+            </w:tcMar>
+          </w:tcPr>
+          <w:p>
+            <w:pPr>
+              <w:spacing w:line="276"/>
+            </w:pPr>
+            <w:r>
+              <w:rPr>
+                <w:rFonts w:ascii="Times New Roman" w:cs="Times New Roman" w:eastAsia="Times New Roman" w:hAnsi="Times New Roman"/>
+                <w:sz w:val="22"/>
+                <w:szCs w:val="22"/>
+              </w:rPr>
+              <w:t xml:space="preserve">ADR-007</w:t>
+            </w:r>
+          </w:p>
+        </w:tc>
+        <w:tc>
+          <w:tcPr>
+            <w:tcW w:type="dxa" w:w="3010"/>
+            <w:tcMar>
+              <w:top w:type="dxa" w:w="80"/>
+              <w:left w:type="dxa" w:w="100"/>
+              <w:bottom w:type="dxa" w:w="80"/>
+              <w:right w:type="dxa" w:w="100"/>
+            </w:tcMar>
+          </w:tcPr>
+          <w:p>
+            <w:pPr>
+              <w:spacing w:line="276"/>
+            </w:pPr>
+            <w:r>
+              <w:rPr>
+                <w:rFonts w:ascii="Times New Roman" w:cs="Times New Roman" w:eastAsia="Times New Roman" w:hAnsi="Times New Roman"/>
+                <w:sz w:val="22"/>
+                <w:szCs w:val="22"/>
+              </w:rPr>
+              <w:t xml:space="preserve">Tratarlas como deuda técnica explícita; no ampliarlas sin actualizar el ADR correspondiente</w:t>
+            </w:r>
+          </w:p>
+        </w:tc>
+      </w:tr>
+      <w:tr>
+        <w:tc>
+          <w:tcPr>
+            <w:tcW w:type="dxa" w:w="3008"/>
+            <w:tcMar>
+              <w:top w:type="dxa" w:w="80"/>
+              <w:left w:type="dxa" w:w="100"/>
+              <w:bottom w:type="dxa" w:w="80"/>
+              <w:right w:type="dxa" w:w="100"/>
+            </w:tcMar>
+          </w:tcPr>
+          <w:p>
+            <w:pPr>
+              <w:spacing w:line="276"/>
+            </w:pPr>
+            <w:r>
+              <w:rPr>
+                <w:rFonts w:ascii="Times New Roman" w:cs="Times New Roman" w:eastAsia="Times New Roman" w:hAnsi="Times New Roman"/>
+                <w:sz w:val="22"/>
+                <w:szCs w:val="22"/>
+              </w:rPr>
+              <w:t xml:space="preserve">Rutas de contratos de alquiler expuestas fuera del alcance del MVP</w:t>
+            </w:r>
+          </w:p>
+        </w:tc>
+        <w:tc>
+          <w:tcPr>
+            <w:tcW w:type="dxa" w:w="3008"/>
+            <w:tcMar>
+              <w:top w:type="dxa" w:w="80"/>
+              <w:left w:type="dxa" w:w="100"/>
+              <w:bottom w:type="dxa" w:w="80"/>
+              <w:right w:type="dxa" w:w="100"/>
+            </w:tcMar>
+          </w:tcPr>
+          <w:p>
+            <w:pPr>
+              <w:spacing w:line="276"/>
+            </w:pPr>
+            <w:r>
+              <w:rPr>
+                <w:rFonts w:ascii="Times New Roman" w:cs="Times New Roman" w:eastAsia="Times New Roman" w:hAnsi="Times New Roman"/>
+                <w:sz w:val="22"/>
+                <w:szCs w:val="22"/>
+              </w:rPr>
+              <w:t xml:space="preserve">ADR-008</w:t>
+            </w:r>
+          </w:p>
+        </w:tc>
+        <w:tc>
+          <w:tcPr>
+            <w:tcW w:type="dxa" w:w="3010"/>
+            <w:tcMar>
+              <w:top w:type="dxa" w:w="80"/>
+              <w:left w:type="dxa" w:w="100"/>
+              <w:bottom w:type="dxa" w:w="80"/>
+              <w:right w:type="dxa" w:w="100"/>
+            </w:tcMar>
+          </w:tcPr>
+          <w:p>
+            <w:pPr>
+              <w:spacing w:line="276"/>
+            </w:pPr>
+            <w:r>
+              <w:rPr>
+                <w:rFonts w:ascii="Times New Roman" w:cs="Times New Roman" w:eastAsia="Times New Roman" w:hAnsi="Times New Roman"/>
+                <w:sz w:val="22"/>
+                <w:szCs w:val="22"/>
+              </w:rPr>
+              <w:t xml:space="preserve">Ocultar o remover la navegación activa hacia esas rutas hasta que exista un cambio de alcance aprobado</w:t>
+            </w:r>
+          </w:p>
+        </w:tc>
+      </w:tr>
+      <w:tr>
+        <w:tc>
+          <w:tcPr>
+            <w:tcW w:type="dxa" w:w="3008"/>
+            <w:tcMar>
+              <w:top w:type="dxa" w:w="80"/>
+              <w:left w:type="dxa" w:w="100"/>
+              <w:bottom w:type="dxa" w:w="80"/>
+              <w:right w:type="dxa" w:w="100"/>
+            </w:tcMar>
+          </w:tcPr>
+          <w:p>
+            <w:pPr>
+              <w:spacing w:line="276"/>
+            </w:pPr>
+            <w:r>
+              <w:rPr>
+                <w:rFonts w:ascii="Times New Roman" w:cs="Times New Roman" w:eastAsia="Times New Roman" w:hAnsi="Times New Roman"/>
+                <w:sz w:val="22"/>
+                <w:szCs w:val="22"/>
+              </w:rPr>
+              <w:t xml:space="preserve">Convenciones de carpetas inconsistentes en el frontend web (mayúsculas/minúsculas)</w:t>
+            </w:r>
+          </w:p>
+        </w:tc>
+        <w:tc>
+          <w:tcPr>
+            <w:tcW w:type="dxa" w:w="3008"/>
+            <w:tcMar>
+              <w:top w:type="dxa" w:w="80"/>
+              <w:left w:type="dxa" w:w="100"/>
+              <w:bottom w:type="dxa" w:w="80"/>
+              <w:right w:type="dxa" w:w="100"/>
+            </w:tcMar>
+          </w:tcPr>
+          <w:p>
+            <w:pPr>
+              <w:spacing w:line="276"/>
+            </w:pPr>
+            <w:r>
+              <w:rPr>
+                <w:rFonts w:ascii="Times New Roman" w:cs="Times New Roman" w:eastAsia="Times New Roman" w:hAnsi="Times New Roman"/>
+                <w:sz w:val="22"/>
+                <w:szCs w:val="22"/>
+              </w:rPr>
+              <w:t xml:space="preserve">ADR-006</w:t>
+            </w:r>
+          </w:p>
+        </w:tc>
+        <w:tc>
+          <w:tcPr>
+            <w:tcW w:type="dxa" w:w="3010"/>
+            <w:tcMar>
+              <w:top w:type="dxa" w:w="80"/>
+              <w:left w:type="dxa" w:w="100"/>
+              <w:bottom w:type="dxa" w:w="80"/>
+              <w:right w:type="dxa" w:w="100"/>
+            </w:tcMar>
+          </w:tcPr>
+          <w:p>
+            <w:pPr>
+              <w:spacing w:line="276"/>
+            </w:pPr>
+            <w:r>
+              <w:rPr>
+                <w:rFonts w:ascii="Times New Roman" w:cs="Times New Roman" w:eastAsia="Times New Roman" w:hAnsi="Times New Roman"/>
+                <w:sz w:val="22"/>
+                <w:szCs w:val="22"/>
+              </w:rPr>
+              <w:t xml:space="preserve">Exigir la convención estandarizada en código nuevo; migración incremental del código existente</w:t>
+            </w:r>
+          </w:p>
+        </w:tc>
+      </w:tr>
+      <w:tr>
+        <w:tc>
+          <w:tcPr>
+            <w:tcW w:type="dxa" w:w="3008"/>
+            <w:tcMar>
+              <w:top w:type="dxa" w:w="80"/>
+              <w:left w:type="dxa" w:w="100"/>
+              <w:bottom w:type="dxa" w:w="80"/>
+              <w:right w:type="dxa" w:w="100"/>
+            </w:tcMar>
+          </w:tcPr>
+          <w:p>
+            <w:pPr>
+              <w:spacing w:line="276"/>
+            </w:pPr>
+            <w:r>
+              <w:rPr>
+                <w:rFonts w:ascii="Times New Roman" w:cs="Times New Roman" w:eastAsia="Times New Roman" w:hAnsi="Times New Roman"/>
+                <w:sz w:val="22"/>
+                <w:szCs w:val="22"/>
+              </w:rPr>
+              <w:t xml:space="preserve">Backlog con cronograma de sprints sin asignar</w:t>
+            </w:r>
+          </w:p>
+        </w:tc>
+        <w:tc>
+          <w:tcPr>
+            <w:tcW w:type="dxa" w:w="3008"/>
+            <w:tcMar>
+              <w:top w:type="dxa" w:w="80"/>
+              <w:left w:type="dxa" w:w="100"/>
+              <w:bottom w:type="dxa" w:w="80"/>
+              <w:right w:type="dxa" w:w="100"/>
+            </w:tcMar>
+          </w:tcPr>
+          <w:p>
+            <w:pPr>
+              <w:spacing w:line="276"/>
+            </w:pPr>
+            <w:r>
+              <w:rPr>
+                <w:rFonts w:ascii="Times New Roman" w:cs="Times New Roman" w:eastAsia="Times New Roman" w:hAnsi="Times New Roman"/>
+                <w:sz w:val="22"/>
+                <w:szCs w:val="22"/>
+              </w:rPr>
+              <w:t xml:space="preserve">04-requirements/user-stories.md</w:t>
+            </w:r>
+          </w:p>
+        </w:tc>
+        <w:tc>
+          <w:tcPr>
+            <w:tcW w:type="dxa" w:w="3010"/>
+            <w:tcMar>
+              <w:top w:type="dxa" w:w="80"/>
+              <w:left w:type="dxa" w:w="100"/>
+              <w:bottom w:type="dxa" w:w="80"/>
+              <w:right w:type="dxa" w:w="100"/>
+            </w:tcMar>
+          </w:tcPr>
+          <w:p>
+            <w:pPr>
+              <w:spacing w:line="276"/>
+            </w:pPr>
+            <w:r>
+              <w:rPr>
+                <w:rFonts w:ascii="Times New Roman" w:cs="Times New Roman" w:eastAsia="Times New Roman" w:hAnsi="Times New Roman"/>
+                <w:sz w:val="22"/>
+                <w:szCs w:val="22"/>
+              </w:rPr>
+              <w:t xml:space="preserve">Priorizar la asignación de sprints siguiendo el orden de dependencia propuesto en la sección 7</w:t>
+            </w:r>
+          </w:p>
+        </w:tc>
+      </w:tr>
+      <w:tr>
+        <w:tc>
+          <w:tcPr>
+            <w:tcW w:type="dxa" w:w="3008"/>
+            <w:tcMar>
+              <w:top w:type="dxa" w:w="80"/>
+              <w:left w:type="dxa" w:w="100"/>
+              <w:bottom w:type="dxa" w:w="80"/>
+              <w:right w:type="dxa" w:w="100"/>
+            </w:tcMar>
+          </w:tcPr>
+          <w:p>
+            <w:pPr>
+              <w:spacing w:line="276"/>
+            </w:pPr>
+            <w:r>
+              <w:rPr>
+                <w:rFonts w:ascii="Times New Roman" w:cs="Times New Roman" w:eastAsia="Times New Roman" w:hAnsi="Times New Roman"/>
+                <w:sz w:val="22"/>
+                <w:szCs w:val="22"/>
+              </w:rPr>
+              <w:t xml:space="preserve">Desacuerdo de estimación entre integrantes del equipo</w:t>
+            </w:r>
+          </w:p>
+        </w:tc>
+        <w:tc>
+          <w:tcPr>
+            <w:tcW w:type="dxa" w:w="3008"/>
+            <w:tcMar>
+              <w:top w:type="dxa" w:w="80"/>
+              <w:left w:type="dxa" w:w="100"/>
+              <w:bottom w:type="dxa" w:w="80"/>
+              <w:right w:type="dxa" w:w="100"/>
+            </w:tcMar>
+          </w:tcPr>
+          <w:p>
+            <w:pPr>
+              <w:spacing w:line="276"/>
+            </w:pPr>
+            <w:r>
+              <w:rPr>
+                <w:rFonts w:ascii="Times New Roman" w:cs="Times New Roman" w:eastAsia="Times New Roman" w:hAnsi="Times New Roman"/>
+                <w:sz w:val="22"/>
+                <w:szCs w:val="22"/>
+              </w:rPr>
+              <w:t xml:space="preserve">00-governance/agile-conventions.md</w:t>
+            </w:r>
+          </w:p>
+        </w:tc>
+        <w:tc>
+          <w:tcPr>
+            <w:tcW w:type="dxa" w:w="3010"/>
+            <w:tcMar>
+              <w:top w:type="dxa" w:w="80"/>
+              <w:left w:type="dxa" w:w="100"/>
+              <w:bottom w:type="dxa" w:w="80"/>
+              <w:right w:type="dxa" w:w="100"/>
+            </w:tcMar>
+          </w:tcPr>
+          <w:p>
+            <w:pPr>
+              <w:spacing w:line="276"/>
+            </w:pPr>
+            <w:r>
+              <w:rPr>
+                <w:rFonts w:ascii="Times New Roman" w:cs="Times New Roman" w:eastAsia="Times New Roman" w:hAnsi="Times New Roman"/>
+                <w:sz w:val="22"/>
+                <w:szCs w:val="22"/>
+              </w:rPr>
+              <w:t xml:space="preserve">Planning Poker con regla de discusión obligatoria ante diferencias de 2 o más niveles en la escala Fibonacci</w:t>
+            </w:r>
+          </w:p>
+        </w:tc>
+      </w:tr>
+    </w:tbl>
+    <w:p>
+      <w:pPr>
+        <w:spacing w:after="160"/>
+      </w:pPr>
+    </w:p>
+    <w:p>
+      <w:pPr>
+        <w:spacing w:after="240" w:before="240" w:line="480"/>
+        <w:jc w:val="center"/>
+      </w:pPr>
+      <w:r>
+        <w:rPr>
+          <w:rFonts w:ascii="Times New Roman" w:cs="Times New Roman" w:eastAsia="Times New Roman" w:hAnsi="Times New Roman"/>
+          <w:b/>
+          <w:bCs/>
+          <w:sz w:val="24"/>
+          <w:szCs w:val="24"/>
+        </w:rPr>
         <w:t xml:space="preserve">9. Conclusiones</w:t>
       </w:r>
     </w:p>
@@ -7378,7 +7147,7 @@
           <w:sz w:val="24"/>
           <w:szCs w:val="24"/>
         </w:rPr>
-        <w:t xml:space="preserve">La solución técnica propuesta para RentaMovil está respaldada por nueve decisiones arquitectónicas ya registradas y evaluadas contra alternativas concretas, con una pila tecnológica de uso extendido en la industria y viable para un equipo de tres integrantes dentro del programa de formación. La principal tarea pendiente antes de iniciar la ejecución formal es sincronizar el estado del backlog y asignar sprints concretos a las 32 historias de usuario ya refinadas, siguiendo el orden de dependencia entre épicas propuesto en este documento.</w:t>
+        <w:t xml:space="preserve">La solución técnica propuesta para RentaMovil está respaldada por nueve decisiones arquitectónicas ya registradas y evaluadas contra alternativas concretas, con una pila tecnológica de uso extendido en la industria y viable para un equipo de tres integrantes dentro del programa de formación. Las 31 historias de usuario del backlog ya están refinadas; la ejecución de sprints sigue el orden de dependencia entre épicas propuesto en este documento.</w:t>
       </w:r>
     </w:p>
     <w:p>

</xml_diff>

<commit_message>
docs: add Required Resources section to technical proposal
Human, software, and hardware resources — was in the original outline
but missing from the built document.
</commit_message>
<xml_diff>
--- a/03-documentacion-propuesta-tecnica/Documentacion_Propuesta_Tecnica_RentaMovil_APA_Espanol.docx
+++ b/03-documentacion-propuesta-tecnica/Documentacion_Propuesta_Tecnica_RentaMovil_APA_Espanol.docx
@@ -5867,7 +5867,23 @@
           <w:sz w:val="24"/>
           <w:szCs w:val="24"/>
         </w:rPr>
-        <w:t xml:space="preserve">7. Estado actual y cronograma propuesto</w:t>
+        <w:t xml:space="preserve">7. Recursos necesarios</w:t>
+      </w:r>
+    </w:p>
+    <w:p>
+      <w:pPr>
+        <w:spacing w:after="160" w:before="200" w:line="480"/>
+        <w:jc w:val="left"/>
+      </w:pPr>
+      <w:r>
+        <w:rPr>
+          <w:rFonts w:ascii="Times New Roman" w:cs="Times New Roman" w:eastAsia="Times New Roman" w:hAnsi="Times New Roman"/>
+          <w:b/>
+          <w:bCs/>
+          <w:sz w:val="24"/>
+          <w:szCs w:val="24"/>
+        </w:rPr>
+        <w:t xml:space="preserve">7.1 Recursos humanos</w:t>
       </w:r>
     </w:p>
     <w:p>
@@ -5881,39 +5897,7 @@
           <w:sz w:val="24"/>
           <w:szCs w:val="24"/>
         </w:rPr>
-        <w:t xml:space="preserve">El backlog del proyecto, documentado en </w:t>
-      </w:r>
-      <w:r>
-        <w:rPr>
-          <w:rFonts w:ascii="Times New Roman" w:cs="Times New Roman" w:eastAsia="Times New Roman" w:hAnsi="Times New Roman"/>
-          <w:i/>
-          <w:iCs/>
-          <w:sz w:val="24"/>
-          <w:szCs w:val="24"/>
-        </w:rPr>
-        <w:t xml:space="preserve">04-requirements/user-stories.md</w:t>
-      </w:r>
-      <w:r>
-        <w:rPr>
-          <w:rFonts w:ascii="Times New Roman" w:cs="Times New Roman" w:eastAsia="Times New Roman" w:hAnsi="Times New Roman"/>
-          <w:sz w:val="24"/>
-          <w:szCs w:val="24"/>
-        </w:rPr>
-        <w:t xml:space="preserve">, está organizado en 7 épicas (una por Bounded Context) con 31 historias de usuario en total, estimadas entre 2 y 5 puntos cada una.</w:t>
-      </w:r>
-    </w:p>
-    <w:p>
-      <w:pPr>
-        <w:spacing w:after="200" w:line="480"/>
-        <w:jc w:val="both"/>
-      </w:pPr>
-      <w:r>
-        <w:rPr>
-          <w:rFonts w:ascii="Times New Roman" w:cs="Times New Roman" w:eastAsia="Times New Roman" w:hAnsi="Times New Roman"/>
-          <w:sz w:val="24"/>
-          <w:szCs w:val="24"/>
-        </w:rPr>
-        <w:t xml:space="preserve">Esta propuesta sugiere ejecutar las épicas siguiendo el mismo orden de dependencia que ya rige las migraciones de base de datos entre servicios (sección 2.8), de modo que ningún servicio dependa de tablas o contratos que todavía no existen:</w:t>
+        <w:t xml:space="preserve">El equipo está compuesto por 3 integrantes, con los roles ya definidos en la especificación de requisitos del proyecto:</w:t>
       </w:r>
     </w:p>
     <w:tbl>
@@ -5959,7 +5943,7 @@
                 <w:sz w:val="22"/>
                 <w:szCs w:val="22"/>
               </w:rPr>
-              <w:t xml:space="preserve">Orden</w:t>
+              <w:t xml:space="preserve">Integrante</w:t>
             </w:r>
           </w:p>
         </w:tc>
@@ -5985,7 +5969,7 @@
                 <w:sz w:val="22"/>
                 <w:szCs w:val="22"/>
               </w:rPr>
-              <w:t xml:space="preserve">Épica (Bounded Context)</w:t>
+              <w:t xml:space="preserve">Rol</w:t>
             </w:r>
           </w:p>
         </w:tc>
@@ -6011,7 +5995,7 @@
                 <w:sz w:val="22"/>
                 <w:szCs w:val="22"/>
               </w:rPr>
-              <w:t xml:space="preserve">Dependencia</w:t>
+              <w:t xml:space="preserve">Responsabilidad</w:t>
             </w:r>
           </w:p>
         </w:tc>
@@ -6037,31 +6021,31 @@
                 <w:sz w:val="22"/>
                 <w:szCs w:val="22"/>
               </w:rPr>
-              <w:t xml:space="preserve">1</w:t>
-            </w:r>
-          </w:p>
-        </w:tc>
-        <w:tc>
-          <w:tcPr>
-            <w:tcW w:type="dxa" w:w="3008"/>
-            <w:tcMar>
-              <w:top w:type="dxa" w:w="80"/>
-              <w:left w:type="dxa" w:w="100"/>
-              <w:bottom w:type="dxa" w:w="80"/>
-              <w:right w:type="dxa" w:w="100"/>
-            </w:tcMar>
-          </w:tcPr>
-          <w:p>
-            <w:pPr>
-              <w:spacing w:line="276"/>
-            </w:pPr>
-            <w:r>
-              <w:rPr>
-                <w:rFonts w:ascii="Times New Roman" w:cs="Times New Roman" w:eastAsia="Times New Roman" w:hAnsi="Times New Roman"/>
-                <w:sz w:val="22"/>
-                <w:szCs w:val="22"/>
-              </w:rPr>
-              <w:t xml:space="preserve">Identity &amp; Access</w:t>
+              <w:t xml:space="preserve">Nicole Dayana Ramírez Vargas</w:t>
+            </w:r>
+          </w:p>
+        </w:tc>
+        <w:tc>
+          <w:tcPr>
+            <w:tcW w:type="dxa" w:w="3008"/>
+            <w:tcMar>
+              <w:top w:type="dxa" w:w="80"/>
+              <w:left w:type="dxa" w:w="100"/>
+              <w:bottom w:type="dxa" w:w="80"/>
+              <w:right w:type="dxa" w:w="100"/>
+            </w:tcMar>
+          </w:tcPr>
+          <w:p>
+            <w:pPr>
+              <w:spacing w:line="276"/>
+            </w:pPr>
+            <w:r>
+              <w:rPr>
+                <w:rFonts w:ascii="Times New Roman" w:cs="Times New Roman" w:eastAsia="Times New Roman" w:hAnsi="Times New Roman"/>
+                <w:sz w:val="22"/>
+                <w:szCs w:val="22"/>
+              </w:rPr>
+              <w:t xml:space="preserve">Líder</w:t>
             </w:r>
           </w:p>
         </w:tc>
@@ -6085,7 +6069,7 @@
                 <w:sz w:val="22"/>
                 <w:szCs w:val="22"/>
               </w:rPr>
-              <w:t xml:space="preserve">Ninguna — autenticación requerida por el resto</w:t>
+              <w:t xml:space="preserve">Liderar, planificar y supervisar la entrega del proyecto</w:t>
             </w:r>
           </w:p>
         </w:tc>
@@ -6111,31 +6095,31 @@
                 <w:sz w:val="22"/>
                 <w:szCs w:val="22"/>
               </w:rPr>
-              <w:t xml:space="preserve">2</w:t>
-            </w:r>
-          </w:p>
-        </w:tc>
-        <w:tc>
-          <w:tcPr>
-            <w:tcW w:type="dxa" w:w="3008"/>
-            <w:tcMar>
-              <w:top w:type="dxa" w:w="80"/>
-              <w:left w:type="dxa" w:w="100"/>
-              <w:bottom w:type="dxa" w:w="80"/>
-              <w:right w:type="dxa" w:w="100"/>
-            </w:tcMar>
-          </w:tcPr>
-          <w:p>
-            <w:pPr>
-              <w:spacing w:line="276"/>
-            </w:pPr>
-            <w:r>
-              <w:rPr>
-                <w:rFonts w:ascii="Times New Roman" w:cs="Times New Roman" w:eastAsia="Times New Roman" w:hAnsi="Times New Roman"/>
-                <w:sz w:val="22"/>
-                <w:szCs w:val="22"/>
-              </w:rPr>
-              <w:t xml:space="preserve">Fleet &amp; Maintenance</w:t>
+              <w:t xml:space="preserve">David Santiago Erez Rodríguez</w:t>
+            </w:r>
+          </w:p>
+        </w:tc>
+        <w:tc>
+          <w:tcPr>
+            <w:tcW w:type="dxa" w:w="3008"/>
+            <w:tcMar>
+              <w:top w:type="dxa" w:w="80"/>
+              <w:left w:type="dxa" w:w="100"/>
+              <w:bottom w:type="dxa" w:w="80"/>
+              <w:right w:type="dxa" w:w="100"/>
+            </w:tcMar>
+          </w:tcPr>
+          <w:p>
+            <w:pPr>
+              <w:spacing w:line="276"/>
+            </w:pPr>
+            <w:r>
+              <w:rPr>
+                <w:rFonts w:ascii="Times New Roman" w:cs="Times New Roman" w:eastAsia="Times New Roman" w:hAnsi="Times New Roman"/>
+                <w:sz w:val="22"/>
+                <w:szCs w:val="22"/>
+              </w:rPr>
+              <w:t xml:space="preserve">Desarrollador</w:t>
             </w:r>
           </w:p>
         </w:tc>
@@ -6159,7 +6143,7 @@
                 <w:sz w:val="22"/>
                 <w:szCs w:val="22"/>
               </w:rPr>
-              <w:t xml:space="preserve">Identity &amp; Access (roles y permisos)</w:t>
+              <w:t xml:space="preserve">Programar el aplicativo web</w:t>
             </w:r>
           </w:p>
         </w:tc>
@@ -6185,31 +6169,31 @@
                 <w:sz w:val="22"/>
                 <w:szCs w:val="22"/>
               </w:rPr>
-              <w:t xml:space="preserve">3</w:t>
-            </w:r>
-          </w:p>
-        </w:tc>
-        <w:tc>
-          <w:tcPr>
-            <w:tcW w:type="dxa" w:w="3008"/>
-            <w:tcMar>
-              <w:top w:type="dxa" w:w="80"/>
-              <w:left w:type="dxa" w:w="100"/>
-              <w:bottom w:type="dxa" w:w="80"/>
-              <w:right w:type="dxa" w:w="100"/>
-            </w:tcMar>
-          </w:tcPr>
-          <w:p>
-            <w:pPr>
-              <w:spacing w:line="276"/>
-            </w:pPr>
-            <w:r>
-              <w:rPr>
-                <w:rFonts w:ascii="Times New Roman" w:cs="Times New Roman" w:eastAsia="Times New Roman" w:hAnsi="Times New Roman"/>
-                <w:sz w:val="22"/>
-                <w:szCs w:val="22"/>
-              </w:rPr>
-              <w:t xml:space="preserve">Telemetry &amp; GPS</w:t>
+              <w:t xml:space="preserve">Thiago Fabian Rojas Guevara</w:t>
+            </w:r>
+          </w:p>
+        </w:tc>
+        <w:tc>
+          <w:tcPr>
+            <w:tcW w:type="dxa" w:w="3008"/>
+            <w:tcMar>
+              <w:top w:type="dxa" w:w="80"/>
+              <w:left w:type="dxa" w:w="100"/>
+              <w:bottom w:type="dxa" w:w="80"/>
+              <w:right w:type="dxa" w:w="100"/>
+            </w:tcMar>
+          </w:tcPr>
+          <w:p>
+            <w:pPr>
+              <w:spacing w:line="276"/>
+            </w:pPr>
+            <w:r>
+              <w:rPr>
+                <w:rFonts w:ascii="Times New Roman" w:cs="Times New Roman" w:eastAsia="Times New Roman" w:hAnsi="Times New Roman"/>
+                <w:sz w:val="22"/>
+                <w:szCs w:val="22"/>
+              </w:rPr>
+              <w:t xml:space="preserve">Analista</w:t>
             </w:r>
           </w:p>
         </w:tc>
@@ -6233,7 +6217,116 @@
                 <w:sz w:val="22"/>
                 <w:szCs w:val="22"/>
               </w:rPr>
-              <w:t xml:space="preserve">Fleet &amp; Maintenance (vehículos a rastrear)</w:t>
+              <w:t xml:space="preserve">Análisis de información, diseño y programación</w:t>
+            </w:r>
+          </w:p>
+        </w:tc>
+      </w:tr>
+    </w:tbl>
+    <w:p>
+      <w:pPr>
+        <w:spacing w:after="160"/>
+      </w:pPr>
+    </w:p>
+    <w:p>
+      <w:pPr>
+        <w:spacing w:after="200" w:line="480"/>
+        <w:jc w:val="both"/>
+      </w:pPr>
+      <w:r>
+        <w:rPr>
+          <w:rFonts w:ascii="Times New Roman" w:cs="Times New Roman" w:eastAsia="Times New Roman" w:hAnsi="Times New Roman"/>
+          <w:sz w:val="24"/>
+          <w:szCs w:val="24"/>
+        </w:rPr>
+        <w:t xml:space="preserve">(RentaMovil, 2026, Documento 1 — Especificación de Requisitos de Software, sección 1.7)</w:t>
+      </w:r>
+    </w:p>
+    <w:p>
+      <w:pPr>
+        <w:spacing w:after="160" w:before="200" w:line="480"/>
+        <w:jc w:val="left"/>
+      </w:pPr>
+      <w:r>
+        <w:rPr>
+          <w:rFonts w:ascii="Times New Roman" w:cs="Times New Roman" w:eastAsia="Times New Roman" w:hAnsi="Times New Roman"/>
+          <w:b/>
+          <w:bCs/>
+          <w:sz w:val="24"/>
+          <w:szCs w:val="24"/>
+        </w:rPr>
+        <w:t xml:space="preserve">7.2 Recursos de software</w:t>
+      </w:r>
+    </w:p>
+    <w:tbl>
+      <w:tblPr>
+        <w:tblW w:type="dxa" w:w="9026"/>
+        <w:tblBorders>
+          <w:top w:val="single" w:color="000000" w:sz="6"/>
+          <w:left w:val="none" w:color="FFFFFF" w:sz="0"/>
+          <w:bottom w:val="single" w:color="000000" w:sz="6"/>
+          <w:right w:val="none" w:color="FFFFFF" w:sz="0"/>
+          <w:insideH w:val="single" w:color="999999" w:sz="2"/>
+          <w:insideV w:val="none" w:color="FFFFFF" w:sz="0"/>
+        </w:tblBorders>
+      </w:tblPr>
+      <w:tblGrid>
+        <w:gridCol w:w="4513"/>
+        <w:gridCol w:w="4513"/>
+      </w:tblGrid>
+      <w:tr>
+        <w:trPr>
+          <w:tblHeader/>
+        </w:trPr>
+        <w:tc>
+          <w:tcPr>
+            <w:tcW w:type="dxa" w:w="4513"/>
+            <w:tcMar>
+              <w:top w:type="dxa" w:w="80"/>
+              <w:left w:type="dxa" w:w="100"/>
+              <w:bottom w:type="dxa" w:w="80"/>
+              <w:right w:type="dxa" w:w="100"/>
+            </w:tcMar>
+          </w:tcPr>
+          <w:p>
+            <w:pPr>
+              <w:spacing w:line="276"/>
+            </w:pPr>
+            <w:r>
+              <w:rPr>
+                <w:rFonts w:ascii="Times New Roman" w:cs="Times New Roman" w:eastAsia="Times New Roman" w:hAnsi="Times New Roman"/>
+                <w:b/>
+                <w:bCs/>
+                <w:sz w:val="22"/>
+                <w:szCs w:val="22"/>
+              </w:rPr>
+              <w:t xml:space="preserve">Categoría</w:t>
+            </w:r>
+          </w:p>
+        </w:tc>
+        <w:tc>
+          <w:tcPr>
+            <w:tcW w:type="dxa" w:w="4513"/>
+            <w:tcMar>
+              <w:top w:type="dxa" w:w="80"/>
+              <w:left w:type="dxa" w:w="100"/>
+              <w:bottom w:type="dxa" w:w="80"/>
+              <w:right w:type="dxa" w:w="100"/>
+            </w:tcMar>
+          </w:tcPr>
+          <w:p>
+            <w:pPr>
+              <w:spacing w:line="276"/>
+            </w:pPr>
+            <w:r>
+              <w:rPr>
+                <w:rFonts w:ascii="Times New Roman" w:cs="Times New Roman" w:eastAsia="Times New Roman" w:hAnsi="Times New Roman"/>
+                <w:b/>
+                <w:bCs/>
+                <w:sz w:val="22"/>
+                <w:szCs w:val="22"/>
+              </w:rPr>
+              <w:t xml:space="preserve">Herramientas</w:t>
             </w:r>
           </w:p>
         </w:tc>
@@ -6241,73 +6334,49 @@
       <w:tr>
         <w:tc>
           <w:tcPr>
-            <w:tcW w:type="dxa" w:w="3008"/>
-            <w:tcMar>
-              <w:top w:type="dxa" w:w="80"/>
-              <w:left w:type="dxa" w:w="100"/>
-              <w:bottom w:type="dxa" w:w="80"/>
-              <w:right w:type="dxa" w:w="100"/>
-            </w:tcMar>
-          </w:tcPr>
-          <w:p>
-            <w:pPr>
-              <w:spacing w:line="276"/>
-            </w:pPr>
-            <w:r>
-              <w:rPr>
-                <w:rFonts w:ascii="Times New Roman" w:cs="Times New Roman" w:eastAsia="Times New Roman" w:hAnsi="Times New Roman"/>
-                <w:sz w:val="22"/>
-                <w:szCs w:val="22"/>
-              </w:rPr>
-              <w:t xml:space="preserve">4</w:t>
-            </w:r>
-          </w:p>
-        </w:tc>
-        <w:tc>
-          <w:tcPr>
-            <w:tcW w:type="dxa" w:w="3008"/>
-            <w:tcMar>
-              <w:top w:type="dxa" w:w="80"/>
-              <w:left w:type="dxa" w:w="100"/>
-              <w:bottom w:type="dxa" w:w="80"/>
-              <w:right w:type="dxa" w:w="100"/>
-            </w:tcMar>
-          </w:tcPr>
-          <w:p>
-            <w:pPr>
-              <w:spacing w:line="276"/>
-            </w:pPr>
-            <w:r>
-              <w:rPr>
-                <w:rFonts w:ascii="Times New Roman" w:cs="Times New Roman" w:eastAsia="Times New Roman" w:hAnsi="Times New Roman"/>
-                <w:sz w:val="22"/>
-                <w:szCs w:val="22"/>
-              </w:rPr>
-              <w:t xml:space="preserve">Booking &amp; Reservation</w:t>
-            </w:r>
-          </w:p>
-        </w:tc>
-        <w:tc>
-          <w:tcPr>
-            <w:tcW w:type="dxa" w:w="3010"/>
-            <w:tcMar>
-              <w:top w:type="dxa" w:w="80"/>
-              <w:left w:type="dxa" w:w="100"/>
-              <w:bottom w:type="dxa" w:w="80"/>
-              <w:right w:type="dxa" w:w="100"/>
-            </w:tcMar>
-          </w:tcPr>
-          <w:p>
-            <w:pPr>
-              <w:spacing w:line="276"/>
-            </w:pPr>
-            <w:r>
-              <w:rPr>
-                <w:rFonts w:ascii="Times New Roman" w:cs="Times New Roman" w:eastAsia="Times New Roman" w:hAnsi="Times New Roman"/>
-                <w:sz w:val="22"/>
-                <w:szCs w:val="22"/>
-              </w:rPr>
-              <w:t xml:space="preserve">Identity &amp; Access, Fleet &amp; Maintenance</w:t>
+            <w:tcW w:type="dxa" w:w="4513"/>
+            <w:tcMar>
+              <w:top w:type="dxa" w:w="80"/>
+              <w:left w:type="dxa" w:w="100"/>
+              <w:bottom w:type="dxa" w:w="80"/>
+              <w:right w:type="dxa" w:w="100"/>
+            </w:tcMar>
+          </w:tcPr>
+          <w:p>
+            <w:pPr>
+              <w:spacing w:line="276"/>
+            </w:pPr>
+            <w:r>
+              <w:rPr>
+                <w:rFonts w:ascii="Times New Roman" w:cs="Times New Roman" w:eastAsia="Times New Roman" w:hAnsi="Times New Roman"/>
+                <w:sz w:val="22"/>
+                <w:szCs w:val="22"/>
+              </w:rPr>
+              <w:t xml:space="preserve">Backend</w:t>
+            </w:r>
+          </w:p>
+        </w:tc>
+        <w:tc>
+          <w:tcPr>
+            <w:tcW w:type="dxa" w:w="4513"/>
+            <w:tcMar>
+              <w:top w:type="dxa" w:w="80"/>
+              <w:left w:type="dxa" w:w="100"/>
+              <w:bottom w:type="dxa" w:w="80"/>
+              <w:right w:type="dxa" w:w="100"/>
+            </w:tcMar>
+          </w:tcPr>
+          <w:p>
+            <w:pPr>
+              <w:spacing w:line="276"/>
+            </w:pPr>
+            <w:r>
+              <w:rPr>
+                <w:rFonts w:ascii="Times New Roman" w:cs="Times New Roman" w:eastAsia="Times New Roman" w:hAnsi="Times New Roman"/>
+                <w:sz w:val="22"/>
+                <w:szCs w:val="22"/>
+              </w:rPr>
+              <w:t xml:space="preserve">Java (JDK), Spring Boot, Maven/Gradle</w:t>
             </w:r>
           </w:p>
         </w:tc>
@@ -6315,73 +6384,49 @@
       <w:tr>
         <w:tc>
           <w:tcPr>
-            <w:tcW w:type="dxa" w:w="3008"/>
-            <w:tcMar>
-              <w:top w:type="dxa" w:w="80"/>
-              <w:left w:type="dxa" w:w="100"/>
-              <w:bottom w:type="dxa" w:w="80"/>
-              <w:right w:type="dxa" w:w="100"/>
-            </w:tcMar>
-          </w:tcPr>
-          <w:p>
-            <w:pPr>
-              <w:spacing w:line="276"/>
-            </w:pPr>
-            <w:r>
-              <w:rPr>
-                <w:rFonts w:ascii="Times New Roman" w:cs="Times New Roman" w:eastAsia="Times New Roman" w:hAnsi="Times New Roman"/>
-                <w:sz w:val="22"/>
-                <w:szCs w:val="22"/>
-              </w:rPr>
-              <w:t xml:space="preserve">5</w:t>
-            </w:r>
-          </w:p>
-        </w:tc>
-        <w:tc>
-          <w:tcPr>
-            <w:tcW w:type="dxa" w:w="3008"/>
-            <w:tcMar>
-              <w:top w:type="dxa" w:w="80"/>
-              <w:left w:type="dxa" w:w="100"/>
-              <w:bottom w:type="dxa" w:w="80"/>
-              <w:right w:type="dxa" w:w="100"/>
-            </w:tcMar>
-          </w:tcPr>
-          <w:p>
-            <w:pPr>
-              <w:spacing w:line="276"/>
-            </w:pPr>
-            <w:r>
-              <w:rPr>
-                <w:rFonts w:ascii="Times New Roman" w:cs="Times New Roman" w:eastAsia="Times New Roman" w:hAnsi="Times New Roman"/>
-                <w:sz w:val="22"/>
-                <w:szCs w:val="22"/>
-              </w:rPr>
-              <w:t xml:space="preserve">Rental Execution</w:t>
-            </w:r>
-          </w:p>
-        </w:tc>
-        <w:tc>
-          <w:tcPr>
-            <w:tcW w:type="dxa" w:w="3010"/>
-            <w:tcMar>
-              <w:top w:type="dxa" w:w="80"/>
-              <w:left w:type="dxa" w:w="100"/>
-              <w:bottom w:type="dxa" w:w="80"/>
-              <w:right w:type="dxa" w:w="100"/>
-            </w:tcMar>
-          </w:tcPr>
-          <w:p>
-            <w:pPr>
-              <w:spacing w:line="276"/>
-            </w:pPr>
-            <w:r>
-              <w:rPr>
-                <w:rFonts w:ascii="Times New Roman" w:cs="Times New Roman" w:eastAsia="Times New Roman" w:hAnsi="Times New Roman"/>
-                <w:sz w:val="22"/>
-                <w:szCs w:val="22"/>
-              </w:rPr>
-              <w:t xml:space="preserve">Booking &amp; Reservation (reserva confirmada)</w:t>
+            <w:tcW w:type="dxa" w:w="4513"/>
+            <w:tcMar>
+              <w:top w:type="dxa" w:w="80"/>
+              <w:left w:type="dxa" w:w="100"/>
+              <w:bottom w:type="dxa" w:w="80"/>
+              <w:right w:type="dxa" w:w="100"/>
+            </w:tcMar>
+          </w:tcPr>
+          <w:p>
+            <w:pPr>
+              <w:spacing w:line="276"/>
+            </w:pPr>
+            <w:r>
+              <w:rPr>
+                <w:rFonts w:ascii="Times New Roman" w:cs="Times New Roman" w:eastAsia="Times New Roman" w:hAnsi="Times New Roman"/>
+                <w:sz w:val="22"/>
+                <w:szCs w:val="22"/>
+              </w:rPr>
+              <w:t xml:space="preserve">Base de datos</w:t>
+            </w:r>
+          </w:p>
+        </w:tc>
+        <w:tc>
+          <w:tcPr>
+            <w:tcW w:type="dxa" w:w="4513"/>
+            <w:tcMar>
+              <w:top w:type="dxa" w:w="80"/>
+              <w:left w:type="dxa" w:w="100"/>
+              <w:bottom w:type="dxa" w:w="80"/>
+              <w:right w:type="dxa" w:w="100"/>
+            </w:tcMar>
+          </w:tcPr>
+          <w:p>
+            <w:pPr>
+              <w:spacing w:line="276"/>
+            </w:pPr>
+            <w:r>
+              <w:rPr>
+                <w:rFonts w:ascii="Times New Roman" w:cs="Times New Roman" w:eastAsia="Times New Roman" w:hAnsi="Times New Roman"/>
+                <w:sz w:val="22"/>
+                <w:szCs w:val="22"/>
+              </w:rPr>
+              <w:t xml:space="preserve">Microsoft SQL Server Developer Edition, Liquibase</w:t>
             </w:r>
           </w:p>
         </w:tc>
@@ -6389,73 +6434,49 @@
       <w:tr>
         <w:tc>
           <w:tcPr>
-            <w:tcW w:type="dxa" w:w="3008"/>
-            <w:tcMar>
-              <w:top w:type="dxa" w:w="80"/>
-              <w:left w:type="dxa" w:w="100"/>
-              <w:bottom w:type="dxa" w:w="80"/>
-              <w:right w:type="dxa" w:w="100"/>
-            </w:tcMar>
-          </w:tcPr>
-          <w:p>
-            <w:pPr>
-              <w:spacing w:line="276"/>
-            </w:pPr>
-            <w:r>
-              <w:rPr>
-                <w:rFonts w:ascii="Times New Roman" w:cs="Times New Roman" w:eastAsia="Times New Roman" w:hAnsi="Times New Roman"/>
-                <w:sz w:val="22"/>
-                <w:szCs w:val="22"/>
-              </w:rPr>
-              <w:t xml:space="preserve">6</w:t>
-            </w:r>
-          </w:p>
-        </w:tc>
-        <w:tc>
-          <w:tcPr>
-            <w:tcW w:type="dxa" w:w="3008"/>
-            <w:tcMar>
-              <w:top w:type="dxa" w:w="80"/>
-              <w:left w:type="dxa" w:w="100"/>
-              <w:bottom w:type="dxa" w:w="80"/>
-              <w:right w:type="dxa" w:w="100"/>
-            </w:tcMar>
-          </w:tcPr>
-          <w:p>
-            <w:pPr>
-              <w:spacing w:line="276"/>
-            </w:pPr>
-            <w:r>
-              <w:rPr>
-                <w:rFonts w:ascii="Times New Roman" w:cs="Times New Roman" w:eastAsia="Times New Roman" w:hAnsi="Times New Roman"/>
-                <w:sz w:val="22"/>
-                <w:szCs w:val="22"/>
-              </w:rPr>
-              <w:t xml:space="preserve">Payment &amp; Billing</w:t>
-            </w:r>
-          </w:p>
-        </w:tc>
-        <w:tc>
-          <w:tcPr>
-            <w:tcW w:type="dxa" w:w="3010"/>
-            <w:tcMar>
-              <w:top w:type="dxa" w:w="80"/>
-              <w:left w:type="dxa" w:w="100"/>
-              <w:bottom w:type="dxa" w:w="80"/>
-              <w:right w:type="dxa" w:w="100"/>
-            </w:tcMar>
-          </w:tcPr>
-          <w:p>
-            <w:pPr>
-              <w:spacing w:line="276"/>
-            </w:pPr>
-            <w:r>
-              <w:rPr>
-                <w:rFonts w:ascii="Times New Roman" w:cs="Times New Roman" w:eastAsia="Times New Roman" w:hAnsi="Times New Roman"/>
-                <w:sz w:val="22"/>
-                <w:szCs w:val="22"/>
-              </w:rPr>
-              <w:t xml:space="preserve">Booking &amp; Reservation</w:t>
+            <w:tcW w:type="dxa" w:w="4513"/>
+            <w:tcMar>
+              <w:top w:type="dxa" w:w="80"/>
+              <w:left w:type="dxa" w:w="100"/>
+              <w:bottom w:type="dxa" w:w="80"/>
+              <w:right w:type="dxa" w:w="100"/>
+            </w:tcMar>
+          </w:tcPr>
+          <w:p>
+            <w:pPr>
+              <w:spacing w:line="276"/>
+            </w:pPr>
+            <w:r>
+              <w:rPr>
+                <w:rFonts w:ascii="Times New Roman" w:cs="Times New Roman" w:eastAsia="Times New Roman" w:hAnsi="Times New Roman"/>
+                <w:sz w:val="22"/>
+                <w:szCs w:val="22"/>
+              </w:rPr>
+              <w:t xml:space="preserve">Frontend web</w:t>
+            </w:r>
+          </w:p>
+        </w:tc>
+        <w:tc>
+          <w:tcPr>
+            <w:tcW w:type="dxa" w:w="4513"/>
+            <w:tcMar>
+              <w:top w:type="dxa" w:w="80"/>
+              <w:left w:type="dxa" w:w="100"/>
+              <w:bottom w:type="dxa" w:w="80"/>
+              <w:right w:type="dxa" w:w="100"/>
+            </w:tcMar>
+          </w:tcPr>
+          <w:p>
+            <w:pPr>
+              <w:spacing w:line="276"/>
+            </w:pPr>
+            <w:r>
+              <w:rPr>
+                <w:rFonts w:ascii="Times New Roman" w:cs="Times New Roman" w:eastAsia="Times New Roman" w:hAnsi="Times New Roman"/>
+                <w:sz w:val="22"/>
+                <w:szCs w:val="22"/>
+              </w:rPr>
+              <w:t xml:space="preserve">Node.js, React, Vite</w:t>
             </w:r>
           </w:p>
         </w:tc>
@@ -6463,73 +6484,249 @@
       <w:tr>
         <w:tc>
           <w:tcPr>
-            <w:tcW w:type="dxa" w:w="3008"/>
-            <w:tcMar>
-              <w:top w:type="dxa" w:w="80"/>
-              <w:left w:type="dxa" w:w="100"/>
-              <w:bottom w:type="dxa" w:w="80"/>
-              <w:right w:type="dxa" w:w="100"/>
-            </w:tcMar>
-          </w:tcPr>
-          <w:p>
-            <w:pPr>
-              <w:spacing w:line="276"/>
-            </w:pPr>
-            <w:r>
-              <w:rPr>
-                <w:rFonts w:ascii="Times New Roman" w:cs="Times New Roman" w:eastAsia="Times New Roman" w:hAnsi="Times New Roman"/>
-                <w:sz w:val="22"/>
-                <w:szCs w:val="22"/>
-              </w:rPr>
-              <w:t xml:space="preserve">7</w:t>
-            </w:r>
-          </w:p>
-        </w:tc>
-        <w:tc>
-          <w:tcPr>
-            <w:tcW w:type="dxa" w:w="3008"/>
-            <w:tcMar>
-              <w:top w:type="dxa" w:w="80"/>
-              <w:left w:type="dxa" w:w="100"/>
-              <w:bottom w:type="dxa" w:w="80"/>
-              <w:right w:type="dxa" w:w="100"/>
-            </w:tcMar>
-          </w:tcPr>
-          <w:p>
-            <w:pPr>
-              <w:spacing w:line="276"/>
-            </w:pPr>
-            <w:r>
-              <w:rPr>
-                <w:rFonts w:ascii="Times New Roman" w:cs="Times New Roman" w:eastAsia="Times New Roman" w:hAnsi="Times New Roman"/>
-                <w:sz w:val="22"/>
-                <w:szCs w:val="22"/>
-              </w:rPr>
-              <w:t xml:space="preserve">Notification</w:t>
-            </w:r>
-          </w:p>
-        </w:tc>
-        <w:tc>
-          <w:tcPr>
-            <w:tcW w:type="dxa" w:w="3010"/>
-            <w:tcMar>
-              <w:top w:type="dxa" w:w="80"/>
-              <w:left w:type="dxa" w:w="100"/>
-              <w:bottom w:type="dxa" w:w="80"/>
-              <w:right w:type="dxa" w:w="100"/>
-            </w:tcMar>
-          </w:tcPr>
-          <w:p>
-            <w:pPr>
-              <w:spacing w:line="276"/>
-            </w:pPr>
-            <w:r>
-              <w:rPr>
-                <w:rFonts w:ascii="Times New Roman" w:cs="Times New Roman" w:eastAsia="Times New Roman" w:hAnsi="Times New Roman"/>
-                <w:sz w:val="22"/>
-                <w:szCs w:val="22"/>
-              </w:rPr>
-              <w:t xml:space="preserve">Transversal a los eventos de las épicas anteriores</w:t>
+            <w:tcW w:type="dxa" w:w="4513"/>
+            <w:tcMar>
+              <w:top w:type="dxa" w:w="80"/>
+              <w:left w:type="dxa" w:w="100"/>
+              <w:bottom w:type="dxa" w:w="80"/>
+              <w:right w:type="dxa" w:w="100"/>
+            </w:tcMar>
+          </w:tcPr>
+          <w:p>
+            <w:pPr>
+              <w:spacing w:line="276"/>
+            </w:pPr>
+            <w:r>
+              <w:rPr>
+                <w:rFonts w:ascii="Times New Roman" w:cs="Times New Roman" w:eastAsia="Times New Roman" w:hAnsi="Times New Roman"/>
+                <w:sz w:val="22"/>
+                <w:szCs w:val="22"/>
+              </w:rPr>
+              <w:t xml:space="preserve">Aplicación móvil</w:t>
+            </w:r>
+          </w:p>
+        </w:tc>
+        <w:tc>
+          <w:tcPr>
+            <w:tcW w:type="dxa" w:w="4513"/>
+            <w:tcMar>
+              <w:top w:type="dxa" w:w="80"/>
+              <w:left w:type="dxa" w:w="100"/>
+              <w:bottom w:type="dxa" w:w="80"/>
+              <w:right w:type="dxa" w:w="100"/>
+            </w:tcMar>
+          </w:tcPr>
+          <w:p>
+            <w:pPr>
+              <w:spacing w:line="276"/>
+            </w:pPr>
+            <w:r>
+              <w:rPr>
+                <w:rFonts w:ascii="Times New Roman" w:cs="Times New Roman" w:eastAsia="Times New Roman" w:hAnsi="Times New Roman"/>
+                <w:sz w:val="22"/>
+                <w:szCs w:val="22"/>
+              </w:rPr>
+              <w:t xml:space="preserve">Expo, React Native</w:t>
+            </w:r>
+          </w:p>
+        </w:tc>
+      </w:tr>
+      <w:tr>
+        <w:tc>
+          <w:tcPr>
+            <w:tcW w:type="dxa" w:w="4513"/>
+            <w:tcMar>
+              <w:top w:type="dxa" w:w="80"/>
+              <w:left w:type="dxa" w:w="100"/>
+              <w:bottom w:type="dxa" w:w="80"/>
+              <w:right w:type="dxa" w:w="100"/>
+            </w:tcMar>
+          </w:tcPr>
+          <w:p>
+            <w:pPr>
+              <w:spacing w:line="276"/>
+            </w:pPr>
+            <w:r>
+              <w:rPr>
+                <w:rFonts w:ascii="Times New Roman" w:cs="Times New Roman" w:eastAsia="Times New Roman" w:hAnsi="Times New Roman"/>
+                <w:sz w:val="22"/>
+                <w:szCs w:val="22"/>
+              </w:rPr>
+              <w:t xml:space="preserve">Control de versiones</w:t>
+            </w:r>
+          </w:p>
+        </w:tc>
+        <w:tc>
+          <w:tcPr>
+            <w:tcW w:type="dxa" w:w="4513"/>
+            <w:tcMar>
+              <w:top w:type="dxa" w:w="80"/>
+              <w:left w:type="dxa" w:w="100"/>
+              <w:bottom w:type="dxa" w:w="80"/>
+              <w:right w:type="dxa" w:w="100"/>
+            </w:tcMar>
+          </w:tcPr>
+          <w:p>
+            <w:pPr>
+              <w:spacing w:line="276"/>
+            </w:pPr>
+            <w:r>
+              <w:rPr>
+                <w:rFonts w:ascii="Times New Roman" w:cs="Times New Roman" w:eastAsia="Times New Roman" w:hAnsi="Times New Roman"/>
+                <w:sz w:val="22"/>
+                <w:szCs w:val="22"/>
+              </w:rPr>
+              <w:t xml:space="preserve">Git, GitHub</w:t>
+            </w:r>
+          </w:p>
+        </w:tc>
+      </w:tr>
+      <w:tr>
+        <w:tc>
+          <w:tcPr>
+            <w:tcW w:type="dxa" w:w="4513"/>
+            <w:tcMar>
+              <w:top w:type="dxa" w:w="80"/>
+              <w:left w:type="dxa" w:w="100"/>
+              <w:bottom w:type="dxa" w:w="80"/>
+              <w:right w:type="dxa" w:w="100"/>
+            </w:tcMar>
+          </w:tcPr>
+          <w:p>
+            <w:pPr>
+              <w:spacing w:line="276"/>
+            </w:pPr>
+            <w:r>
+              <w:rPr>
+                <w:rFonts w:ascii="Times New Roman" w:cs="Times New Roman" w:eastAsia="Times New Roman" w:hAnsi="Times New Roman"/>
+                <w:sz w:val="22"/>
+                <w:szCs w:val="22"/>
+              </w:rPr>
+              <w:t xml:space="preserve">Gestión del backlog</w:t>
+            </w:r>
+          </w:p>
+        </w:tc>
+        <w:tc>
+          <w:tcPr>
+            <w:tcW w:type="dxa" w:w="4513"/>
+            <w:tcMar>
+              <w:top w:type="dxa" w:w="80"/>
+              <w:left w:type="dxa" w:w="100"/>
+              <w:bottom w:type="dxa" w:w="80"/>
+              <w:right w:type="dxa" w:w="100"/>
+            </w:tcMar>
+          </w:tcPr>
+          <w:p>
+            <w:pPr>
+              <w:spacing w:line="276"/>
+            </w:pPr>
+            <w:r>
+              <w:rPr>
+                <w:rFonts w:ascii="Times New Roman" w:cs="Times New Roman" w:eastAsia="Times New Roman" w:hAnsi="Times New Roman"/>
+                <w:sz w:val="22"/>
+                <w:szCs w:val="22"/>
+              </w:rPr>
+              <w:t xml:space="preserve">Jira</w:t>
+            </w:r>
+          </w:p>
+        </w:tc>
+      </w:tr>
+      <w:tr>
+        <w:tc>
+          <w:tcPr>
+            <w:tcW w:type="dxa" w:w="4513"/>
+            <w:tcMar>
+              <w:top w:type="dxa" w:w="80"/>
+              <w:left w:type="dxa" w:w="100"/>
+              <w:bottom w:type="dxa" w:w="80"/>
+              <w:right w:type="dxa" w:w="100"/>
+            </w:tcMar>
+          </w:tcPr>
+          <w:p>
+            <w:pPr>
+              <w:spacing w:line="276"/>
+            </w:pPr>
+            <w:r>
+              <w:rPr>
+                <w:rFonts w:ascii="Times New Roman" w:cs="Times New Roman" w:eastAsia="Times New Roman" w:hAnsi="Times New Roman"/>
+                <w:sz w:val="22"/>
+                <w:szCs w:val="22"/>
+              </w:rPr>
+              <w:t xml:space="preserve">Contenedores</w:t>
+            </w:r>
+          </w:p>
+        </w:tc>
+        <w:tc>
+          <w:tcPr>
+            <w:tcW w:type="dxa" w:w="4513"/>
+            <w:tcMar>
+              <w:top w:type="dxa" w:w="80"/>
+              <w:left w:type="dxa" w:w="100"/>
+              <w:bottom w:type="dxa" w:w="80"/>
+              <w:right w:type="dxa" w:w="100"/>
+            </w:tcMar>
+          </w:tcPr>
+          <w:p>
+            <w:pPr>
+              <w:spacing w:line="276"/>
+            </w:pPr>
+            <w:r>
+              <w:rPr>
+                <w:rFonts w:ascii="Times New Roman" w:cs="Times New Roman" w:eastAsia="Times New Roman" w:hAnsi="Times New Roman"/>
+                <w:sz w:val="22"/>
+                <w:szCs w:val="22"/>
+              </w:rPr>
+              <w:t xml:space="preserve">Docker</w:t>
+            </w:r>
+          </w:p>
+        </w:tc>
+      </w:tr>
+      <w:tr>
+        <w:tc>
+          <w:tcPr>
+            <w:tcW w:type="dxa" w:w="4513"/>
+            <w:tcMar>
+              <w:top w:type="dxa" w:w="80"/>
+              <w:left w:type="dxa" w:w="100"/>
+              <w:bottom w:type="dxa" w:w="80"/>
+              <w:right w:type="dxa" w:w="100"/>
+            </w:tcMar>
+          </w:tcPr>
+          <w:p>
+            <w:pPr>
+              <w:spacing w:line="276"/>
+            </w:pPr>
+            <w:r>
+              <w:rPr>
+                <w:rFonts w:ascii="Times New Roman" w:cs="Times New Roman" w:eastAsia="Times New Roman" w:hAnsi="Times New Roman"/>
+                <w:sz w:val="22"/>
+                <w:szCs w:val="22"/>
+              </w:rPr>
+              <w:t xml:space="preserve">Entornos de desarrollo</w:t>
+            </w:r>
+          </w:p>
+        </w:tc>
+        <w:tc>
+          <w:tcPr>
+            <w:tcW w:type="dxa" w:w="4513"/>
+            <w:tcMar>
+              <w:top w:type="dxa" w:w="80"/>
+              <w:left w:type="dxa" w:w="100"/>
+              <w:bottom w:type="dxa" w:w="80"/>
+              <w:right w:type="dxa" w:w="100"/>
+            </w:tcMar>
+          </w:tcPr>
+          <w:p>
+            <w:pPr>
+              <w:spacing w:line="276"/>
+            </w:pPr>
+            <w:r>
+              <w:rPr>
+                <w:rFonts w:ascii="Times New Roman" w:cs="Times New Roman" w:eastAsia="Times New Roman" w:hAnsi="Times New Roman"/>
+                <w:sz w:val="22"/>
+                <w:szCs w:val="22"/>
+              </w:rPr>
+              <w:t xml:space="preserve">IDE del equipo (IntelliJ IDEA, Visual Studio Code)</w:t>
             </w:r>
           </w:p>
         </w:tc>
@@ -6551,7 +6748,37 @@
           <w:sz w:val="24"/>
           <w:szCs w:val="24"/>
         </w:rPr>
-        <w:t xml:space="preserve">Con sprints de una semana y un equipo de 3 personas, cada épica puede distribuirse en uno o más sprints según el número de historias y su estimación en puntos; el calendario exacto por sprint queda sujeto a la Sprint Planning de cada semana, conforme a la metodología descrita en la sección 6.</w:t>
+        <w:t xml:space="preserve">Todas las herramientas listadas son de código abierto o cuentan con un nivel gratuito suficiente para el alcance del MVP, consistente con lo descrito en la viabilidad económica (sección 5.3).</w:t>
+      </w:r>
+    </w:p>
+    <w:p>
+      <w:pPr>
+        <w:spacing w:after="160" w:before="200" w:line="480"/>
+        <w:jc w:val="left"/>
+      </w:pPr>
+      <w:r>
+        <w:rPr>
+          <w:rFonts w:ascii="Times New Roman" w:cs="Times New Roman" w:eastAsia="Times New Roman" w:hAnsi="Times New Roman"/>
+          <w:b/>
+          <w:bCs/>
+          <w:sz w:val="24"/>
+          <w:szCs w:val="24"/>
+        </w:rPr>
+        <w:t xml:space="preserve">7.3 Recursos de hardware</w:t>
+      </w:r>
+    </w:p>
+    <w:p>
+      <w:pPr>
+        <w:spacing w:after="200" w:line="480"/>
+        <w:jc w:val="both"/>
+      </w:pPr>
+      <w:r>
+        <w:rPr>
+          <w:rFonts w:ascii="Times New Roman" w:cs="Times New Roman" w:eastAsia="Times New Roman" w:hAnsi="Times New Roman"/>
+          <w:sz w:val="24"/>
+          <w:szCs w:val="24"/>
+        </w:rPr>
+        <w:t xml:space="preserve">El proyecto no requiere servidores de producción: el desarrollo, las pruebas y la integración se realizan en los equipos de cómputo de los integrantes del equipo y en contenedores Docker locales. Las pruebas de la aplicación móvil se realizan sobre emuladores (Android/iOS) o dispositivos físicos propios del equipo, sin infraestructura adicional.</w:t>
       </w:r>
     </w:p>
     <w:p>
@@ -6567,7 +6794,53 @@
           <w:sz w:val="24"/>
           <w:szCs w:val="24"/>
         </w:rPr>
-        <w:t xml:space="preserve">8. Riesgos y mitigación</w:t>
+        <w:t xml:space="preserve">8. Estado actual y cronograma propuesto</w:t>
+      </w:r>
+    </w:p>
+    <w:p>
+      <w:pPr>
+        <w:spacing w:after="200" w:line="480"/>
+        <w:jc w:val="both"/>
+      </w:pPr>
+      <w:r>
+        <w:rPr>
+          <w:rFonts w:ascii="Times New Roman" w:cs="Times New Roman" w:eastAsia="Times New Roman" w:hAnsi="Times New Roman"/>
+          <w:sz w:val="24"/>
+          <w:szCs w:val="24"/>
+        </w:rPr>
+        <w:t xml:space="preserve">El backlog del proyecto, documentado en </w:t>
+      </w:r>
+      <w:r>
+        <w:rPr>
+          <w:rFonts w:ascii="Times New Roman" w:cs="Times New Roman" w:eastAsia="Times New Roman" w:hAnsi="Times New Roman"/>
+          <w:i/>
+          <w:iCs/>
+          <w:sz w:val="24"/>
+          <w:szCs w:val="24"/>
+        </w:rPr>
+        <w:t xml:space="preserve">04-requirements/user-stories.md</w:t>
+      </w:r>
+      <w:r>
+        <w:rPr>
+          <w:rFonts w:ascii="Times New Roman" w:cs="Times New Roman" w:eastAsia="Times New Roman" w:hAnsi="Times New Roman"/>
+          <w:sz w:val="24"/>
+          <w:szCs w:val="24"/>
+        </w:rPr>
+        <w:t xml:space="preserve">, está organizado en 7 épicas (una por Bounded Context) con 31 historias de usuario en total, estimadas entre 2 y 5 puntos cada una.</w:t>
+      </w:r>
+    </w:p>
+    <w:p>
+      <w:pPr>
+        <w:spacing w:after="200" w:line="480"/>
+        <w:jc w:val="both"/>
+      </w:pPr>
+      <w:r>
+        <w:rPr>
+          <w:rFonts w:ascii="Times New Roman" w:cs="Times New Roman" w:eastAsia="Times New Roman" w:hAnsi="Times New Roman"/>
+          <w:sz w:val="24"/>
+          <w:szCs w:val="24"/>
+        </w:rPr>
+        <w:t xml:space="preserve">Esta propuesta sugiere ejecutar las épicas siguiendo el mismo orden de dependencia que ya rige las migraciones de base de datos entre servicios (sección 2.8), de modo que ningún servicio dependa de tablas o contratos que todavía no existen:</w:t>
       </w:r>
     </w:p>
     <w:tbl>
@@ -6613,7 +6886,7 @@
                 <w:sz w:val="22"/>
                 <w:szCs w:val="22"/>
               </w:rPr>
-              <w:t xml:space="preserve">Riesgo</w:t>
+              <w:t xml:space="preserve">Orden</w:t>
             </w:r>
           </w:p>
         </w:tc>
@@ -6639,7 +6912,7 @@
                 <w:sz w:val="22"/>
                 <w:szCs w:val="22"/>
               </w:rPr>
-              <w:t xml:space="preserve">Origen</w:t>
+              <w:t xml:space="preserve">Épica (Bounded Context)</w:t>
             </w:r>
           </w:p>
         </w:tc>
@@ -6665,7 +6938,7 @@
                 <w:sz w:val="22"/>
                 <w:szCs w:val="22"/>
               </w:rPr>
-              <w:t xml:space="preserve">Mitigación propuesta</w:t>
+              <w:t xml:space="preserve">Dependencia</w:t>
             </w:r>
           </w:p>
         </w:tc>
@@ -6691,31 +6964,31 @@
                 <w:sz w:val="22"/>
                 <w:szCs w:val="22"/>
               </w:rPr>
-              <w:t xml:space="preserve">Migraciones de esquema descoordinadas entre servicios que comparten la base de datos</w:t>
-            </w:r>
-          </w:p>
-        </w:tc>
-        <w:tc>
-          <w:tcPr>
-            <w:tcW w:type="dxa" w:w="3008"/>
-            <w:tcMar>
-              <w:top w:type="dxa" w:w="80"/>
-              <w:left w:type="dxa" w:w="100"/>
-              <w:bottom w:type="dxa" w:w="80"/>
-              <w:right w:type="dxa" w:w="100"/>
-            </w:tcMar>
-          </w:tcPr>
-          <w:p>
-            <w:pPr>
-              <w:spacing w:line="276"/>
-            </w:pPr>
-            <w:r>
-              <w:rPr>
-                <w:rFonts w:ascii="Times New Roman" w:cs="Times New Roman" w:eastAsia="Times New Roman" w:hAnsi="Times New Roman"/>
-                <w:sz w:val="22"/>
-                <w:szCs w:val="22"/>
-              </w:rPr>
-              <w:t xml:space="preserve">ADR-002, ADR-009</w:t>
+              <w:t xml:space="preserve">1</w:t>
+            </w:r>
+          </w:p>
+        </w:tc>
+        <w:tc>
+          <w:tcPr>
+            <w:tcW w:type="dxa" w:w="3008"/>
+            <w:tcMar>
+              <w:top w:type="dxa" w:w="80"/>
+              <w:left w:type="dxa" w:w="100"/>
+              <w:bottom w:type="dxa" w:w="80"/>
+              <w:right w:type="dxa" w:w="100"/>
+            </w:tcMar>
+          </w:tcPr>
+          <w:p>
+            <w:pPr>
+              <w:spacing w:line="276"/>
+            </w:pPr>
+            <w:r>
+              <w:rPr>
+                <w:rFonts w:ascii="Times New Roman" w:cs="Times New Roman" w:eastAsia="Times New Roman" w:hAnsi="Times New Roman"/>
+                <w:sz w:val="22"/>
+                <w:szCs w:val="22"/>
+              </w:rPr>
+              <w:t xml:space="preserve">Identity &amp; Access</w:t>
             </w:r>
           </w:p>
         </w:tc>
@@ -6739,7 +7012,7 @@
                 <w:sz w:val="22"/>
                 <w:szCs w:val="22"/>
               </w:rPr>
-              <w:t xml:space="preserve">Orden de ejecución fijo entre repositorios de migración y revisión obligatoria antes de desplegar cambios de esquema</w:t>
+              <w:t xml:space="preserve">Ninguna — autenticación requerida por el resto</w:t>
             </w:r>
           </w:p>
         </w:tc>
@@ -6765,31 +7038,31 @@
                 <w:sz w:val="22"/>
                 <w:szCs w:val="22"/>
               </w:rPr>
-              <w:t xml:space="preserve">Referencias residuales a Supabase en el frontend</w:t>
-            </w:r>
-          </w:p>
-        </w:tc>
-        <w:tc>
-          <w:tcPr>
-            <w:tcW w:type="dxa" w:w="3008"/>
-            <w:tcMar>
-              <w:top w:type="dxa" w:w="80"/>
-              <w:left w:type="dxa" w:w="100"/>
-              <w:bottom w:type="dxa" w:w="80"/>
-              <w:right w:type="dxa" w:w="100"/>
-            </w:tcMar>
-          </w:tcPr>
-          <w:p>
-            <w:pPr>
-              <w:spacing w:line="276"/>
-            </w:pPr>
-            <w:r>
-              <w:rPr>
-                <w:rFonts w:ascii="Times New Roman" w:cs="Times New Roman" w:eastAsia="Times New Roman" w:hAnsi="Times New Roman"/>
-                <w:sz w:val="22"/>
-                <w:szCs w:val="22"/>
-              </w:rPr>
-              <w:t xml:space="preserve">ADR-007</w:t>
+              <w:t xml:space="preserve">2</w:t>
+            </w:r>
+          </w:p>
+        </w:tc>
+        <w:tc>
+          <w:tcPr>
+            <w:tcW w:type="dxa" w:w="3008"/>
+            <w:tcMar>
+              <w:top w:type="dxa" w:w="80"/>
+              <w:left w:type="dxa" w:w="100"/>
+              <w:bottom w:type="dxa" w:w="80"/>
+              <w:right w:type="dxa" w:w="100"/>
+            </w:tcMar>
+          </w:tcPr>
+          <w:p>
+            <w:pPr>
+              <w:spacing w:line="276"/>
+            </w:pPr>
+            <w:r>
+              <w:rPr>
+                <w:rFonts w:ascii="Times New Roman" w:cs="Times New Roman" w:eastAsia="Times New Roman" w:hAnsi="Times New Roman"/>
+                <w:sz w:val="22"/>
+                <w:szCs w:val="22"/>
+              </w:rPr>
+              <w:t xml:space="preserve">Fleet &amp; Maintenance</w:t>
             </w:r>
           </w:p>
         </w:tc>
@@ -6813,7 +7086,7 @@
                 <w:sz w:val="22"/>
                 <w:szCs w:val="22"/>
               </w:rPr>
-              <w:t xml:space="preserve">Tratarlas como deuda técnica explícita; no ampliarlas sin actualizar el ADR correspondiente</w:t>
+              <w:t xml:space="preserve">Identity &amp; Access (roles y permisos)</w:t>
             </w:r>
           </w:p>
         </w:tc>
@@ -6839,31 +7112,31 @@
                 <w:sz w:val="22"/>
                 <w:szCs w:val="22"/>
               </w:rPr>
-              <w:t xml:space="preserve">Rutas de contratos de alquiler expuestas fuera del alcance del MVP</w:t>
-            </w:r>
-          </w:p>
-        </w:tc>
-        <w:tc>
-          <w:tcPr>
-            <w:tcW w:type="dxa" w:w="3008"/>
-            <w:tcMar>
-              <w:top w:type="dxa" w:w="80"/>
-              <w:left w:type="dxa" w:w="100"/>
-              <w:bottom w:type="dxa" w:w="80"/>
-              <w:right w:type="dxa" w:w="100"/>
-            </w:tcMar>
-          </w:tcPr>
-          <w:p>
-            <w:pPr>
-              <w:spacing w:line="276"/>
-            </w:pPr>
-            <w:r>
-              <w:rPr>
-                <w:rFonts w:ascii="Times New Roman" w:cs="Times New Roman" w:eastAsia="Times New Roman" w:hAnsi="Times New Roman"/>
-                <w:sz w:val="22"/>
-                <w:szCs w:val="22"/>
-              </w:rPr>
-              <w:t xml:space="preserve">ADR-008</w:t>
+              <w:t xml:space="preserve">3</w:t>
+            </w:r>
+          </w:p>
+        </w:tc>
+        <w:tc>
+          <w:tcPr>
+            <w:tcW w:type="dxa" w:w="3008"/>
+            <w:tcMar>
+              <w:top w:type="dxa" w:w="80"/>
+              <w:left w:type="dxa" w:w="100"/>
+              <w:bottom w:type="dxa" w:w="80"/>
+              <w:right w:type="dxa" w:w="100"/>
+            </w:tcMar>
+          </w:tcPr>
+          <w:p>
+            <w:pPr>
+              <w:spacing w:line="276"/>
+            </w:pPr>
+            <w:r>
+              <w:rPr>
+                <w:rFonts w:ascii="Times New Roman" w:cs="Times New Roman" w:eastAsia="Times New Roman" w:hAnsi="Times New Roman"/>
+                <w:sz w:val="22"/>
+                <w:szCs w:val="22"/>
+              </w:rPr>
+              <w:t xml:space="preserve">Telemetry &amp; GPS</w:t>
             </w:r>
           </w:p>
         </w:tc>
@@ -6887,7 +7160,7 @@
                 <w:sz w:val="22"/>
                 <w:szCs w:val="22"/>
               </w:rPr>
-              <w:t xml:space="preserve">Ocultar o remover la navegación activa hacia esas rutas hasta que exista un cambio de alcance aprobado</w:t>
+              <w:t xml:space="preserve">Fleet &amp; Maintenance (vehículos a rastrear)</w:t>
             </w:r>
           </w:p>
         </w:tc>
@@ -6913,31 +7186,31 @@
                 <w:sz w:val="22"/>
                 <w:szCs w:val="22"/>
               </w:rPr>
-              <w:t xml:space="preserve">Convenciones de carpetas inconsistentes en el frontend web (mayúsculas/minúsculas)</w:t>
-            </w:r>
-          </w:p>
-        </w:tc>
-        <w:tc>
-          <w:tcPr>
-            <w:tcW w:type="dxa" w:w="3008"/>
-            <w:tcMar>
-              <w:top w:type="dxa" w:w="80"/>
-              <w:left w:type="dxa" w:w="100"/>
-              <w:bottom w:type="dxa" w:w="80"/>
-              <w:right w:type="dxa" w:w="100"/>
-            </w:tcMar>
-          </w:tcPr>
-          <w:p>
-            <w:pPr>
-              <w:spacing w:line="276"/>
-            </w:pPr>
-            <w:r>
-              <w:rPr>
-                <w:rFonts w:ascii="Times New Roman" w:cs="Times New Roman" w:eastAsia="Times New Roman" w:hAnsi="Times New Roman"/>
-                <w:sz w:val="22"/>
-                <w:szCs w:val="22"/>
-              </w:rPr>
-              <w:t xml:space="preserve">ADR-006</w:t>
+              <w:t xml:space="preserve">4</w:t>
+            </w:r>
+          </w:p>
+        </w:tc>
+        <w:tc>
+          <w:tcPr>
+            <w:tcW w:type="dxa" w:w="3008"/>
+            <w:tcMar>
+              <w:top w:type="dxa" w:w="80"/>
+              <w:left w:type="dxa" w:w="100"/>
+              <w:bottom w:type="dxa" w:w="80"/>
+              <w:right w:type="dxa" w:w="100"/>
+            </w:tcMar>
+          </w:tcPr>
+          <w:p>
+            <w:pPr>
+              <w:spacing w:line="276"/>
+            </w:pPr>
+            <w:r>
+              <w:rPr>
+                <w:rFonts w:ascii="Times New Roman" w:cs="Times New Roman" w:eastAsia="Times New Roman" w:hAnsi="Times New Roman"/>
+                <w:sz w:val="22"/>
+                <w:szCs w:val="22"/>
+              </w:rPr>
+              <w:t xml:space="preserve">Booking &amp; Reservation</w:t>
             </w:r>
           </w:p>
         </w:tc>
@@ -6961,7 +7234,7 @@
                 <w:sz w:val="22"/>
                 <w:szCs w:val="22"/>
               </w:rPr>
-              <w:t xml:space="preserve">Exigir la convención estandarizada en código nuevo; migración incremental del código existente</w:t>
+              <w:t xml:space="preserve">Identity &amp; Access, Fleet &amp; Maintenance</w:t>
             </w:r>
           </w:p>
         </w:tc>
@@ -6987,31 +7260,31 @@
                 <w:sz w:val="22"/>
                 <w:szCs w:val="22"/>
               </w:rPr>
-              <w:t xml:space="preserve">Backlog con cronograma de sprints sin asignar</w:t>
-            </w:r>
-          </w:p>
-        </w:tc>
-        <w:tc>
-          <w:tcPr>
-            <w:tcW w:type="dxa" w:w="3008"/>
-            <w:tcMar>
-              <w:top w:type="dxa" w:w="80"/>
-              <w:left w:type="dxa" w:w="100"/>
-              <w:bottom w:type="dxa" w:w="80"/>
-              <w:right w:type="dxa" w:w="100"/>
-            </w:tcMar>
-          </w:tcPr>
-          <w:p>
-            <w:pPr>
-              <w:spacing w:line="276"/>
-            </w:pPr>
-            <w:r>
-              <w:rPr>
-                <w:rFonts w:ascii="Times New Roman" w:cs="Times New Roman" w:eastAsia="Times New Roman" w:hAnsi="Times New Roman"/>
-                <w:sz w:val="22"/>
-                <w:szCs w:val="22"/>
-              </w:rPr>
-              <w:t xml:space="preserve">04-requirements/user-stories.md</w:t>
+              <w:t xml:space="preserve">5</w:t>
+            </w:r>
+          </w:p>
+        </w:tc>
+        <w:tc>
+          <w:tcPr>
+            <w:tcW w:type="dxa" w:w="3008"/>
+            <w:tcMar>
+              <w:top w:type="dxa" w:w="80"/>
+              <w:left w:type="dxa" w:w="100"/>
+              <w:bottom w:type="dxa" w:w="80"/>
+              <w:right w:type="dxa" w:w="100"/>
+            </w:tcMar>
+          </w:tcPr>
+          <w:p>
+            <w:pPr>
+              <w:spacing w:line="276"/>
+            </w:pPr>
+            <w:r>
+              <w:rPr>
+                <w:rFonts w:ascii="Times New Roman" w:cs="Times New Roman" w:eastAsia="Times New Roman" w:hAnsi="Times New Roman"/>
+                <w:sz w:val="22"/>
+                <w:szCs w:val="22"/>
+              </w:rPr>
+              <w:t xml:space="preserve">Rental Execution</w:t>
             </w:r>
           </w:p>
         </w:tc>
@@ -7035,7 +7308,7 @@
                 <w:sz w:val="22"/>
                 <w:szCs w:val="22"/>
               </w:rPr>
-              <w:t xml:space="preserve">Priorizar la asignación de sprints siguiendo el orden de dependencia propuesto en la sección 7</w:t>
+              <w:t xml:space="preserve">Booking &amp; Reservation (reserva confirmada)</w:t>
             </w:r>
           </w:p>
         </w:tc>
@@ -7061,31 +7334,31 @@
                 <w:sz w:val="22"/>
                 <w:szCs w:val="22"/>
               </w:rPr>
-              <w:t xml:space="preserve">Desacuerdo de estimación entre integrantes del equipo</w:t>
-            </w:r>
-          </w:p>
-        </w:tc>
-        <w:tc>
-          <w:tcPr>
-            <w:tcW w:type="dxa" w:w="3008"/>
-            <w:tcMar>
-              <w:top w:type="dxa" w:w="80"/>
-              <w:left w:type="dxa" w:w="100"/>
-              <w:bottom w:type="dxa" w:w="80"/>
-              <w:right w:type="dxa" w:w="100"/>
-            </w:tcMar>
-          </w:tcPr>
-          <w:p>
-            <w:pPr>
-              <w:spacing w:line="276"/>
-            </w:pPr>
-            <w:r>
-              <w:rPr>
-                <w:rFonts w:ascii="Times New Roman" w:cs="Times New Roman" w:eastAsia="Times New Roman" w:hAnsi="Times New Roman"/>
-                <w:sz w:val="22"/>
-                <w:szCs w:val="22"/>
-              </w:rPr>
-              <w:t xml:space="preserve">00-governance/agile-conventions.md</w:t>
+              <w:t xml:space="preserve">6</w:t>
+            </w:r>
+          </w:p>
+        </w:tc>
+        <w:tc>
+          <w:tcPr>
+            <w:tcW w:type="dxa" w:w="3008"/>
+            <w:tcMar>
+              <w:top w:type="dxa" w:w="80"/>
+              <w:left w:type="dxa" w:w="100"/>
+              <w:bottom w:type="dxa" w:w="80"/>
+              <w:right w:type="dxa" w:w="100"/>
+            </w:tcMar>
+          </w:tcPr>
+          <w:p>
+            <w:pPr>
+              <w:spacing w:line="276"/>
+            </w:pPr>
+            <w:r>
+              <w:rPr>
+                <w:rFonts w:ascii="Times New Roman" w:cs="Times New Roman" w:eastAsia="Times New Roman" w:hAnsi="Times New Roman"/>
+                <w:sz w:val="22"/>
+                <w:szCs w:val="22"/>
+              </w:rPr>
+              <w:t xml:space="preserve">Payment &amp; Billing</w:t>
             </w:r>
           </w:p>
         </w:tc>
@@ -7109,7 +7382,81 @@
                 <w:sz w:val="22"/>
                 <w:szCs w:val="22"/>
               </w:rPr>
-              <w:t xml:space="preserve">Planning Poker con regla de discusión obligatoria ante diferencias de 2 o más niveles en la escala Fibonacci</w:t>
+              <w:t xml:space="preserve">Booking &amp; Reservation</w:t>
+            </w:r>
+          </w:p>
+        </w:tc>
+      </w:tr>
+      <w:tr>
+        <w:tc>
+          <w:tcPr>
+            <w:tcW w:type="dxa" w:w="3008"/>
+            <w:tcMar>
+              <w:top w:type="dxa" w:w="80"/>
+              <w:left w:type="dxa" w:w="100"/>
+              <w:bottom w:type="dxa" w:w="80"/>
+              <w:right w:type="dxa" w:w="100"/>
+            </w:tcMar>
+          </w:tcPr>
+          <w:p>
+            <w:pPr>
+              <w:spacing w:line="276"/>
+            </w:pPr>
+            <w:r>
+              <w:rPr>
+                <w:rFonts w:ascii="Times New Roman" w:cs="Times New Roman" w:eastAsia="Times New Roman" w:hAnsi="Times New Roman"/>
+                <w:sz w:val="22"/>
+                <w:szCs w:val="22"/>
+              </w:rPr>
+              <w:t xml:space="preserve">7</w:t>
+            </w:r>
+          </w:p>
+        </w:tc>
+        <w:tc>
+          <w:tcPr>
+            <w:tcW w:type="dxa" w:w="3008"/>
+            <w:tcMar>
+              <w:top w:type="dxa" w:w="80"/>
+              <w:left w:type="dxa" w:w="100"/>
+              <w:bottom w:type="dxa" w:w="80"/>
+              <w:right w:type="dxa" w:w="100"/>
+            </w:tcMar>
+          </w:tcPr>
+          <w:p>
+            <w:pPr>
+              <w:spacing w:line="276"/>
+            </w:pPr>
+            <w:r>
+              <w:rPr>
+                <w:rFonts w:ascii="Times New Roman" w:cs="Times New Roman" w:eastAsia="Times New Roman" w:hAnsi="Times New Roman"/>
+                <w:sz w:val="22"/>
+                <w:szCs w:val="22"/>
+              </w:rPr>
+              <w:t xml:space="preserve">Notification</w:t>
+            </w:r>
+          </w:p>
+        </w:tc>
+        <w:tc>
+          <w:tcPr>
+            <w:tcW w:type="dxa" w:w="3010"/>
+            <w:tcMar>
+              <w:top w:type="dxa" w:w="80"/>
+              <w:left w:type="dxa" w:w="100"/>
+              <w:bottom w:type="dxa" w:w="80"/>
+              <w:right w:type="dxa" w:w="100"/>
+            </w:tcMar>
+          </w:tcPr>
+          <w:p>
+            <w:pPr>
+              <w:spacing w:line="276"/>
+            </w:pPr>
+            <w:r>
+              <w:rPr>
+                <w:rFonts w:ascii="Times New Roman" w:cs="Times New Roman" w:eastAsia="Times New Roman" w:hAnsi="Times New Roman"/>
+                <w:sz w:val="22"/>
+                <w:szCs w:val="22"/>
+              </w:rPr>
+              <w:t xml:space="preserve">Transversal a los eventos de las épicas anteriores</w:t>
             </w:r>
           </w:p>
         </w:tc>
@@ -7122,6 +7469,20 @@
     </w:p>
     <w:p>
       <w:pPr>
+        <w:spacing w:after="200" w:line="480"/>
+        <w:jc w:val="both"/>
+      </w:pPr>
+      <w:r>
+        <w:rPr>
+          <w:rFonts w:ascii="Times New Roman" w:cs="Times New Roman" w:eastAsia="Times New Roman" w:hAnsi="Times New Roman"/>
+          <w:sz w:val="24"/>
+          <w:szCs w:val="24"/>
+        </w:rPr>
+        <w:t xml:space="preserve">Con sprints de una semana y un equipo de 3 personas, cada épica puede distribuirse en uno o más sprints según el número de historias y su estimación en puntos; el calendario exacto por sprint queda sujeto a la Sprint Planning de cada semana, conforme a la metodología descrita en la sección 6.</w:t>
+      </w:r>
+    </w:p>
+    <w:p>
+      <w:pPr>
         <w:spacing w:after="240" w:before="240" w:line="480"/>
         <w:jc w:val="center"/>
       </w:pPr>
@@ -7133,7 +7494,573 @@
           <w:sz w:val="24"/>
           <w:szCs w:val="24"/>
         </w:rPr>
-        <w:t xml:space="preserve">9. Conclusiones</w:t>
+        <w:t xml:space="preserve">9. Riesgos y mitigación</w:t>
+      </w:r>
+    </w:p>
+    <w:tbl>
+      <w:tblPr>
+        <w:tblW w:type="dxa" w:w="9026"/>
+        <w:tblBorders>
+          <w:top w:val="single" w:color="000000" w:sz="6"/>
+          <w:left w:val="none" w:color="FFFFFF" w:sz="0"/>
+          <w:bottom w:val="single" w:color="000000" w:sz="6"/>
+          <w:right w:val="none" w:color="FFFFFF" w:sz="0"/>
+          <w:insideH w:val="single" w:color="999999" w:sz="2"/>
+          <w:insideV w:val="none" w:color="FFFFFF" w:sz="0"/>
+        </w:tblBorders>
+      </w:tblPr>
+      <w:tblGrid>
+        <w:gridCol w:w="3008"/>
+        <w:gridCol w:w="3008"/>
+        <w:gridCol w:w="3010"/>
+      </w:tblGrid>
+      <w:tr>
+        <w:trPr>
+          <w:tblHeader/>
+        </w:trPr>
+        <w:tc>
+          <w:tcPr>
+            <w:tcW w:type="dxa" w:w="3008"/>
+            <w:tcMar>
+              <w:top w:type="dxa" w:w="80"/>
+              <w:left w:type="dxa" w:w="100"/>
+              <w:bottom w:type="dxa" w:w="80"/>
+              <w:right w:type="dxa" w:w="100"/>
+            </w:tcMar>
+          </w:tcPr>
+          <w:p>
+            <w:pPr>
+              <w:spacing w:line="276"/>
+            </w:pPr>
+            <w:r>
+              <w:rPr>
+                <w:rFonts w:ascii="Times New Roman" w:cs="Times New Roman" w:eastAsia="Times New Roman" w:hAnsi="Times New Roman"/>
+                <w:b/>
+                <w:bCs/>
+                <w:sz w:val="22"/>
+                <w:szCs w:val="22"/>
+              </w:rPr>
+              <w:t xml:space="preserve">Riesgo</w:t>
+            </w:r>
+          </w:p>
+        </w:tc>
+        <w:tc>
+          <w:tcPr>
+            <w:tcW w:type="dxa" w:w="3008"/>
+            <w:tcMar>
+              <w:top w:type="dxa" w:w="80"/>
+              <w:left w:type="dxa" w:w="100"/>
+              <w:bottom w:type="dxa" w:w="80"/>
+              <w:right w:type="dxa" w:w="100"/>
+            </w:tcMar>
+          </w:tcPr>
+          <w:p>
+            <w:pPr>
+              <w:spacing w:line="276"/>
+            </w:pPr>
+            <w:r>
+              <w:rPr>
+                <w:rFonts w:ascii="Times New Roman" w:cs="Times New Roman" w:eastAsia="Times New Roman" w:hAnsi="Times New Roman"/>
+                <w:b/>
+                <w:bCs/>
+                <w:sz w:val="22"/>
+                <w:szCs w:val="22"/>
+              </w:rPr>
+              <w:t xml:space="preserve">Origen</w:t>
+            </w:r>
+          </w:p>
+        </w:tc>
+        <w:tc>
+          <w:tcPr>
+            <w:tcW w:type="dxa" w:w="3010"/>
+            <w:tcMar>
+              <w:top w:type="dxa" w:w="80"/>
+              <w:left w:type="dxa" w:w="100"/>
+              <w:bottom w:type="dxa" w:w="80"/>
+              <w:right w:type="dxa" w:w="100"/>
+            </w:tcMar>
+          </w:tcPr>
+          <w:p>
+            <w:pPr>
+              <w:spacing w:line="276"/>
+            </w:pPr>
+            <w:r>
+              <w:rPr>
+                <w:rFonts w:ascii="Times New Roman" w:cs="Times New Roman" w:eastAsia="Times New Roman" w:hAnsi="Times New Roman"/>
+                <w:b/>
+                <w:bCs/>
+                <w:sz w:val="22"/>
+                <w:szCs w:val="22"/>
+              </w:rPr>
+              <w:t xml:space="preserve">Mitigación propuesta</w:t>
+            </w:r>
+          </w:p>
+        </w:tc>
+      </w:tr>
+      <w:tr>
+        <w:tc>
+          <w:tcPr>
+            <w:tcW w:type="dxa" w:w="3008"/>
+            <w:tcMar>
+              <w:top w:type="dxa" w:w="80"/>
+              <w:left w:type="dxa" w:w="100"/>
+              <w:bottom w:type="dxa" w:w="80"/>
+              <w:right w:type="dxa" w:w="100"/>
+            </w:tcMar>
+          </w:tcPr>
+          <w:p>
+            <w:pPr>
+              <w:spacing w:line="276"/>
+            </w:pPr>
+            <w:r>
+              <w:rPr>
+                <w:rFonts w:ascii="Times New Roman" w:cs="Times New Roman" w:eastAsia="Times New Roman" w:hAnsi="Times New Roman"/>
+                <w:sz w:val="22"/>
+                <w:szCs w:val="22"/>
+              </w:rPr>
+              <w:t xml:space="preserve">Migraciones de esquema descoordinadas entre servicios que comparten la base de datos</w:t>
+            </w:r>
+          </w:p>
+        </w:tc>
+        <w:tc>
+          <w:tcPr>
+            <w:tcW w:type="dxa" w:w="3008"/>
+            <w:tcMar>
+              <w:top w:type="dxa" w:w="80"/>
+              <w:left w:type="dxa" w:w="100"/>
+              <w:bottom w:type="dxa" w:w="80"/>
+              <w:right w:type="dxa" w:w="100"/>
+            </w:tcMar>
+          </w:tcPr>
+          <w:p>
+            <w:pPr>
+              <w:spacing w:line="276"/>
+            </w:pPr>
+            <w:r>
+              <w:rPr>
+                <w:rFonts w:ascii="Times New Roman" w:cs="Times New Roman" w:eastAsia="Times New Roman" w:hAnsi="Times New Roman"/>
+                <w:sz w:val="22"/>
+                <w:szCs w:val="22"/>
+              </w:rPr>
+              <w:t xml:space="preserve">ADR-002, ADR-009</w:t>
+            </w:r>
+          </w:p>
+        </w:tc>
+        <w:tc>
+          <w:tcPr>
+            <w:tcW w:type="dxa" w:w="3010"/>
+            <w:tcMar>
+              <w:top w:type="dxa" w:w="80"/>
+              <w:left w:type="dxa" w:w="100"/>
+              <w:bottom w:type="dxa" w:w="80"/>
+              <w:right w:type="dxa" w:w="100"/>
+            </w:tcMar>
+          </w:tcPr>
+          <w:p>
+            <w:pPr>
+              <w:spacing w:line="276"/>
+            </w:pPr>
+            <w:r>
+              <w:rPr>
+                <w:rFonts w:ascii="Times New Roman" w:cs="Times New Roman" w:eastAsia="Times New Roman" w:hAnsi="Times New Roman"/>
+                <w:sz w:val="22"/>
+                <w:szCs w:val="22"/>
+              </w:rPr>
+              <w:t xml:space="preserve">Orden de ejecución fijo entre repositorios de migración y revisión obligatoria antes de desplegar cambios de esquema</w:t>
+            </w:r>
+          </w:p>
+        </w:tc>
+      </w:tr>
+      <w:tr>
+        <w:tc>
+          <w:tcPr>
+            <w:tcW w:type="dxa" w:w="3008"/>
+            <w:tcMar>
+              <w:top w:type="dxa" w:w="80"/>
+              <w:left w:type="dxa" w:w="100"/>
+              <w:bottom w:type="dxa" w:w="80"/>
+              <w:right w:type="dxa" w:w="100"/>
+            </w:tcMar>
+          </w:tcPr>
+          <w:p>
+            <w:pPr>
+              <w:spacing w:line="276"/>
+            </w:pPr>
+            <w:r>
+              <w:rPr>
+                <w:rFonts w:ascii="Times New Roman" w:cs="Times New Roman" w:eastAsia="Times New Roman" w:hAnsi="Times New Roman"/>
+                <w:sz w:val="22"/>
+                <w:szCs w:val="22"/>
+              </w:rPr>
+              <w:t xml:space="preserve">Referencias residuales a Supabase en el frontend</w:t>
+            </w:r>
+          </w:p>
+        </w:tc>
+        <w:tc>
+          <w:tcPr>
+            <w:tcW w:type="dxa" w:w="3008"/>
+            <w:tcMar>
+              <w:top w:type="dxa" w:w="80"/>
+              <w:left w:type="dxa" w:w="100"/>
+              <w:bottom w:type="dxa" w:w="80"/>
+              <w:right w:type="dxa" w:w="100"/>
+            </w:tcMar>
+          </w:tcPr>
+          <w:p>
+            <w:pPr>
+              <w:spacing w:line="276"/>
+            </w:pPr>
+            <w:r>
+              <w:rPr>
+                <w:rFonts w:ascii="Times New Roman" w:cs="Times New Roman" w:eastAsia="Times New Roman" w:hAnsi="Times New Roman"/>
+                <w:sz w:val="22"/>
+                <w:szCs w:val="22"/>
+              </w:rPr>
+              <w:t xml:space="preserve">ADR-007</w:t>
+            </w:r>
+          </w:p>
+        </w:tc>
+        <w:tc>
+          <w:tcPr>
+            <w:tcW w:type="dxa" w:w="3010"/>
+            <w:tcMar>
+              <w:top w:type="dxa" w:w="80"/>
+              <w:left w:type="dxa" w:w="100"/>
+              <w:bottom w:type="dxa" w:w="80"/>
+              <w:right w:type="dxa" w:w="100"/>
+            </w:tcMar>
+          </w:tcPr>
+          <w:p>
+            <w:pPr>
+              <w:spacing w:line="276"/>
+            </w:pPr>
+            <w:r>
+              <w:rPr>
+                <w:rFonts w:ascii="Times New Roman" w:cs="Times New Roman" w:eastAsia="Times New Roman" w:hAnsi="Times New Roman"/>
+                <w:sz w:val="22"/>
+                <w:szCs w:val="22"/>
+              </w:rPr>
+              <w:t xml:space="preserve">Tratarlas como deuda técnica explícita; no ampliarlas sin actualizar el ADR correspondiente</w:t>
+            </w:r>
+          </w:p>
+        </w:tc>
+      </w:tr>
+      <w:tr>
+        <w:tc>
+          <w:tcPr>
+            <w:tcW w:type="dxa" w:w="3008"/>
+            <w:tcMar>
+              <w:top w:type="dxa" w:w="80"/>
+              <w:left w:type="dxa" w:w="100"/>
+              <w:bottom w:type="dxa" w:w="80"/>
+              <w:right w:type="dxa" w:w="100"/>
+            </w:tcMar>
+          </w:tcPr>
+          <w:p>
+            <w:pPr>
+              <w:spacing w:line="276"/>
+            </w:pPr>
+            <w:r>
+              <w:rPr>
+                <w:rFonts w:ascii="Times New Roman" w:cs="Times New Roman" w:eastAsia="Times New Roman" w:hAnsi="Times New Roman"/>
+                <w:sz w:val="22"/>
+                <w:szCs w:val="22"/>
+              </w:rPr>
+              <w:t xml:space="preserve">Rutas de contratos de alquiler expuestas fuera del alcance del MVP</w:t>
+            </w:r>
+          </w:p>
+        </w:tc>
+        <w:tc>
+          <w:tcPr>
+            <w:tcW w:type="dxa" w:w="3008"/>
+            <w:tcMar>
+              <w:top w:type="dxa" w:w="80"/>
+              <w:left w:type="dxa" w:w="100"/>
+              <w:bottom w:type="dxa" w:w="80"/>
+              <w:right w:type="dxa" w:w="100"/>
+            </w:tcMar>
+          </w:tcPr>
+          <w:p>
+            <w:pPr>
+              <w:spacing w:line="276"/>
+            </w:pPr>
+            <w:r>
+              <w:rPr>
+                <w:rFonts w:ascii="Times New Roman" w:cs="Times New Roman" w:eastAsia="Times New Roman" w:hAnsi="Times New Roman"/>
+                <w:sz w:val="22"/>
+                <w:szCs w:val="22"/>
+              </w:rPr>
+              <w:t xml:space="preserve">ADR-008</w:t>
+            </w:r>
+          </w:p>
+        </w:tc>
+        <w:tc>
+          <w:tcPr>
+            <w:tcW w:type="dxa" w:w="3010"/>
+            <w:tcMar>
+              <w:top w:type="dxa" w:w="80"/>
+              <w:left w:type="dxa" w:w="100"/>
+              <w:bottom w:type="dxa" w:w="80"/>
+              <w:right w:type="dxa" w:w="100"/>
+            </w:tcMar>
+          </w:tcPr>
+          <w:p>
+            <w:pPr>
+              <w:spacing w:line="276"/>
+            </w:pPr>
+            <w:r>
+              <w:rPr>
+                <w:rFonts w:ascii="Times New Roman" w:cs="Times New Roman" w:eastAsia="Times New Roman" w:hAnsi="Times New Roman"/>
+                <w:sz w:val="22"/>
+                <w:szCs w:val="22"/>
+              </w:rPr>
+              <w:t xml:space="preserve">Ocultar o remover la navegación activa hacia esas rutas hasta que exista un cambio de alcance aprobado</w:t>
+            </w:r>
+          </w:p>
+        </w:tc>
+      </w:tr>
+      <w:tr>
+        <w:tc>
+          <w:tcPr>
+            <w:tcW w:type="dxa" w:w="3008"/>
+            <w:tcMar>
+              <w:top w:type="dxa" w:w="80"/>
+              <w:left w:type="dxa" w:w="100"/>
+              <w:bottom w:type="dxa" w:w="80"/>
+              <w:right w:type="dxa" w:w="100"/>
+            </w:tcMar>
+          </w:tcPr>
+          <w:p>
+            <w:pPr>
+              <w:spacing w:line="276"/>
+            </w:pPr>
+            <w:r>
+              <w:rPr>
+                <w:rFonts w:ascii="Times New Roman" w:cs="Times New Roman" w:eastAsia="Times New Roman" w:hAnsi="Times New Roman"/>
+                <w:sz w:val="22"/>
+                <w:szCs w:val="22"/>
+              </w:rPr>
+              <w:t xml:space="preserve">Convenciones de carpetas inconsistentes en el frontend web (mayúsculas/minúsculas)</w:t>
+            </w:r>
+          </w:p>
+        </w:tc>
+        <w:tc>
+          <w:tcPr>
+            <w:tcW w:type="dxa" w:w="3008"/>
+            <w:tcMar>
+              <w:top w:type="dxa" w:w="80"/>
+              <w:left w:type="dxa" w:w="100"/>
+              <w:bottom w:type="dxa" w:w="80"/>
+              <w:right w:type="dxa" w:w="100"/>
+            </w:tcMar>
+          </w:tcPr>
+          <w:p>
+            <w:pPr>
+              <w:spacing w:line="276"/>
+            </w:pPr>
+            <w:r>
+              <w:rPr>
+                <w:rFonts w:ascii="Times New Roman" w:cs="Times New Roman" w:eastAsia="Times New Roman" w:hAnsi="Times New Roman"/>
+                <w:sz w:val="22"/>
+                <w:szCs w:val="22"/>
+              </w:rPr>
+              <w:t xml:space="preserve">ADR-006</w:t>
+            </w:r>
+          </w:p>
+        </w:tc>
+        <w:tc>
+          <w:tcPr>
+            <w:tcW w:type="dxa" w:w="3010"/>
+            <w:tcMar>
+              <w:top w:type="dxa" w:w="80"/>
+              <w:left w:type="dxa" w:w="100"/>
+              <w:bottom w:type="dxa" w:w="80"/>
+              <w:right w:type="dxa" w:w="100"/>
+            </w:tcMar>
+          </w:tcPr>
+          <w:p>
+            <w:pPr>
+              <w:spacing w:line="276"/>
+            </w:pPr>
+            <w:r>
+              <w:rPr>
+                <w:rFonts w:ascii="Times New Roman" w:cs="Times New Roman" w:eastAsia="Times New Roman" w:hAnsi="Times New Roman"/>
+                <w:sz w:val="22"/>
+                <w:szCs w:val="22"/>
+              </w:rPr>
+              <w:t xml:space="preserve">Exigir la convención estandarizada en código nuevo; migración incremental del código existente</w:t>
+            </w:r>
+          </w:p>
+        </w:tc>
+      </w:tr>
+      <w:tr>
+        <w:tc>
+          <w:tcPr>
+            <w:tcW w:type="dxa" w:w="3008"/>
+            <w:tcMar>
+              <w:top w:type="dxa" w:w="80"/>
+              <w:left w:type="dxa" w:w="100"/>
+              <w:bottom w:type="dxa" w:w="80"/>
+              <w:right w:type="dxa" w:w="100"/>
+            </w:tcMar>
+          </w:tcPr>
+          <w:p>
+            <w:pPr>
+              <w:spacing w:line="276"/>
+            </w:pPr>
+            <w:r>
+              <w:rPr>
+                <w:rFonts w:ascii="Times New Roman" w:cs="Times New Roman" w:eastAsia="Times New Roman" w:hAnsi="Times New Roman"/>
+                <w:sz w:val="22"/>
+                <w:szCs w:val="22"/>
+              </w:rPr>
+              <w:t xml:space="preserve">Backlog con cronograma de sprints sin asignar</w:t>
+            </w:r>
+          </w:p>
+        </w:tc>
+        <w:tc>
+          <w:tcPr>
+            <w:tcW w:type="dxa" w:w="3008"/>
+            <w:tcMar>
+              <w:top w:type="dxa" w:w="80"/>
+              <w:left w:type="dxa" w:w="100"/>
+              <w:bottom w:type="dxa" w:w="80"/>
+              <w:right w:type="dxa" w:w="100"/>
+            </w:tcMar>
+          </w:tcPr>
+          <w:p>
+            <w:pPr>
+              <w:spacing w:line="276"/>
+            </w:pPr>
+            <w:r>
+              <w:rPr>
+                <w:rFonts w:ascii="Times New Roman" w:cs="Times New Roman" w:eastAsia="Times New Roman" w:hAnsi="Times New Roman"/>
+                <w:sz w:val="22"/>
+                <w:szCs w:val="22"/>
+              </w:rPr>
+              <w:t xml:space="preserve">04-requirements/user-stories.md</w:t>
+            </w:r>
+          </w:p>
+        </w:tc>
+        <w:tc>
+          <w:tcPr>
+            <w:tcW w:type="dxa" w:w="3010"/>
+            <w:tcMar>
+              <w:top w:type="dxa" w:w="80"/>
+              <w:left w:type="dxa" w:w="100"/>
+              <w:bottom w:type="dxa" w:w="80"/>
+              <w:right w:type="dxa" w:w="100"/>
+            </w:tcMar>
+          </w:tcPr>
+          <w:p>
+            <w:pPr>
+              <w:spacing w:line="276"/>
+            </w:pPr>
+            <w:r>
+              <w:rPr>
+                <w:rFonts w:ascii="Times New Roman" w:cs="Times New Roman" w:eastAsia="Times New Roman" w:hAnsi="Times New Roman"/>
+                <w:sz w:val="22"/>
+                <w:szCs w:val="22"/>
+              </w:rPr>
+              <w:t xml:space="preserve">Priorizar la asignación de sprints siguiendo el orden de dependencia propuesto en la sección 7</w:t>
+            </w:r>
+          </w:p>
+        </w:tc>
+      </w:tr>
+      <w:tr>
+        <w:tc>
+          <w:tcPr>
+            <w:tcW w:type="dxa" w:w="3008"/>
+            <w:tcMar>
+              <w:top w:type="dxa" w:w="80"/>
+              <w:left w:type="dxa" w:w="100"/>
+              <w:bottom w:type="dxa" w:w="80"/>
+              <w:right w:type="dxa" w:w="100"/>
+            </w:tcMar>
+          </w:tcPr>
+          <w:p>
+            <w:pPr>
+              <w:spacing w:line="276"/>
+            </w:pPr>
+            <w:r>
+              <w:rPr>
+                <w:rFonts w:ascii="Times New Roman" w:cs="Times New Roman" w:eastAsia="Times New Roman" w:hAnsi="Times New Roman"/>
+                <w:sz w:val="22"/>
+                <w:szCs w:val="22"/>
+              </w:rPr>
+              <w:t xml:space="preserve">Desacuerdo de estimación entre integrantes del equipo</w:t>
+            </w:r>
+          </w:p>
+        </w:tc>
+        <w:tc>
+          <w:tcPr>
+            <w:tcW w:type="dxa" w:w="3008"/>
+            <w:tcMar>
+              <w:top w:type="dxa" w:w="80"/>
+              <w:left w:type="dxa" w:w="100"/>
+              <w:bottom w:type="dxa" w:w="80"/>
+              <w:right w:type="dxa" w:w="100"/>
+            </w:tcMar>
+          </w:tcPr>
+          <w:p>
+            <w:pPr>
+              <w:spacing w:line="276"/>
+            </w:pPr>
+            <w:r>
+              <w:rPr>
+                <w:rFonts w:ascii="Times New Roman" w:cs="Times New Roman" w:eastAsia="Times New Roman" w:hAnsi="Times New Roman"/>
+                <w:sz w:val="22"/>
+                <w:szCs w:val="22"/>
+              </w:rPr>
+              <w:t xml:space="preserve">00-governance/agile-conventions.md</w:t>
+            </w:r>
+          </w:p>
+        </w:tc>
+        <w:tc>
+          <w:tcPr>
+            <w:tcW w:type="dxa" w:w="3010"/>
+            <w:tcMar>
+              <w:top w:type="dxa" w:w="80"/>
+              <w:left w:type="dxa" w:w="100"/>
+              <w:bottom w:type="dxa" w:w="80"/>
+              <w:right w:type="dxa" w:w="100"/>
+            </w:tcMar>
+          </w:tcPr>
+          <w:p>
+            <w:pPr>
+              <w:spacing w:line="276"/>
+            </w:pPr>
+            <w:r>
+              <w:rPr>
+                <w:rFonts w:ascii="Times New Roman" w:cs="Times New Roman" w:eastAsia="Times New Roman" w:hAnsi="Times New Roman"/>
+                <w:sz w:val="22"/>
+                <w:szCs w:val="22"/>
+              </w:rPr>
+              <w:t xml:space="preserve">Planning Poker con regla de discusión obligatoria ante diferencias de 2 o más niveles en la escala Fibonacci</w:t>
+            </w:r>
+          </w:p>
+        </w:tc>
+      </w:tr>
+    </w:tbl>
+    <w:p>
+      <w:pPr>
+        <w:spacing w:after="160"/>
+      </w:pPr>
+    </w:p>
+    <w:p>
+      <w:pPr>
+        <w:spacing w:after="240" w:before="240" w:line="480"/>
+        <w:jc w:val="center"/>
+      </w:pPr>
+      <w:r>
+        <w:rPr>
+          <w:rFonts w:ascii="Times New Roman" w:cs="Times New Roman" w:eastAsia="Times New Roman" w:hAnsi="Times New Roman"/>
+          <w:b/>
+          <w:bCs/>
+          <w:sz w:val="24"/>
+          <w:szCs w:val="24"/>
+        </w:rPr>
+        <w:t xml:space="preserve">10. Conclusiones</w:t>
       </w:r>
     </w:p>
     <w:p>

</xml_diff>

<commit_message>
docs: add estimated budget to technical proposal
GPS module/materials, electronics, transportation, contingency —
COP 600,000 team-funded academic estimate, section 7.4.
</commit_message>
<xml_diff>
--- a/03-documentacion-propuesta-tecnica/Documentacion_Propuesta_Tecnica_RentaMovil_APA_Espanol.docx
+++ b/03-documentacion-propuesta-tecnica/Documentacion_Propuesta_Tecnica_RentaMovil_APA_Espanol.docx
@@ -6778,7 +6778,531 @@
           <w:sz w:val="24"/>
           <w:szCs w:val="24"/>
         </w:rPr>
-        <w:t xml:space="preserve">El proyecto no requiere servidores de producción: el desarrollo, las pruebas y la integración se realizan en los equipos de cómputo de los integrantes del equipo y en contenedores Docker locales. Las pruebas de la aplicación móvil se realizan sobre emuladores (Android/iOS) o dispositivos físicos propios del equipo, sin infraestructura adicional.</w:t>
+        <w:t xml:space="preserve">El proyecto no requiere servidores de producción: el desarrollo, las pruebas y la integración se realizan en los equipos de cómputo de los integrantes del equipo y en contenedores Docker locales. Las pruebas de la aplicación móvil se realizan sobre emuladores (Android/iOS) o dispositivos físicos propios del equipo, sin infraestructura adicional. La excepción es el módulo de Telemetría y GPS: para validar la integración real con un dispositivo GPS, el equipo adquirió un módulo físico y sus componentes, descritos en el presupuesto de la sección 7.4.</w:t>
+      </w:r>
+    </w:p>
+    <w:p>
+      <w:pPr>
+        <w:spacing w:after="160" w:before="200" w:line="480"/>
+        <w:jc w:val="left"/>
+      </w:pPr>
+      <w:r>
+        <w:rPr>
+          <w:rFonts w:ascii="Times New Roman" w:cs="Times New Roman" w:eastAsia="Times New Roman" w:hAnsi="Times New Roman"/>
+          <w:b/>
+          <w:bCs/>
+          <w:sz w:val="24"/>
+          <w:szCs w:val="24"/>
+        </w:rPr>
+        <w:t xml:space="preserve">7.4 Presupuesto estimado</w:t>
+      </w:r>
+    </w:p>
+    <w:p>
+      <w:pPr>
+        <w:spacing w:after="200" w:line="480"/>
+        <w:jc w:val="both"/>
+      </w:pPr>
+      <w:r>
+        <w:rPr>
+          <w:rFonts w:ascii="Times New Roman" w:cs="Times New Roman" w:eastAsia="Times New Roman" w:hAnsi="Times New Roman"/>
+          <w:sz w:val="24"/>
+          <w:szCs w:val="24"/>
+        </w:rPr>
+        <w:t xml:space="preserve">Los siguientes son los gastos en los que el equipo ha incurrido hasta la fecha, con cargo a recursos propios de sus integrantes, principalmente para la validación física del módulo de Telemetría y GPS:</w:t>
+      </w:r>
+    </w:p>
+    <w:tbl>
+      <w:tblPr>
+        <w:tblW w:type="dxa" w:w="9026"/>
+        <w:tblBorders>
+          <w:top w:val="single" w:color="000000" w:sz="6"/>
+          <w:left w:val="none" w:color="FFFFFF" w:sz="0"/>
+          <w:bottom w:val="single" w:color="000000" w:sz="6"/>
+          <w:right w:val="none" w:color="FFFFFF" w:sz="0"/>
+          <w:insideH w:val="single" w:color="999999" w:sz="2"/>
+          <w:insideV w:val="none" w:color="FFFFFF" w:sz="0"/>
+        </w:tblBorders>
+      </w:tblPr>
+      <w:tblGrid>
+        <w:gridCol w:w="3008"/>
+        <w:gridCol w:w="3008"/>
+        <w:gridCol w:w="3010"/>
+      </w:tblGrid>
+      <w:tr>
+        <w:trPr>
+          <w:tblHeader/>
+        </w:trPr>
+        <w:tc>
+          <w:tcPr>
+            <w:tcW w:type="dxa" w:w="3008"/>
+            <w:tcMar>
+              <w:top w:type="dxa" w:w="80"/>
+              <w:left w:type="dxa" w:w="100"/>
+              <w:bottom w:type="dxa" w:w="80"/>
+              <w:right w:type="dxa" w:w="100"/>
+            </w:tcMar>
+          </w:tcPr>
+          <w:p>
+            <w:pPr>
+              <w:spacing w:line="276"/>
+            </w:pPr>
+            <w:r>
+              <w:rPr>
+                <w:rFonts w:ascii="Times New Roman" w:cs="Times New Roman" w:eastAsia="Times New Roman" w:hAnsi="Times New Roman"/>
+                <w:b/>
+                <w:bCs/>
+                <w:sz w:val="22"/>
+                <w:szCs w:val="22"/>
+              </w:rPr>
+              <w:t xml:space="preserve">Ítem</w:t>
+            </w:r>
+          </w:p>
+        </w:tc>
+        <w:tc>
+          <w:tcPr>
+            <w:tcW w:type="dxa" w:w="3008"/>
+            <w:tcMar>
+              <w:top w:type="dxa" w:w="80"/>
+              <w:left w:type="dxa" w:w="100"/>
+              <w:bottom w:type="dxa" w:w="80"/>
+              <w:right w:type="dxa" w:w="100"/>
+            </w:tcMar>
+          </w:tcPr>
+          <w:p>
+            <w:pPr>
+              <w:spacing w:line="276"/>
+            </w:pPr>
+            <w:r>
+              <w:rPr>
+                <w:rFonts w:ascii="Times New Roman" w:cs="Times New Roman" w:eastAsia="Times New Roman" w:hAnsi="Times New Roman"/>
+                <w:b/>
+                <w:bCs/>
+                <w:sz w:val="22"/>
+                <w:szCs w:val="22"/>
+              </w:rPr>
+              <w:t xml:space="preserve">Descripción</w:t>
+            </w:r>
+          </w:p>
+        </w:tc>
+        <w:tc>
+          <w:tcPr>
+            <w:tcW w:type="dxa" w:w="3010"/>
+            <w:tcMar>
+              <w:top w:type="dxa" w:w="80"/>
+              <w:left w:type="dxa" w:w="100"/>
+              <w:bottom w:type="dxa" w:w="80"/>
+              <w:right w:type="dxa" w:w="100"/>
+            </w:tcMar>
+          </w:tcPr>
+          <w:p>
+            <w:pPr>
+              <w:spacing w:line="276"/>
+            </w:pPr>
+            <w:r>
+              <w:rPr>
+                <w:rFonts w:ascii="Times New Roman" w:cs="Times New Roman" w:eastAsia="Times New Roman" w:hAnsi="Times New Roman"/>
+                <w:b/>
+                <w:bCs/>
+                <w:sz w:val="22"/>
+                <w:szCs w:val="22"/>
+              </w:rPr>
+              <w:t xml:space="preserve">Costo aproximado (COP)</w:t>
+            </w:r>
+          </w:p>
+        </w:tc>
+      </w:tr>
+      <w:tr>
+        <w:tc>
+          <w:tcPr>
+            <w:tcW w:type="dxa" w:w="3008"/>
+            <w:tcMar>
+              <w:top w:type="dxa" w:w="80"/>
+              <w:left w:type="dxa" w:w="100"/>
+              <w:bottom w:type="dxa" w:w="80"/>
+              <w:right w:type="dxa" w:w="100"/>
+            </w:tcMar>
+          </w:tcPr>
+          <w:p>
+            <w:pPr>
+              <w:spacing w:line="276"/>
+            </w:pPr>
+            <w:r>
+              <w:rPr>
+                <w:rFonts w:ascii="Times New Roman" w:cs="Times New Roman" w:eastAsia="Times New Roman" w:hAnsi="Times New Roman"/>
+                <w:sz w:val="22"/>
+                <w:szCs w:val="22"/>
+              </w:rPr>
+              <w:t xml:space="preserve">Módulo y materiales GPS</w:t>
+            </w:r>
+          </w:p>
+        </w:tc>
+        <w:tc>
+          <w:tcPr>
+            <w:tcW w:type="dxa" w:w="3008"/>
+            <w:tcMar>
+              <w:top w:type="dxa" w:w="80"/>
+              <w:left w:type="dxa" w:w="100"/>
+              <w:bottom w:type="dxa" w:w="80"/>
+              <w:right w:type="dxa" w:w="100"/>
+            </w:tcMar>
+          </w:tcPr>
+          <w:p>
+            <w:pPr>
+              <w:spacing w:line="276"/>
+            </w:pPr>
+            <w:r>
+              <w:rPr>
+                <w:rFonts w:ascii="Times New Roman" w:cs="Times New Roman" w:eastAsia="Times New Roman" w:hAnsi="Times New Roman"/>
+                <w:sz w:val="22"/>
+                <w:szCs w:val="22"/>
+              </w:rPr>
+              <w:t xml:space="preserve">Dispositivo GPS y componentes electrónicos para el prototipo de rastreo</w:t>
+            </w:r>
+          </w:p>
+        </w:tc>
+        <w:tc>
+          <w:tcPr>
+            <w:tcW w:type="dxa" w:w="3010"/>
+            <w:tcMar>
+              <w:top w:type="dxa" w:w="80"/>
+              <w:left w:type="dxa" w:w="100"/>
+              <w:bottom w:type="dxa" w:w="80"/>
+              <w:right w:type="dxa" w:w="100"/>
+            </w:tcMar>
+          </w:tcPr>
+          <w:p>
+            <w:pPr>
+              <w:spacing w:line="276"/>
+            </w:pPr>
+            <w:r>
+              <w:rPr>
+                <w:rFonts w:ascii="Times New Roman" w:cs="Times New Roman" w:eastAsia="Times New Roman" w:hAnsi="Times New Roman"/>
+                <w:sz w:val="22"/>
+                <w:szCs w:val="22"/>
+              </w:rPr>
+              <w:t xml:space="preserve">$300.000</w:t>
+            </w:r>
+          </w:p>
+        </w:tc>
+      </w:tr>
+      <w:tr>
+        <w:tc>
+          <w:tcPr>
+            <w:tcW w:type="dxa" w:w="3008"/>
+            <w:tcMar>
+              <w:top w:type="dxa" w:w="80"/>
+              <w:left w:type="dxa" w:w="100"/>
+              <w:bottom w:type="dxa" w:w="80"/>
+              <w:right w:type="dxa" w:w="100"/>
+            </w:tcMar>
+          </w:tcPr>
+          <w:p>
+            <w:pPr>
+              <w:spacing w:line="276"/>
+            </w:pPr>
+            <w:r>
+              <w:rPr>
+                <w:rFonts w:ascii="Times New Roman" w:cs="Times New Roman" w:eastAsia="Times New Roman" w:hAnsi="Times New Roman"/>
+                <w:sz w:val="22"/>
+                <w:szCs w:val="22"/>
+              </w:rPr>
+              <w:t xml:space="preserve">Insumos electrónicos adicionales</w:t>
+            </w:r>
+          </w:p>
+        </w:tc>
+        <w:tc>
+          <w:tcPr>
+            <w:tcW w:type="dxa" w:w="3008"/>
+            <w:tcMar>
+              <w:top w:type="dxa" w:w="80"/>
+              <w:left w:type="dxa" w:w="100"/>
+              <w:bottom w:type="dxa" w:w="80"/>
+              <w:right w:type="dxa" w:w="100"/>
+            </w:tcMar>
+          </w:tcPr>
+          <w:p>
+            <w:pPr>
+              <w:spacing w:line="276"/>
+            </w:pPr>
+            <w:r>
+              <w:rPr>
+                <w:rFonts w:ascii="Times New Roman" w:cs="Times New Roman" w:eastAsia="Times New Roman" w:hAnsi="Times New Roman"/>
+                <w:sz w:val="22"/>
+                <w:szCs w:val="22"/>
+              </w:rPr>
+              <w:t xml:space="preserve">Cables, conectores, protoboard y carcasa</w:t>
+            </w:r>
+          </w:p>
+        </w:tc>
+        <w:tc>
+          <w:tcPr>
+            <w:tcW w:type="dxa" w:w="3010"/>
+            <w:tcMar>
+              <w:top w:type="dxa" w:w="80"/>
+              <w:left w:type="dxa" w:w="100"/>
+              <w:bottom w:type="dxa" w:w="80"/>
+              <w:right w:type="dxa" w:w="100"/>
+            </w:tcMar>
+          </w:tcPr>
+          <w:p>
+            <w:pPr>
+              <w:spacing w:line="276"/>
+            </w:pPr>
+            <w:r>
+              <w:rPr>
+                <w:rFonts w:ascii="Times New Roman" w:cs="Times New Roman" w:eastAsia="Times New Roman" w:hAnsi="Times New Roman"/>
+                <w:sz w:val="22"/>
+                <w:szCs w:val="22"/>
+              </w:rPr>
+              <w:t xml:space="preserve">$150.000</w:t>
+            </w:r>
+          </w:p>
+        </w:tc>
+      </w:tr>
+      <w:tr>
+        <w:tc>
+          <w:tcPr>
+            <w:tcW w:type="dxa" w:w="3008"/>
+            <w:tcMar>
+              <w:top w:type="dxa" w:w="80"/>
+              <w:left w:type="dxa" w:w="100"/>
+              <w:bottom w:type="dxa" w:w="80"/>
+              <w:right w:type="dxa" w:w="100"/>
+            </w:tcMar>
+          </w:tcPr>
+          <w:p>
+            <w:pPr>
+              <w:spacing w:line="276"/>
+            </w:pPr>
+            <w:r>
+              <w:rPr>
+                <w:rFonts w:ascii="Times New Roman" w:cs="Times New Roman" w:eastAsia="Times New Roman" w:hAnsi="Times New Roman"/>
+                <w:sz w:val="22"/>
+                <w:szCs w:val="22"/>
+              </w:rPr>
+              <w:t xml:space="preserve">Transporte</w:t>
+            </w:r>
+          </w:p>
+        </w:tc>
+        <w:tc>
+          <w:tcPr>
+            <w:tcW w:type="dxa" w:w="3008"/>
+            <w:tcMar>
+              <w:top w:type="dxa" w:w="80"/>
+              <w:left w:type="dxa" w:w="100"/>
+              <w:bottom w:type="dxa" w:w="80"/>
+              <w:right w:type="dxa" w:w="100"/>
+            </w:tcMar>
+          </w:tcPr>
+          <w:p>
+            <w:pPr>
+              <w:spacing w:line="276"/>
+            </w:pPr>
+            <w:r>
+              <w:rPr>
+                <w:rFonts w:ascii="Times New Roman" w:cs="Times New Roman" w:eastAsia="Times New Roman" w:hAnsi="Times New Roman"/>
+                <w:sz w:val="22"/>
+                <w:szCs w:val="22"/>
+              </w:rPr>
+              <w:t xml:space="preserve">Desplazamiento para la compra de materiales</w:t>
+            </w:r>
+          </w:p>
+        </w:tc>
+        <w:tc>
+          <w:tcPr>
+            <w:tcW w:type="dxa" w:w="3010"/>
+            <w:tcMar>
+              <w:top w:type="dxa" w:w="80"/>
+              <w:left w:type="dxa" w:w="100"/>
+              <w:bottom w:type="dxa" w:w="80"/>
+              <w:right w:type="dxa" w:w="100"/>
+            </w:tcMar>
+          </w:tcPr>
+          <w:p>
+            <w:pPr>
+              <w:spacing w:line="276"/>
+            </w:pPr>
+            <w:r>
+              <w:rPr>
+                <w:rFonts w:ascii="Times New Roman" w:cs="Times New Roman" w:eastAsia="Times New Roman" w:hAnsi="Times New Roman"/>
+                <w:sz w:val="22"/>
+                <w:szCs w:val="22"/>
+              </w:rPr>
+              <w:t xml:space="preserve">$50.000</w:t>
+            </w:r>
+          </w:p>
+        </w:tc>
+      </w:tr>
+      <w:tr>
+        <w:tc>
+          <w:tcPr>
+            <w:tcW w:type="dxa" w:w="3008"/>
+            <w:tcMar>
+              <w:top w:type="dxa" w:w="80"/>
+              <w:left w:type="dxa" w:w="100"/>
+              <w:bottom w:type="dxa" w:w="80"/>
+              <w:right w:type="dxa" w:w="100"/>
+            </w:tcMar>
+          </w:tcPr>
+          <w:p>
+            <w:pPr>
+              <w:spacing w:line="276"/>
+            </w:pPr>
+            <w:r>
+              <w:rPr>
+                <w:rFonts w:ascii="Times New Roman" w:cs="Times New Roman" w:eastAsia="Times New Roman" w:hAnsi="Times New Roman"/>
+                <w:sz w:val="22"/>
+                <w:szCs w:val="22"/>
+              </w:rPr>
+              <w:t xml:space="preserve">Imprevistos y varios</w:t>
+            </w:r>
+          </w:p>
+        </w:tc>
+        <w:tc>
+          <w:tcPr>
+            <w:tcW w:type="dxa" w:w="3008"/>
+            <w:tcMar>
+              <w:top w:type="dxa" w:w="80"/>
+              <w:left w:type="dxa" w:w="100"/>
+              <w:bottom w:type="dxa" w:w="80"/>
+              <w:right w:type="dxa" w:w="100"/>
+            </w:tcMar>
+          </w:tcPr>
+          <w:p>
+            <w:pPr>
+              <w:spacing w:line="276"/>
+            </w:pPr>
+            <w:r>
+              <w:rPr>
+                <w:rFonts w:ascii="Times New Roman" w:cs="Times New Roman" w:eastAsia="Times New Roman" w:hAnsi="Times New Roman"/>
+                <w:sz w:val="22"/>
+                <w:szCs w:val="22"/>
+              </w:rPr>
+              <w:t xml:space="preserve">Gastos adicionales no planeados durante la compra e integración</w:t>
+            </w:r>
+          </w:p>
+        </w:tc>
+        <w:tc>
+          <w:tcPr>
+            <w:tcW w:type="dxa" w:w="3010"/>
+            <w:tcMar>
+              <w:top w:type="dxa" w:w="80"/>
+              <w:left w:type="dxa" w:w="100"/>
+              <w:bottom w:type="dxa" w:w="80"/>
+              <w:right w:type="dxa" w:w="100"/>
+            </w:tcMar>
+          </w:tcPr>
+          <w:p>
+            <w:pPr>
+              <w:spacing w:line="276"/>
+            </w:pPr>
+            <w:r>
+              <w:rPr>
+                <w:rFonts w:ascii="Times New Roman" w:cs="Times New Roman" w:eastAsia="Times New Roman" w:hAnsi="Times New Roman"/>
+                <w:sz w:val="22"/>
+                <w:szCs w:val="22"/>
+              </w:rPr>
+              <w:t xml:space="preserve">$100.000</w:t>
+            </w:r>
+          </w:p>
+        </w:tc>
+      </w:tr>
+      <w:tr>
+        <w:tc>
+          <w:tcPr>
+            <w:tcW w:type="dxa" w:w="3008"/>
+            <w:tcMar>
+              <w:top w:type="dxa" w:w="80"/>
+              <w:left w:type="dxa" w:w="100"/>
+              <w:bottom w:type="dxa" w:w="80"/>
+              <w:right w:type="dxa" w:w="100"/>
+            </w:tcMar>
+          </w:tcPr>
+          <w:p>
+            <w:pPr>
+              <w:spacing w:line="276"/>
+            </w:pPr>
+            <w:r>
+              <w:rPr>
+                <w:rFonts w:ascii="Times New Roman" w:cs="Times New Roman" w:eastAsia="Times New Roman" w:hAnsi="Times New Roman"/>
+                <w:b/>
+                <w:bCs/>
+                <w:sz w:val="22"/>
+                <w:szCs w:val="22"/>
+              </w:rPr>
+              <w:t xml:space="preserve">Total</w:t>
+            </w:r>
+          </w:p>
+        </w:tc>
+        <w:tc>
+          <w:tcPr>
+            <w:tcW w:type="dxa" w:w="3008"/>
+            <w:tcMar>
+              <w:top w:type="dxa" w:w="80"/>
+              <w:left w:type="dxa" w:w="100"/>
+              <w:bottom w:type="dxa" w:w="80"/>
+              <w:right w:type="dxa" w:w="100"/>
+            </w:tcMar>
+          </w:tcPr>
+          <w:p>
+            <w:pPr>
+              <w:spacing w:line="276"/>
+            </w:pPr>
+            <w:r>
+              <w:rPr>
+                <w:rFonts w:ascii="Times New Roman" w:cs="Times New Roman" w:eastAsia="Times New Roman" w:hAnsi="Times New Roman"/>
+                <w:sz w:val="22"/>
+                <w:szCs w:val="22"/>
+              </w:rPr>
+              <w:t xml:space="preserve"/>
+            </w:r>
+          </w:p>
+        </w:tc>
+        <w:tc>
+          <w:tcPr>
+            <w:tcW w:type="dxa" w:w="3010"/>
+            <w:tcMar>
+              <w:top w:type="dxa" w:w="80"/>
+              <w:left w:type="dxa" w:w="100"/>
+              <w:bottom w:type="dxa" w:w="80"/>
+              <w:right w:type="dxa" w:w="100"/>
+            </w:tcMar>
+          </w:tcPr>
+          <w:p>
+            <w:pPr>
+              <w:spacing w:line="276"/>
+            </w:pPr>
+            <w:r>
+              <w:rPr>
+                <w:rFonts w:ascii="Times New Roman" w:cs="Times New Roman" w:eastAsia="Times New Roman" w:hAnsi="Times New Roman"/>
+                <w:b/>
+                <w:bCs/>
+                <w:sz w:val="22"/>
+                <w:szCs w:val="22"/>
+              </w:rPr>
+              <w:t xml:space="preserve">$600.000</w:t>
+            </w:r>
+          </w:p>
+        </w:tc>
+      </w:tr>
+    </w:tbl>
+    <w:p>
+      <w:pPr>
+        <w:spacing w:after="160"/>
+      </w:pPr>
+    </w:p>
+    <w:p>
+      <w:pPr>
+        <w:spacing w:after="200" w:line="480"/>
+        <w:jc w:val="both"/>
+      </w:pPr>
+      <w:r>
+        <w:rPr>
+          <w:rFonts w:ascii="Times New Roman" w:cs="Times New Roman" w:eastAsia="Times New Roman" w:hAnsi="Times New Roman"/>
+          <w:sz w:val="24"/>
+          <w:szCs w:val="24"/>
+        </w:rPr>
+        <w:t xml:space="preserve">Esta cifra es un estimado de carácter académico, cubierto por el propio equipo, y no representa un presupuesto de despliegue en producción — ese análisis queda fuera del alcance académico del programa de formación, como ya se indica en la viabilidad económica (sección 5.3).</w:t>
       </w:r>
     </w:p>
     <w:p>

</xml_diff>

<commit_message>
docs: adjust budget line items in technical proposal
Electronic supplies to 50,000 and contingency to 200,000 (COP),
total unchanged at 600,000.
</commit_message>
<xml_diff>
--- a/03-documentacion-propuesta-tecnica/Documentacion_Propuesta_Tecnica_RentaMovil_APA_Espanol.docx
+++ b/03-documentacion-propuesta-tecnica/Documentacion_Propuesta_Tecnica_RentaMovil_APA_Espanol.docx
@@ -7054,7 +7054,7 @@
                 <w:sz w:val="22"/>
                 <w:szCs w:val="22"/>
               </w:rPr>
-              <w:t xml:space="preserve">$150.000</w:t>
+              <w:t xml:space="preserve">$50.000</w:t>
             </w:r>
           </w:p>
         </w:tc>
@@ -7202,7 +7202,7 @@
                 <w:sz w:val="22"/>
                 <w:szCs w:val="22"/>
               </w:rPr>
-              <w:t xml:space="preserve">$100.000</w:t>
+              <w:t xml:space="preserve">$200.000</w:t>
             </w:r>
           </w:p>
         </w:tc>

</xml_diff>

<commit_message>
docs: set contingency to 100,000 COP, total 500,000
Final budget line-item adjustment per feedback.
</commit_message>
<xml_diff>
--- a/03-documentacion-propuesta-tecnica/Documentacion_Propuesta_Tecnica_RentaMovil_APA_Espanol.docx
+++ b/03-documentacion-propuesta-tecnica/Documentacion_Propuesta_Tecnica_RentaMovil_APA_Espanol.docx
@@ -7202,7 +7202,7 @@
                 <w:sz w:val="22"/>
                 <w:szCs w:val="22"/>
               </w:rPr>
-              <w:t xml:space="preserve">$200.000</w:t>
+              <w:t xml:space="preserve">$100.000</w:t>
             </w:r>
           </w:p>
         </w:tc>
@@ -7280,7 +7280,7 @@
                 <w:sz w:val="22"/>
                 <w:szCs w:val="22"/>
               </w:rPr>
-              <w:t xml:space="preserve">$600.000</w:t>
+              <w:t xml:space="preserve">$500.000</w:t>
             </w:r>
           </w:p>
         </w:tc>

</xml_diff>

<commit_message>
docs: add estimated sprint duration per epic to the schedule
11 sprints total (~11 weeks), proportional to relative epic
complexity; no calendar dates since the team hasn't set a sprint 1
start date or recorded real velocity yet.
</commit_message>
<xml_diff>
--- a/03-documentacion-propuesta-tecnica/Documentacion_Propuesta_Tecnica_RentaMovil_APA_Espanol.docx
+++ b/03-documentacion-propuesta-tecnica/Documentacion_Propuesta_Tecnica_RentaMovil_APA_Espanol.docx
@@ -7380,9 +7380,10 @@
         </w:tblBorders>
       </w:tblPr>
       <w:tblGrid>
-        <w:gridCol w:w="3008"/>
-        <w:gridCol w:w="3008"/>
-        <w:gridCol w:w="3010"/>
+        <w:gridCol w:w="2256"/>
+        <w:gridCol w:w="2256"/>
+        <w:gridCol w:w="2256"/>
+        <w:gridCol w:w="2258"/>
       </w:tblGrid>
       <w:tr>
         <w:trPr>
@@ -7390,7 +7391,7 @@
         </w:trPr>
         <w:tc>
           <w:tcPr>
-            <w:tcW w:type="dxa" w:w="3008"/>
+            <w:tcW w:type="dxa" w:w="2256"/>
             <w:tcMar>
               <w:top w:type="dxa" w:w="80"/>
               <w:left w:type="dxa" w:w="100"/>
@@ -7416,7 +7417,7 @@
         </w:tc>
         <w:tc>
           <w:tcPr>
-            <w:tcW w:type="dxa" w:w="3008"/>
+            <w:tcW w:type="dxa" w:w="2256"/>
             <w:tcMar>
               <w:top w:type="dxa" w:w="80"/>
               <w:left w:type="dxa" w:w="100"/>
@@ -7442,7 +7443,7 @@
         </w:tc>
         <w:tc>
           <w:tcPr>
-            <w:tcW w:type="dxa" w:w="3010"/>
+            <w:tcW w:type="dxa" w:w="2256"/>
             <w:tcMar>
               <w:top w:type="dxa" w:w="80"/>
               <w:left w:type="dxa" w:w="100"/>
@@ -7466,11 +7467,37 @@
             </w:r>
           </w:p>
         </w:tc>
+        <w:tc>
+          <w:tcPr>
+            <w:tcW w:type="dxa" w:w="2258"/>
+            <w:tcMar>
+              <w:top w:type="dxa" w:w="80"/>
+              <w:left w:type="dxa" w:w="100"/>
+              <w:bottom w:type="dxa" w:w="80"/>
+              <w:right w:type="dxa" w:w="100"/>
+            </w:tcMar>
+          </w:tcPr>
+          <w:p>
+            <w:pPr>
+              <w:spacing w:line="276"/>
+            </w:pPr>
+            <w:r>
+              <w:rPr>
+                <w:rFonts w:ascii="Times New Roman" w:cs="Times New Roman" w:eastAsia="Times New Roman" w:hAnsi="Times New Roman"/>
+                <w:b/>
+                <w:bCs/>
+                <w:sz w:val="22"/>
+                <w:szCs w:val="22"/>
+              </w:rPr>
+              <w:t xml:space="preserve">Duración estimada</w:t>
+            </w:r>
+          </w:p>
+        </w:tc>
       </w:tr>
       <w:tr>
         <w:tc>
           <w:tcPr>
-            <w:tcW w:type="dxa" w:w="3008"/>
+            <w:tcW w:type="dxa" w:w="2256"/>
             <w:tcMar>
               <w:top w:type="dxa" w:w="80"/>
               <w:left w:type="dxa" w:w="100"/>
@@ -7494,7 +7521,7 @@
         </w:tc>
         <w:tc>
           <w:tcPr>
-            <w:tcW w:type="dxa" w:w="3008"/>
+            <w:tcW w:type="dxa" w:w="2256"/>
             <w:tcMar>
               <w:top w:type="dxa" w:w="80"/>
               <w:left w:type="dxa" w:w="100"/>
@@ -7518,7 +7545,7 @@
         </w:tc>
         <w:tc>
           <w:tcPr>
-            <w:tcW w:type="dxa" w:w="3010"/>
+            <w:tcW w:type="dxa" w:w="2256"/>
             <w:tcMar>
               <w:top w:type="dxa" w:w="80"/>
               <w:left w:type="dxa" w:w="100"/>
@@ -7537,6 +7564,30 @@
                 <w:szCs w:val="22"/>
               </w:rPr>
               <w:t xml:space="preserve">Ninguna — autenticación requerida por el resto</w:t>
+            </w:r>
+          </w:p>
+        </w:tc>
+        <w:tc>
+          <w:tcPr>
+            <w:tcW w:type="dxa" w:w="2258"/>
+            <w:tcMar>
+              <w:top w:type="dxa" w:w="80"/>
+              <w:left w:type="dxa" w:w="100"/>
+              <w:bottom w:type="dxa" w:w="80"/>
+              <w:right w:type="dxa" w:w="100"/>
+            </w:tcMar>
+          </w:tcPr>
+          <w:p>
+            <w:pPr>
+              <w:spacing w:line="276"/>
+            </w:pPr>
+            <w:r>
+              <w:rPr>
+                <w:rFonts w:ascii="Times New Roman" w:cs="Times New Roman" w:eastAsia="Times New Roman" w:hAnsi="Times New Roman"/>
+                <w:sz w:val="22"/>
+                <w:szCs w:val="22"/>
+              </w:rPr>
+              <w:t xml:space="preserve">2 sprints</w:t>
             </w:r>
           </w:p>
         </w:tc>
@@ -7544,7 +7595,7 @@
       <w:tr>
         <w:tc>
           <w:tcPr>
-            <w:tcW w:type="dxa" w:w="3008"/>
+            <w:tcW w:type="dxa" w:w="2256"/>
             <w:tcMar>
               <w:top w:type="dxa" w:w="80"/>
               <w:left w:type="dxa" w:w="100"/>
@@ -7568,7 +7619,7 @@
         </w:tc>
         <w:tc>
           <w:tcPr>
-            <w:tcW w:type="dxa" w:w="3008"/>
+            <w:tcW w:type="dxa" w:w="2256"/>
             <w:tcMar>
               <w:top w:type="dxa" w:w="80"/>
               <w:left w:type="dxa" w:w="100"/>
@@ -7592,7 +7643,7 @@
         </w:tc>
         <w:tc>
           <w:tcPr>
-            <w:tcW w:type="dxa" w:w="3010"/>
+            <w:tcW w:type="dxa" w:w="2256"/>
             <w:tcMar>
               <w:top w:type="dxa" w:w="80"/>
               <w:left w:type="dxa" w:w="100"/>
@@ -7611,6 +7662,30 @@
                 <w:szCs w:val="22"/>
               </w:rPr>
               <w:t xml:space="preserve">Identity &amp; Access (roles y permisos)</w:t>
+            </w:r>
+          </w:p>
+        </w:tc>
+        <w:tc>
+          <w:tcPr>
+            <w:tcW w:type="dxa" w:w="2258"/>
+            <w:tcMar>
+              <w:top w:type="dxa" w:w="80"/>
+              <w:left w:type="dxa" w:w="100"/>
+              <w:bottom w:type="dxa" w:w="80"/>
+              <w:right w:type="dxa" w:w="100"/>
+            </w:tcMar>
+          </w:tcPr>
+          <w:p>
+            <w:pPr>
+              <w:spacing w:line="276"/>
+            </w:pPr>
+            <w:r>
+              <w:rPr>
+                <w:rFonts w:ascii="Times New Roman" w:cs="Times New Roman" w:eastAsia="Times New Roman" w:hAnsi="Times New Roman"/>
+                <w:sz w:val="22"/>
+                <w:szCs w:val="22"/>
+              </w:rPr>
+              <w:t xml:space="preserve">2 sprints</w:t>
             </w:r>
           </w:p>
         </w:tc>
@@ -7618,7 +7693,7 @@
       <w:tr>
         <w:tc>
           <w:tcPr>
-            <w:tcW w:type="dxa" w:w="3008"/>
+            <w:tcW w:type="dxa" w:w="2256"/>
             <w:tcMar>
               <w:top w:type="dxa" w:w="80"/>
               <w:left w:type="dxa" w:w="100"/>
@@ -7642,7 +7717,7 @@
         </w:tc>
         <w:tc>
           <w:tcPr>
-            <w:tcW w:type="dxa" w:w="3008"/>
+            <w:tcW w:type="dxa" w:w="2256"/>
             <w:tcMar>
               <w:top w:type="dxa" w:w="80"/>
               <w:left w:type="dxa" w:w="100"/>
@@ -7666,7 +7741,7 @@
         </w:tc>
         <w:tc>
           <w:tcPr>
-            <w:tcW w:type="dxa" w:w="3010"/>
+            <w:tcW w:type="dxa" w:w="2256"/>
             <w:tcMar>
               <w:top w:type="dxa" w:w="80"/>
               <w:left w:type="dxa" w:w="100"/>
@@ -7685,6 +7760,30 @@
                 <w:szCs w:val="22"/>
               </w:rPr>
               <w:t xml:space="preserve">Fleet &amp; Maintenance (vehículos a rastrear)</w:t>
+            </w:r>
+          </w:p>
+        </w:tc>
+        <w:tc>
+          <w:tcPr>
+            <w:tcW w:type="dxa" w:w="2258"/>
+            <w:tcMar>
+              <w:top w:type="dxa" w:w="80"/>
+              <w:left w:type="dxa" w:w="100"/>
+              <w:bottom w:type="dxa" w:w="80"/>
+              <w:right w:type="dxa" w:w="100"/>
+            </w:tcMar>
+          </w:tcPr>
+          <w:p>
+            <w:pPr>
+              <w:spacing w:line="276"/>
+            </w:pPr>
+            <w:r>
+              <w:rPr>
+                <w:rFonts w:ascii="Times New Roman" w:cs="Times New Roman" w:eastAsia="Times New Roman" w:hAnsi="Times New Roman"/>
+                <w:sz w:val="22"/>
+                <w:szCs w:val="22"/>
+              </w:rPr>
+              <w:t xml:space="preserve">1 sprint</w:t>
             </w:r>
           </w:p>
         </w:tc>
@@ -7692,7 +7791,7 @@
       <w:tr>
         <w:tc>
           <w:tcPr>
-            <w:tcW w:type="dxa" w:w="3008"/>
+            <w:tcW w:type="dxa" w:w="2256"/>
             <w:tcMar>
               <w:top w:type="dxa" w:w="80"/>
               <w:left w:type="dxa" w:w="100"/>
@@ -7716,7 +7815,7 @@
         </w:tc>
         <w:tc>
           <w:tcPr>
-            <w:tcW w:type="dxa" w:w="3008"/>
+            <w:tcW w:type="dxa" w:w="2256"/>
             <w:tcMar>
               <w:top w:type="dxa" w:w="80"/>
               <w:left w:type="dxa" w:w="100"/>
@@ -7740,7 +7839,7 @@
         </w:tc>
         <w:tc>
           <w:tcPr>
-            <w:tcW w:type="dxa" w:w="3010"/>
+            <w:tcW w:type="dxa" w:w="2256"/>
             <w:tcMar>
               <w:top w:type="dxa" w:w="80"/>
               <w:left w:type="dxa" w:w="100"/>
@@ -7759,6 +7858,30 @@
                 <w:szCs w:val="22"/>
               </w:rPr>
               <w:t xml:space="preserve">Identity &amp; Access, Fleet &amp; Maintenance</w:t>
+            </w:r>
+          </w:p>
+        </w:tc>
+        <w:tc>
+          <w:tcPr>
+            <w:tcW w:type="dxa" w:w="2258"/>
+            <w:tcMar>
+              <w:top w:type="dxa" w:w="80"/>
+              <w:left w:type="dxa" w:w="100"/>
+              <w:bottom w:type="dxa" w:w="80"/>
+              <w:right w:type="dxa" w:w="100"/>
+            </w:tcMar>
+          </w:tcPr>
+          <w:p>
+            <w:pPr>
+              <w:spacing w:line="276"/>
+            </w:pPr>
+            <w:r>
+              <w:rPr>
+                <w:rFonts w:ascii="Times New Roman" w:cs="Times New Roman" w:eastAsia="Times New Roman" w:hAnsi="Times New Roman"/>
+                <w:sz w:val="22"/>
+                <w:szCs w:val="22"/>
+              </w:rPr>
+              <w:t xml:space="preserve">2 sprints</w:t>
             </w:r>
           </w:p>
         </w:tc>
@@ -7766,7 +7889,7 @@
       <w:tr>
         <w:tc>
           <w:tcPr>
-            <w:tcW w:type="dxa" w:w="3008"/>
+            <w:tcW w:type="dxa" w:w="2256"/>
             <w:tcMar>
               <w:top w:type="dxa" w:w="80"/>
               <w:left w:type="dxa" w:w="100"/>
@@ -7790,7 +7913,7 @@
         </w:tc>
         <w:tc>
           <w:tcPr>
-            <w:tcW w:type="dxa" w:w="3008"/>
+            <w:tcW w:type="dxa" w:w="2256"/>
             <w:tcMar>
               <w:top w:type="dxa" w:w="80"/>
               <w:left w:type="dxa" w:w="100"/>
@@ -7814,7 +7937,7 @@
         </w:tc>
         <w:tc>
           <w:tcPr>
-            <w:tcW w:type="dxa" w:w="3010"/>
+            <w:tcW w:type="dxa" w:w="2256"/>
             <w:tcMar>
               <w:top w:type="dxa" w:w="80"/>
               <w:left w:type="dxa" w:w="100"/>
@@ -7833,6 +7956,30 @@
                 <w:szCs w:val="22"/>
               </w:rPr>
               <w:t xml:space="preserve">Booking &amp; Reservation (reserva confirmada)</w:t>
+            </w:r>
+          </w:p>
+        </w:tc>
+        <w:tc>
+          <w:tcPr>
+            <w:tcW w:type="dxa" w:w="2258"/>
+            <w:tcMar>
+              <w:top w:type="dxa" w:w="80"/>
+              <w:left w:type="dxa" w:w="100"/>
+              <w:bottom w:type="dxa" w:w="80"/>
+              <w:right w:type="dxa" w:w="100"/>
+            </w:tcMar>
+          </w:tcPr>
+          <w:p>
+            <w:pPr>
+              <w:spacing w:line="276"/>
+            </w:pPr>
+            <w:r>
+              <w:rPr>
+                <w:rFonts w:ascii="Times New Roman" w:cs="Times New Roman" w:eastAsia="Times New Roman" w:hAnsi="Times New Roman"/>
+                <w:sz w:val="22"/>
+                <w:szCs w:val="22"/>
+              </w:rPr>
+              <w:t xml:space="preserve">1 sprint</w:t>
             </w:r>
           </w:p>
         </w:tc>
@@ -7840,7 +7987,7 @@
       <w:tr>
         <w:tc>
           <w:tcPr>
-            <w:tcW w:type="dxa" w:w="3008"/>
+            <w:tcW w:type="dxa" w:w="2256"/>
             <w:tcMar>
               <w:top w:type="dxa" w:w="80"/>
               <w:left w:type="dxa" w:w="100"/>
@@ -7864,7 +8011,7 @@
         </w:tc>
         <w:tc>
           <w:tcPr>
-            <w:tcW w:type="dxa" w:w="3008"/>
+            <w:tcW w:type="dxa" w:w="2256"/>
             <w:tcMar>
               <w:top w:type="dxa" w:w="80"/>
               <w:left w:type="dxa" w:w="100"/>
@@ -7888,7 +8035,7 @@
         </w:tc>
         <w:tc>
           <w:tcPr>
-            <w:tcW w:type="dxa" w:w="3010"/>
+            <w:tcW w:type="dxa" w:w="2256"/>
             <w:tcMar>
               <w:top w:type="dxa" w:w="80"/>
               <w:left w:type="dxa" w:w="100"/>
@@ -7907,6 +8054,30 @@
                 <w:szCs w:val="22"/>
               </w:rPr>
               <w:t xml:space="preserve">Booking &amp; Reservation</w:t>
+            </w:r>
+          </w:p>
+        </w:tc>
+        <w:tc>
+          <w:tcPr>
+            <w:tcW w:type="dxa" w:w="2258"/>
+            <w:tcMar>
+              <w:top w:type="dxa" w:w="80"/>
+              <w:left w:type="dxa" w:w="100"/>
+              <w:bottom w:type="dxa" w:w="80"/>
+              <w:right w:type="dxa" w:w="100"/>
+            </w:tcMar>
+          </w:tcPr>
+          <w:p>
+            <w:pPr>
+              <w:spacing w:line="276"/>
+            </w:pPr>
+            <w:r>
+              <w:rPr>
+                <w:rFonts w:ascii="Times New Roman" w:cs="Times New Roman" w:eastAsia="Times New Roman" w:hAnsi="Times New Roman"/>
+                <w:sz w:val="22"/>
+                <w:szCs w:val="22"/>
+              </w:rPr>
+              <w:t xml:space="preserve">2 sprints</w:t>
             </w:r>
           </w:p>
         </w:tc>
@@ -7914,7 +8085,7 @@
       <w:tr>
         <w:tc>
           <w:tcPr>
-            <w:tcW w:type="dxa" w:w="3008"/>
+            <w:tcW w:type="dxa" w:w="2256"/>
             <w:tcMar>
               <w:top w:type="dxa" w:w="80"/>
               <w:left w:type="dxa" w:w="100"/>
@@ -7938,7 +8109,7 @@
         </w:tc>
         <w:tc>
           <w:tcPr>
-            <w:tcW w:type="dxa" w:w="3008"/>
+            <w:tcW w:type="dxa" w:w="2256"/>
             <w:tcMar>
               <w:top w:type="dxa" w:w="80"/>
               <w:left w:type="dxa" w:w="100"/>
@@ -7962,7 +8133,7 @@
         </w:tc>
         <w:tc>
           <w:tcPr>
-            <w:tcW w:type="dxa" w:w="3010"/>
+            <w:tcW w:type="dxa" w:w="2256"/>
             <w:tcMar>
               <w:top w:type="dxa" w:w="80"/>
               <w:left w:type="dxa" w:w="100"/>
@@ -7981,6 +8152,132 @@
                 <w:szCs w:val="22"/>
               </w:rPr>
               <w:t xml:space="preserve">Transversal a los eventos de las épicas anteriores</w:t>
+            </w:r>
+          </w:p>
+        </w:tc>
+        <w:tc>
+          <w:tcPr>
+            <w:tcW w:type="dxa" w:w="2258"/>
+            <w:tcMar>
+              <w:top w:type="dxa" w:w="80"/>
+              <w:left w:type="dxa" w:w="100"/>
+              <w:bottom w:type="dxa" w:w="80"/>
+              <w:right w:type="dxa" w:w="100"/>
+            </w:tcMar>
+          </w:tcPr>
+          <w:p>
+            <w:pPr>
+              <w:spacing w:line="276"/>
+            </w:pPr>
+            <w:r>
+              <w:rPr>
+                <w:rFonts w:ascii="Times New Roman" w:cs="Times New Roman" w:eastAsia="Times New Roman" w:hAnsi="Times New Roman"/>
+                <w:sz w:val="22"/>
+                <w:szCs w:val="22"/>
+              </w:rPr>
+              <w:t xml:space="preserve">1 sprint</w:t>
+            </w:r>
+          </w:p>
+        </w:tc>
+      </w:tr>
+      <w:tr>
+        <w:tc>
+          <w:tcPr>
+            <w:tcW w:type="dxa" w:w="2256"/>
+            <w:tcMar>
+              <w:top w:type="dxa" w:w="80"/>
+              <w:left w:type="dxa" w:w="100"/>
+              <w:bottom w:type="dxa" w:w="80"/>
+              <w:right w:type="dxa" w:w="100"/>
+            </w:tcMar>
+          </w:tcPr>
+          <w:p>
+            <w:pPr>
+              <w:spacing w:line="276"/>
+            </w:pPr>
+            <w:r>
+              <w:rPr>
+                <w:rFonts w:ascii="Times New Roman" w:cs="Times New Roman" w:eastAsia="Times New Roman" w:hAnsi="Times New Roman"/>
+                <w:b/>
+                <w:bCs/>
+                <w:sz w:val="22"/>
+                <w:szCs w:val="22"/>
+              </w:rPr>
+              <w:t xml:space="preserve">Total estimado</w:t>
+            </w:r>
+          </w:p>
+        </w:tc>
+        <w:tc>
+          <w:tcPr>
+            <w:tcW w:type="dxa" w:w="2256"/>
+            <w:tcMar>
+              <w:top w:type="dxa" w:w="80"/>
+              <w:left w:type="dxa" w:w="100"/>
+              <w:bottom w:type="dxa" w:w="80"/>
+              <w:right w:type="dxa" w:w="100"/>
+            </w:tcMar>
+          </w:tcPr>
+          <w:p>
+            <w:pPr>
+              <w:spacing w:line="276"/>
+            </w:pPr>
+            <w:r>
+              <w:rPr>
+                <w:rFonts w:ascii="Times New Roman" w:cs="Times New Roman" w:eastAsia="Times New Roman" w:hAnsi="Times New Roman"/>
+                <w:sz w:val="22"/>
+                <w:szCs w:val="22"/>
+              </w:rPr>
+              <w:t xml:space="preserve"/>
+            </w:r>
+          </w:p>
+        </w:tc>
+        <w:tc>
+          <w:tcPr>
+            <w:tcW w:type="dxa" w:w="2256"/>
+            <w:tcMar>
+              <w:top w:type="dxa" w:w="80"/>
+              <w:left w:type="dxa" w:w="100"/>
+              <w:bottom w:type="dxa" w:w="80"/>
+              <w:right w:type="dxa" w:w="100"/>
+            </w:tcMar>
+          </w:tcPr>
+          <w:p>
+            <w:pPr>
+              <w:spacing w:line="276"/>
+            </w:pPr>
+            <w:r>
+              <w:rPr>
+                <w:rFonts w:ascii="Times New Roman" w:cs="Times New Roman" w:eastAsia="Times New Roman" w:hAnsi="Times New Roman"/>
+                <w:sz w:val="22"/>
+                <w:szCs w:val="22"/>
+              </w:rPr>
+              <w:t xml:space="preserve"/>
+            </w:r>
+          </w:p>
+        </w:tc>
+        <w:tc>
+          <w:tcPr>
+            <w:tcW w:type="dxa" w:w="2258"/>
+            <w:tcMar>
+              <w:top w:type="dxa" w:w="80"/>
+              <w:left w:type="dxa" w:w="100"/>
+              <w:bottom w:type="dxa" w:w="80"/>
+              <w:right w:type="dxa" w:w="100"/>
+            </w:tcMar>
+          </w:tcPr>
+          <w:p>
+            <w:pPr>
+              <w:spacing w:line="276"/>
+            </w:pPr>
+            <w:r>
+              <w:rPr>
+                <w:rFonts w:ascii="Times New Roman" w:cs="Times New Roman" w:eastAsia="Times New Roman" w:hAnsi="Times New Roman"/>
+                <w:b/>
+                <w:bCs/>
+                <w:sz w:val="22"/>
+                <w:szCs w:val="22"/>
+              </w:rPr>
+              <w:t xml:space="preserve">11 sprints (≈ 11 semanas)</w:t>
             </w:r>
           </w:p>
         </w:tc>
@@ -8002,7 +8299,7 @@
           <w:sz w:val="24"/>
           <w:szCs w:val="24"/>
         </w:rPr>
-        <w:t xml:space="preserve">Con sprints de una semana y un equipo de 3 personas, cada épica puede distribuirse en uno o más sprints según el número de historias y su estimación en puntos; el calendario exacto por sprint queda sujeto a la Sprint Planning de cada semana, conforme a la metodología descrita en la sección 6.</w:t>
+        <w:t xml:space="preserve">Con sprints de una semana y un equipo de 3 personas, el proyecto completo se estima en alrededor de 11 semanas de ejecución, desde la primera Sprint Planning hasta el cierre de la última épica. La duración por épica es una estimación de planificación, proporcional a su complejidad relativa; el equipo aún no registra datos de velocidad real (RentaMovil, 2026, 00-governance/agile-conventions.md), por lo que no se fijan fechas de calendario concretas — el inicio y cierre de cada sprint quedan sujetos a la Sprint Planning semanal, conforme a la metodología descrita en la sección 6.</w:t>
       </w:r>
     </w:p>
     <w:p>

</xml_diff>

<commit_message>
docs: add recurring costs and total project cost (18 months)
Team salary (3 x 800,000 COP/month), internet+electricity
(150,000 COP/month), over 18 months, combined with the existing
one-time materials budget for a total estimated project cost of
46,400,000 COP.
</commit_message>
<xml_diff>
--- a/03-documentacion-propuesta-tecnica/Documentacion_Propuesta_Tecnica_RentaMovil_APA_Espanol.docx
+++ b/03-documentacion-propuesta-tecnica/Documentacion_Propuesta_Tecnica_RentaMovil_APA_Espanol.docx
@@ -6794,7 +6794,7 @@
           <w:sz w:val="24"/>
           <w:szCs w:val="24"/>
         </w:rPr>
-        <w:t xml:space="preserve">7.4 Presupuesto estimado</w:t>
+        <w:t xml:space="preserve">7.4 Materiales y gastos únicos</w:t>
       </w:r>
     </w:p>
     <w:p>
@@ -7230,7 +7230,7 @@
                 <w:sz w:val="22"/>
                 <w:szCs w:val="22"/>
               </w:rPr>
-              <w:t xml:space="preserve">Total</w:t>
+              <w:t xml:space="preserve">Subtotal gastos únicos</w:t>
             </w:r>
           </w:p>
         </w:tc>
@@ -7293,6 +7293,22 @@
     </w:p>
     <w:p>
       <w:pPr>
+        <w:spacing w:after="160" w:before="200" w:line="480"/>
+        <w:jc w:val="left"/>
+      </w:pPr>
+      <w:r>
+        <w:rPr>
+          <w:rFonts w:ascii="Times New Roman" w:cs="Times New Roman" w:eastAsia="Times New Roman" w:hAnsi="Times New Roman"/>
+          <w:b/>
+          <w:bCs/>
+          <w:sz w:val="24"/>
+          <w:szCs w:val="24"/>
+        </w:rPr>
+        <w:t xml:space="preserve">7.5 Costos recurrentes y costo total estimado del proyecto</w:t>
+      </w:r>
+    </w:p>
+    <w:p>
+      <w:pPr>
         <w:spacing w:after="200" w:line="480"/>
         <w:jc w:val="both"/>
       </w:pPr>
@@ -7302,7 +7318,703 @@
           <w:sz w:val="24"/>
           <w:szCs w:val="24"/>
         </w:rPr>
-        <w:t xml:space="preserve">Esta cifra es un estimado de carácter académico, cubierto por el propio equipo, y no representa un presupuesto de despliegue en producción — ese análisis queda fuera del alcance académico del programa de formación, como ya se indica en la viabilidad económica (sección 5.3).</w:t>
+        <w:t xml:space="preserve">Tomando como duración total del proyecto </w:t>
+      </w:r>
+      <w:r>
+        <w:rPr>
+          <w:rFonts w:ascii="Times New Roman" w:cs="Times New Roman" w:eastAsia="Times New Roman" w:hAnsi="Times New Roman"/>
+          <w:b/>
+          <w:bCs/>
+          <w:sz w:val="24"/>
+          <w:szCs w:val="24"/>
+        </w:rPr>
+        <w:t xml:space="preserve">18 meses</w:t>
+      </w:r>
+      <w:r>
+        <w:rPr>
+          <w:rFonts w:ascii="Times New Roman" w:cs="Times New Roman" w:eastAsia="Times New Roman" w:hAnsi="Times New Roman"/>
+          <w:sz w:val="24"/>
+          <w:szCs w:val="24"/>
+        </w:rPr>
+        <w:t xml:space="preserve"> (el tiempo completo del equipo en el programa de formación, no solo las semanas de ejecución de sprints de la sección 8), se estiman además los siguientes costos recurrentes mensuales: el salario de cada integrante del equipo y los servicios de internet y energía eléctrica usados durante el desarrollo.</w:t>
+      </w:r>
+    </w:p>
+    <w:tbl>
+      <w:tblPr>
+        <w:tblW w:type="dxa" w:w="9026"/>
+        <w:tblBorders>
+          <w:top w:val="single" w:color="000000" w:sz="6"/>
+          <w:left w:val="none" w:color="FFFFFF" w:sz="0"/>
+          <w:bottom w:val="single" w:color="000000" w:sz="6"/>
+          <w:right w:val="none" w:color="FFFFFF" w:sz="0"/>
+          <w:insideH w:val="single" w:color="999999" w:sz="2"/>
+          <w:insideV w:val="none" w:color="FFFFFF" w:sz="0"/>
+        </w:tblBorders>
+      </w:tblPr>
+      <w:tblGrid>
+        <w:gridCol w:w="2256"/>
+        <w:gridCol w:w="2256"/>
+        <w:gridCol w:w="2256"/>
+        <w:gridCol w:w="2258"/>
+      </w:tblGrid>
+      <w:tr>
+        <w:trPr>
+          <w:tblHeader/>
+        </w:trPr>
+        <w:tc>
+          <w:tcPr>
+            <w:tcW w:type="dxa" w:w="2256"/>
+            <w:tcMar>
+              <w:top w:type="dxa" w:w="80"/>
+              <w:left w:type="dxa" w:w="100"/>
+              <w:bottom w:type="dxa" w:w="80"/>
+              <w:right w:type="dxa" w:w="100"/>
+            </w:tcMar>
+          </w:tcPr>
+          <w:p>
+            <w:pPr>
+              <w:spacing w:line="276"/>
+            </w:pPr>
+            <w:r>
+              <w:rPr>
+                <w:rFonts w:ascii="Times New Roman" w:cs="Times New Roman" w:eastAsia="Times New Roman" w:hAnsi="Times New Roman"/>
+                <w:b/>
+                <w:bCs/>
+                <w:sz w:val="22"/>
+                <w:szCs w:val="22"/>
+              </w:rPr>
+              <w:t xml:space="preserve">Concepto</w:t>
+            </w:r>
+          </w:p>
+        </w:tc>
+        <w:tc>
+          <w:tcPr>
+            <w:tcW w:type="dxa" w:w="2256"/>
+            <w:tcMar>
+              <w:top w:type="dxa" w:w="80"/>
+              <w:left w:type="dxa" w:w="100"/>
+              <w:bottom w:type="dxa" w:w="80"/>
+              <w:right w:type="dxa" w:w="100"/>
+            </w:tcMar>
+          </w:tcPr>
+          <w:p>
+            <w:pPr>
+              <w:spacing w:line="276"/>
+            </w:pPr>
+            <w:r>
+              <w:rPr>
+                <w:rFonts w:ascii="Times New Roman" w:cs="Times New Roman" w:eastAsia="Times New Roman" w:hAnsi="Times New Roman"/>
+                <w:b/>
+                <w:bCs/>
+                <w:sz w:val="22"/>
+                <w:szCs w:val="22"/>
+              </w:rPr>
+              <w:t xml:space="preserve">Costo mensual (COP)</w:t>
+            </w:r>
+          </w:p>
+        </w:tc>
+        <w:tc>
+          <w:tcPr>
+            <w:tcW w:type="dxa" w:w="2256"/>
+            <w:tcMar>
+              <w:top w:type="dxa" w:w="80"/>
+              <w:left w:type="dxa" w:w="100"/>
+              <w:bottom w:type="dxa" w:w="80"/>
+              <w:right w:type="dxa" w:w="100"/>
+            </w:tcMar>
+          </w:tcPr>
+          <w:p>
+            <w:pPr>
+              <w:spacing w:line="276"/>
+            </w:pPr>
+            <w:r>
+              <w:rPr>
+                <w:rFonts w:ascii="Times New Roman" w:cs="Times New Roman" w:eastAsia="Times New Roman" w:hAnsi="Times New Roman"/>
+                <w:b/>
+                <w:bCs/>
+                <w:sz w:val="22"/>
+                <w:szCs w:val="22"/>
+              </w:rPr>
+              <w:t xml:space="preserve">Meses</w:t>
+            </w:r>
+          </w:p>
+        </w:tc>
+        <w:tc>
+          <w:tcPr>
+            <w:tcW w:type="dxa" w:w="2258"/>
+            <w:tcMar>
+              <w:top w:type="dxa" w:w="80"/>
+              <w:left w:type="dxa" w:w="100"/>
+              <w:bottom w:type="dxa" w:w="80"/>
+              <w:right w:type="dxa" w:w="100"/>
+            </w:tcMar>
+          </w:tcPr>
+          <w:p>
+            <w:pPr>
+              <w:spacing w:line="276"/>
+            </w:pPr>
+            <w:r>
+              <w:rPr>
+                <w:rFonts w:ascii="Times New Roman" w:cs="Times New Roman" w:eastAsia="Times New Roman" w:hAnsi="Times New Roman"/>
+                <w:b/>
+                <w:bCs/>
+                <w:sz w:val="22"/>
+                <w:szCs w:val="22"/>
+              </w:rPr>
+              <w:t xml:space="preserve">Costo total (COP)</w:t>
+            </w:r>
+          </w:p>
+        </w:tc>
+      </w:tr>
+      <w:tr>
+        <w:tc>
+          <w:tcPr>
+            <w:tcW w:type="dxa" w:w="2256"/>
+            <w:tcMar>
+              <w:top w:type="dxa" w:w="80"/>
+              <w:left w:type="dxa" w:w="100"/>
+              <w:bottom w:type="dxa" w:w="80"/>
+              <w:right w:type="dxa" w:w="100"/>
+            </w:tcMar>
+          </w:tcPr>
+          <w:p>
+            <w:pPr>
+              <w:spacing w:line="276"/>
+            </w:pPr>
+            <w:r>
+              <w:rPr>
+                <w:rFonts w:ascii="Times New Roman" w:cs="Times New Roman" w:eastAsia="Times New Roman" w:hAnsi="Times New Roman"/>
+                <w:sz w:val="22"/>
+                <w:szCs w:val="22"/>
+              </w:rPr>
+              <w:t xml:space="preserve">Salario del equipo (3 integrantes × $800.000)</w:t>
+            </w:r>
+          </w:p>
+        </w:tc>
+        <w:tc>
+          <w:tcPr>
+            <w:tcW w:type="dxa" w:w="2256"/>
+            <w:tcMar>
+              <w:top w:type="dxa" w:w="80"/>
+              <w:left w:type="dxa" w:w="100"/>
+              <w:bottom w:type="dxa" w:w="80"/>
+              <w:right w:type="dxa" w:w="100"/>
+            </w:tcMar>
+          </w:tcPr>
+          <w:p>
+            <w:pPr>
+              <w:spacing w:line="276"/>
+            </w:pPr>
+            <w:r>
+              <w:rPr>
+                <w:rFonts w:ascii="Times New Roman" w:cs="Times New Roman" w:eastAsia="Times New Roman" w:hAnsi="Times New Roman"/>
+                <w:sz w:val="22"/>
+                <w:szCs w:val="22"/>
+              </w:rPr>
+              <w:t xml:space="preserve">$2.400.000</w:t>
+            </w:r>
+          </w:p>
+        </w:tc>
+        <w:tc>
+          <w:tcPr>
+            <w:tcW w:type="dxa" w:w="2256"/>
+            <w:tcMar>
+              <w:top w:type="dxa" w:w="80"/>
+              <w:left w:type="dxa" w:w="100"/>
+              <w:bottom w:type="dxa" w:w="80"/>
+              <w:right w:type="dxa" w:w="100"/>
+            </w:tcMar>
+          </w:tcPr>
+          <w:p>
+            <w:pPr>
+              <w:spacing w:line="276"/>
+            </w:pPr>
+            <w:r>
+              <w:rPr>
+                <w:rFonts w:ascii="Times New Roman" w:cs="Times New Roman" w:eastAsia="Times New Roman" w:hAnsi="Times New Roman"/>
+                <w:sz w:val="22"/>
+                <w:szCs w:val="22"/>
+              </w:rPr>
+              <w:t xml:space="preserve">18</w:t>
+            </w:r>
+          </w:p>
+        </w:tc>
+        <w:tc>
+          <w:tcPr>
+            <w:tcW w:type="dxa" w:w="2258"/>
+            <w:tcMar>
+              <w:top w:type="dxa" w:w="80"/>
+              <w:left w:type="dxa" w:w="100"/>
+              <w:bottom w:type="dxa" w:w="80"/>
+              <w:right w:type="dxa" w:w="100"/>
+            </w:tcMar>
+          </w:tcPr>
+          <w:p>
+            <w:pPr>
+              <w:spacing w:line="276"/>
+            </w:pPr>
+            <w:r>
+              <w:rPr>
+                <w:rFonts w:ascii="Times New Roman" w:cs="Times New Roman" w:eastAsia="Times New Roman" w:hAnsi="Times New Roman"/>
+                <w:sz w:val="22"/>
+                <w:szCs w:val="22"/>
+              </w:rPr>
+              <w:t xml:space="preserve">$43.200.000</w:t>
+            </w:r>
+          </w:p>
+        </w:tc>
+      </w:tr>
+      <w:tr>
+        <w:tc>
+          <w:tcPr>
+            <w:tcW w:type="dxa" w:w="2256"/>
+            <w:tcMar>
+              <w:top w:type="dxa" w:w="80"/>
+              <w:left w:type="dxa" w:w="100"/>
+              <w:bottom w:type="dxa" w:w="80"/>
+              <w:right w:type="dxa" w:w="100"/>
+            </w:tcMar>
+          </w:tcPr>
+          <w:p>
+            <w:pPr>
+              <w:spacing w:line="276"/>
+            </w:pPr>
+            <w:r>
+              <w:rPr>
+                <w:rFonts w:ascii="Times New Roman" w:cs="Times New Roman" w:eastAsia="Times New Roman" w:hAnsi="Times New Roman"/>
+                <w:sz w:val="22"/>
+                <w:szCs w:val="22"/>
+              </w:rPr>
+              <w:t xml:space="preserve">Servicios (internet y energía, equipo completo)</w:t>
+            </w:r>
+          </w:p>
+        </w:tc>
+        <w:tc>
+          <w:tcPr>
+            <w:tcW w:type="dxa" w:w="2256"/>
+            <w:tcMar>
+              <w:top w:type="dxa" w:w="80"/>
+              <w:left w:type="dxa" w:w="100"/>
+              <w:bottom w:type="dxa" w:w="80"/>
+              <w:right w:type="dxa" w:w="100"/>
+            </w:tcMar>
+          </w:tcPr>
+          <w:p>
+            <w:pPr>
+              <w:spacing w:line="276"/>
+            </w:pPr>
+            <w:r>
+              <w:rPr>
+                <w:rFonts w:ascii="Times New Roman" w:cs="Times New Roman" w:eastAsia="Times New Roman" w:hAnsi="Times New Roman"/>
+                <w:sz w:val="22"/>
+                <w:szCs w:val="22"/>
+              </w:rPr>
+              <w:t xml:space="preserve">$150.000</w:t>
+            </w:r>
+          </w:p>
+        </w:tc>
+        <w:tc>
+          <w:tcPr>
+            <w:tcW w:type="dxa" w:w="2256"/>
+            <w:tcMar>
+              <w:top w:type="dxa" w:w="80"/>
+              <w:left w:type="dxa" w:w="100"/>
+              <w:bottom w:type="dxa" w:w="80"/>
+              <w:right w:type="dxa" w:w="100"/>
+            </w:tcMar>
+          </w:tcPr>
+          <w:p>
+            <w:pPr>
+              <w:spacing w:line="276"/>
+            </w:pPr>
+            <w:r>
+              <w:rPr>
+                <w:rFonts w:ascii="Times New Roman" w:cs="Times New Roman" w:eastAsia="Times New Roman" w:hAnsi="Times New Roman"/>
+                <w:sz w:val="22"/>
+                <w:szCs w:val="22"/>
+              </w:rPr>
+              <w:t xml:space="preserve">18</w:t>
+            </w:r>
+          </w:p>
+        </w:tc>
+        <w:tc>
+          <w:tcPr>
+            <w:tcW w:type="dxa" w:w="2258"/>
+            <w:tcMar>
+              <w:top w:type="dxa" w:w="80"/>
+              <w:left w:type="dxa" w:w="100"/>
+              <w:bottom w:type="dxa" w:w="80"/>
+              <w:right w:type="dxa" w:w="100"/>
+            </w:tcMar>
+          </w:tcPr>
+          <w:p>
+            <w:pPr>
+              <w:spacing w:line="276"/>
+            </w:pPr>
+            <w:r>
+              <w:rPr>
+                <w:rFonts w:ascii="Times New Roman" w:cs="Times New Roman" w:eastAsia="Times New Roman" w:hAnsi="Times New Roman"/>
+                <w:sz w:val="22"/>
+                <w:szCs w:val="22"/>
+              </w:rPr>
+              <w:t xml:space="preserve">$2.700.000</w:t>
+            </w:r>
+          </w:p>
+        </w:tc>
+      </w:tr>
+      <w:tr>
+        <w:tc>
+          <w:tcPr>
+            <w:tcW w:type="dxa" w:w="2256"/>
+            <w:tcMar>
+              <w:top w:type="dxa" w:w="80"/>
+              <w:left w:type="dxa" w:w="100"/>
+              <w:bottom w:type="dxa" w:w="80"/>
+              <w:right w:type="dxa" w:w="100"/>
+            </w:tcMar>
+          </w:tcPr>
+          <w:p>
+            <w:pPr>
+              <w:spacing w:line="276"/>
+            </w:pPr>
+            <w:r>
+              <w:rPr>
+                <w:rFonts w:ascii="Times New Roman" w:cs="Times New Roman" w:eastAsia="Times New Roman" w:hAnsi="Times New Roman"/>
+                <w:b/>
+                <w:bCs/>
+                <w:sz w:val="22"/>
+                <w:szCs w:val="22"/>
+              </w:rPr>
+              <w:t xml:space="preserve">Subtotal costos recurrentes</w:t>
+            </w:r>
+          </w:p>
+        </w:tc>
+        <w:tc>
+          <w:tcPr>
+            <w:tcW w:type="dxa" w:w="2256"/>
+            <w:tcMar>
+              <w:top w:type="dxa" w:w="80"/>
+              <w:left w:type="dxa" w:w="100"/>
+              <w:bottom w:type="dxa" w:w="80"/>
+              <w:right w:type="dxa" w:w="100"/>
+            </w:tcMar>
+          </w:tcPr>
+          <w:p>
+            <w:pPr>
+              <w:spacing w:line="276"/>
+            </w:pPr>
+            <w:r>
+              <w:rPr>
+                <w:rFonts w:ascii="Times New Roman" w:cs="Times New Roman" w:eastAsia="Times New Roman" w:hAnsi="Times New Roman"/>
+                <w:sz w:val="22"/>
+                <w:szCs w:val="22"/>
+              </w:rPr>
+              <w:t xml:space="preserve"/>
+            </w:r>
+          </w:p>
+        </w:tc>
+        <w:tc>
+          <w:tcPr>
+            <w:tcW w:type="dxa" w:w="2256"/>
+            <w:tcMar>
+              <w:top w:type="dxa" w:w="80"/>
+              <w:left w:type="dxa" w:w="100"/>
+              <w:bottom w:type="dxa" w:w="80"/>
+              <w:right w:type="dxa" w:w="100"/>
+            </w:tcMar>
+          </w:tcPr>
+          <w:p>
+            <w:pPr>
+              <w:spacing w:line="276"/>
+            </w:pPr>
+            <w:r>
+              <w:rPr>
+                <w:rFonts w:ascii="Times New Roman" w:cs="Times New Roman" w:eastAsia="Times New Roman" w:hAnsi="Times New Roman"/>
+                <w:sz w:val="22"/>
+                <w:szCs w:val="22"/>
+              </w:rPr>
+              <w:t xml:space="preserve"/>
+            </w:r>
+          </w:p>
+        </w:tc>
+        <w:tc>
+          <w:tcPr>
+            <w:tcW w:type="dxa" w:w="2258"/>
+            <w:tcMar>
+              <w:top w:type="dxa" w:w="80"/>
+              <w:left w:type="dxa" w:w="100"/>
+              <w:bottom w:type="dxa" w:w="80"/>
+              <w:right w:type="dxa" w:w="100"/>
+            </w:tcMar>
+          </w:tcPr>
+          <w:p>
+            <w:pPr>
+              <w:spacing w:line="276"/>
+            </w:pPr>
+            <w:r>
+              <w:rPr>
+                <w:rFonts w:ascii="Times New Roman" w:cs="Times New Roman" w:eastAsia="Times New Roman" w:hAnsi="Times New Roman"/>
+                <w:b/>
+                <w:bCs/>
+                <w:sz w:val="22"/>
+                <w:szCs w:val="22"/>
+              </w:rPr>
+              <w:t xml:space="preserve">$45.900.000</w:t>
+            </w:r>
+          </w:p>
+        </w:tc>
+      </w:tr>
+    </w:tbl>
+    <w:p>
+      <w:pPr>
+        <w:spacing w:after="160"/>
+      </w:pPr>
+    </w:p>
+    <w:tbl>
+      <w:tblPr>
+        <w:tblW w:type="dxa" w:w="9026"/>
+        <w:tblBorders>
+          <w:top w:val="single" w:color="000000" w:sz="6"/>
+          <w:left w:val="none" w:color="FFFFFF" w:sz="0"/>
+          <w:bottom w:val="single" w:color="000000" w:sz="6"/>
+          <w:right w:val="none" w:color="FFFFFF" w:sz="0"/>
+          <w:insideH w:val="single" w:color="999999" w:sz="2"/>
+          <w:insideV w:val="none" w:color="FFFFFF" w:sz="0"/>
+        </w:tblBorders>
+      </w:tblPr>
+      <w:tblGrid>
+        <w:gridCol w:w="4513"/>
+        <w:gridCol w:w="4513"/>
+      </w:tblGrid>
+      <w:tr>
+        <w:trPr>
+          <w:tblHeader/>
+        </w:trPr>
+        <w:tc>
+          <w:tcPr>
+            <w:tcW w:type="dxa" w:w="4513"/>
+            <w:tcMar>
+              <w:top w:type="dxa" w:w="80"/>
+              <w:left w:type="dxa" w:w="100"/>
+              <w:bottom w:type="dxa" w:w="80"/>
+              <w:right w:type="dxa" w:w="100"/>
+            </w:tcMar>
+          </w:tcPr>
+          <w:p>
+            <w:pPr>
+              <w:spacing w:line="276"/>
+            </w:pPr>
+            <w:r>
+              <w:rPr>
+                <w:rFonts w:ascii="Times New Roman" w:cs="Times New Roman" w:eastAsia="Times New Roman" w:hAnsi="Times New Roman"/>
+                <w:b/>
+                <w:bCs/>
+                <w:sz w:val="22"/>
+                <w:szCs w:val="22"/>
+              </w:rPr>
+              <w:t xml:space="preserve">Resumen</w:t>
+            </w:r>
+          </w:p>
+        </w:tc>
+        <w:tc>
+          <w:tcPr>
+            <w:tcW w:type="dxa" w:w="4513"/>
+            <w:tcMar>
+              <w:top w:type="dxa" w:w="80"/>
+              <w:left w:type="dxa" w:w="100"/>
+              <w:bottom w:type="dxa" w:w="80"/>
+              <w:right w:type="dxa" w:w="100"/>
+            </w:tcMar>
+          </w:tcPr>
+          <w:p>
+            <w:pPr>
+              <w:spacing w:line="276"/>
+            </w:pPr>
+            <w:r>
+              <w:rPr>
+                <w:rFonts w:ascii="Times New Roman" w:cs="Times New Roman" w:eastAsia="Times New Roman" w:hAnsi="Times New Roman"/>
+                <w:b/>
+                <w:bCs/>
+                <w:sz w:val="22"/>
+                <w:szCs w:val="22"/>
+              </w:rPr>
+              <w:t xml:space="preserve">Costo (COP)</w:t>
+            </w:r>
+          </w:p>
+        </w:tc>
+      </w:tr>
+      <w:tr>
+        <w:tc>
+          <w:tcPr>
+            <w:tcW w:type="dxa" w:w="4513"/>
+            <w:tcMar>
+              <w:top w:type="dxa" w:w="80"/>
+              <w:left w:type="dxa" w:w="100"/>
+              <w:bottom w:type="dxa" w:w="80"/>
+              <w:right w:type="dxa" w:w="100"/>
+            </w:tcMar>
+          </w:tcPr>
+          <w:p>
+            <w:pPr>
+              <w:spacing w:line="276"/>
+            </w:pPr>
+            <w:r>
+              <w:rPr>
+                <w:rFonts w:ascii="Times New Roman" w:cs="Times New Roman" w:eastAsia="Times New Roman" w:hAnsi="Times New Roman"/>
+                <w:sz w:val="22"/>
+                <w:szCs w:val="22"/>
+              </w:rPr>
+              <w:t xml:space="preserve">Gastos únicos (sección 7.4)</w:t>
+            </w:r>
+          </w:p>
+        </w:tc>
+        <w:tc>
+          <w:tcPr>
+            <w:tcW w:type="dxa" w:w="4513"/>
+            <w:tcMar>
+              <w:top w:type="dxa" w:w="80"/>
+              <w:left w:type="dxa" w:w="100"/>
+              <w:bottom w:type="dxa" w:w="80"/>
+              <w:right w:type="dxa" w:w="100"/>
+            </w:tcMar>
+          </w:tcPr>
+          <w:p>
+            <w:pPr>
+              <w:spacing w:line="276"/>
+            </w:pPr>
+            <w:r>
+              <w:rPr>
+                <w:rFonts w:ascii="Times New Roman" w:cs="Times New Roman" w:eastAsia="Times New Roman" w:hAnsi="Times New Roman"/>
+                <w:sz w:val="22"/>
+                <w:szCs w:val="22"/>
+              </w:rPr>
+              <w:t xml:space="preserve">$500.000</w:t>
+            </w:r>
+          </w:p>
+        </w:tc>
+      </w:tr>
+      <w:tr>
+        <w:tc>
+          <w:tcPr>
+            <w:tcW w:type="dxa" w:w="4513"/>
+            <w:tcMar>
+              <w:top w:type="dxa" w:w="80"/>
+              <w:left w:type="dxa" w:w="100"/>
+              <w:bottom w:type="dxa" w:w="80"/>
+              <w:right w:type="dxa" w:w="100"/>
+            </w:tcMar>
+          </w:tcPr>
+          <w:p>
+            <w:pPr>
+              <w:spacing w:line="276"/>
+            </w:pPr>
+            <w:r>
+              <w:rPr>
+                <w:rFonts w:ascii="Times New Roman" w:cs="Times New Roman" w:eastAsia="Times New Roman" w:hAnsi="Times New Roman"/>
+                <w:sz w:val="22"/>
+                <w:szCs w:val="22"/>
+              </w:rPr>
+              <w:t xml:space="preserve">Costos recurrentes (18 meses)</w:t>
+            </w:r>
+          </w:p>
+        </w:tc>
+        <w:tc>
+          <w:tcPr>
+            <w:tcW w:type="dxa" w:w="4513"/>
+            <w:tcMar>
+              <w:top w:type="dxa" w:w="80"/>
+              <w:left w:type="dxa" w:w="100"/>
+              <w:bottom w:type="dxa" w:w="80"/>
+              <w:right w:type="dxa" w:w="100"/>
+            </w:tcMar>
+          </w:tcPr>
+          <w:p>
+            <w:pPr>
+              <w:spacing w:line="276"/>
+            </w:pPr>
+            <w:r>
+              <w:rPr>
+                <w:rFonts w:ascii="Times New Roman" w:cs="Times New Roman" w:eastAsia="Times New Roman" w:hAnsi="Times New Roman"/>
+                <w:sz w:val="22"/>
+                <w:szCs w:val="22"/>
+              </w:rPr>
+              <w:t xml:space="preserve">$45.900.000</w:t>
+            </w:r>
+          </w:p>
+        </w:tc>
+      </w:tr>
+      <w:tr>
+        <w:tc>
+          <w:tcPr>
+            <w:tcW w:type="dxa" w:w="4513"/>
+            <w:tcMar>
+              <w:top w:type="dxa" w:w="80"/>
+              <w:left w:type="dxa" w:w="100"/>
+              <w:bottom w:type="dxa" w:w="80"/>
+              <w:right w:type="dxa" w:w="100"/>
+            </w:tcMar>
+          </w:tcPr>
+          <w:p>
+            <w:pPr>
+              <w:spacing w:line="276"/>
+            </w:pPr>
+            <w:r>
+              <w:rPr>
+                <w:rFonts w:ascii="Times New Roman" w:cs="Times New Roman" w:eastAsia="Times New Roman" w:hAnsi="Times New Roman"/>
+                <w:b/>
+                <w:bCs/>
+                <w:sz w:val="22"/>
+                <w:szCs w:val="22"/>
+              </w:rPr>
+              <w:t xml:space="preserve">Costo total estimado del proyecto</w:t>
+            </w:r>
+          </w:p>
+        </w:tc>
+        <w:tc>
+          <w:tcPr>
+            <w:tcW w:type="dxa" w:w="4513"/>
+            <w:tcMar>
+              <w:top w:type="dxa" w:w="80"/>
+              <w:left w:type="dxa" w:w="100"/>
+              <w:bottom w:type="dxa" w:w="80"/>
+              <w:right w:type="dxa" w:w="100"/>
+            </w:tcMar>
+          </w:tcPr>
+          <w:p>
+            <w:pPr>
+              <w:spacing w:line="276"/>
+            </w:pPr>
+            <w:r>
+              <w:rPr>
+                <w:rFonts w:ascii="Times New Roman" w:cs="Times New Roman" w:eastAsia="Times New Roman" w:hAnsi="Times New Roman"/>
+                <w:b/>
+                <w:bCs/>
+                <w:sz w:val="22"/>
+                <w:szCs w:val="22"/>
+              </w:rPr>
+              <w:t xml:space="preserve">$46.400.000</w:t>
+            </w:r>
+          </w:p>
+        </w:tc>
+      </w:tr>
+    </w:tbl>
+    <w:p>
+      <w:pPr>
+        <w:spacing w:after="160"/>
+      </w:pPr>
+    </w:p>
+    <w:p>
+      <w:pPr>
+        <w:spacing w:after="200" w:line="480"/>
+        <w:jc w:val="both"/>
+      </w:pPr>
+      <w:r>
+        <w:rPr>
+          <w:rFonts w:ascii="Times New Roman" w:cs="Times New Roman" w:eastAsia="Times New Roman" w:hAnsi="Times New Roman"/>
+          <w:sz w:val="24"/>
+          <w:szCs w:val="24"/>
+        </w:rPr>
+        <w:t xml:space="preserve">Estas cifras son un estimado de carácter académico, con fines ilustrativos del costo real que representaría el tiempo del equipo durante el programa de formación; no corresponden a un presupuesto de despliegue en producción, que queda fuera del alcance académico del programa, como ya se indica en la viabilidad económica (sección 5.3).</w:t>
       </w:r>
     </w:p>
     <w:p>

</xml_diff>